<commit_message>
Update report with Peninsular focus section and guidance assessment
Adds section 4: Penang/Johor corridor tables with headroom-to-par and
KKmart fair-share gap, adjacent Kedah/Perlis opportunity, and how to
read management execution against the guidance.

Co-Authored-By: Claude Fable 5 <noreply@anthropic.com>
Claude-Session: https://claude.ai/code/session_01UBEYtRwKf6f3vxGesJBzvb
</commit_message>
<xml_diff>
--- a/output/KKmart_Whitespace_Report.docx
+++ b/output/KKmart_Whitespace_Report.docx
@@ -41,6 +41,11 @@
     <w:p>
       <w:r>
         <w:t>This analysis maps all 1,054 KKmart stores against 6,613 competitor outlets (7-Eleven, 99 Speedmart, FamilyMart, myNEWS) and official demographic data from the Department of Statistics Malaysia (DOSM) across all 160 administrative districts. KKmart holds a 14% share of the combined convenience-store network and is present in only 51 of 160 districts, covering 65% of the national population. The national benchmark is 22.5 convenience stores per 100,000 people. Twenty districts are saturated (&gt;1.2x the national rate) — including KKmart's core markets of Kuala Lumpur, Petaling and Johor Bahru — while 76 districts remain structurally underserved (&lt;0.5x). The clearest expansion opportunities fall into two groups: open whitespace in East Malaysia (Tawau, Semporna, Lahad Datu) and competitor-validated markets where KKmart is absent (Kota Kinabalu, Alor Setar, Kuala Terengganu).</w:t>
+      </w:r>
+    </w:p>
+    <w:p>
+      <w:r>
+        <w:t>Management has guided expansion toward Northern and Southern Peninsular Malaysia, with Pulau Pinang and Johor as focus states. Benchmarked against the Peninsular average of 25.9 stores per 100k, this guidance is directionally sound: the two states hold roughly 230 stores of at-par headroom — enough to grow the KKmart network by about 20% without entering saturated territory. The critical execution question is mix: the headroom sits in Georgetown (Timur Laut), mainland Seberang Perai, and Johor's secondary districts — not in Johor Bahru, which is already 90 stores over par.</w:t>
       </w:r>
     </w:p>
     <w:p>
@@ -2708,7 +2713,1716 @@
         <w:rPr>
           <w:color w:val="1F3A5F"/>
         </w:rPr>
-        <w:t>4. Relevance for Investment Analysis</w:t>
+        <w:t>4. Focus: Northern &amp; Southern Peninsular Corridors</w:t>
+      </w:r>
+    </w:p>
+    <w:p>
+      <w:r>
+        <w:t>Management guidance points to expansion in Northern and Southern Peninsular Malaysia, with Pulau Pinang and Johor as the focus states. This section benchmarks both states against the Peninsular average of 25.9 stores per 100k population (the appropriate yardstick for Peninsular expansion; the national rate of 22.5 is diluted by East Malaysia). Two metrics are used: headroom to par — the number of stores a district can absorb before reaching average Peninsular density (negative = overshoot) — and the KKmart fair-share gap — stores KKmart would need to hold its 14.6% Peninsular network share of the district's current store base.</w:t>
+      </w:r>
+    </w:p>
+    <w:p>
+      <w:pPr>
+        <w:pStyle w:val="Heading2"/>
+      </w:pPr>
+      <w:r>
+        <w:rPr>
+          <w:color w:val="1F3A5F"/>
+        </w:rPr>
+        <w:t>4.1 Pulau Pinang — guidance supported</w:t>
+      </w:r>
+    </w:p>
+    <w:tbl>
+      <w:tblPr>
+        <w:tblStyle w:val="LightGrid-Accent1"/>
+        <w:tblW w:type="auto" w:w="0"/>
+        <w:tblLook w:firstColumn="1" w:firstRow="1" w:lastColumn="0" w:lastRow="0" w:noHBand="0" w:noVBand="1" w:val="04A0"/>
+      </w:tblPr>
+      <w:tblGrid>
+        <w:gridCol w:w="1337"/>
+        <w:gridCol w:w="1337"/>
+        <w:gridCol w:w="1337"/>
+        <w:gridCol w:w="1337"/>
+        <w:gridCol w:w="1337"/>
+        <w:gridCol w:w="1337"/>
+        <w:gridCol w:w="1337"/>
+      </w:tblGrid>
+      <w:tr>
+        <w:tc>
+          <w:tcPr>
+            <w:tcW w:type="dxa" w:w="1337"/>
+          </w:tcPr>
+          <w:p>
+            <w:r>
+              <w:rPr>
+                <w:b/>
+                <w:sz w:val="18"/>
+              </w:rPr>
+              <w:t>District</w:t>
+            </w:r>
+          </w:p>
+        </w:tc>
+        <w:tc>
+          <w:tcPr>
+            <w:tcW w:type="dxa" w:w="1337"/>
+          </w:tcPr>
+          <w:p>
+            <w:r>
+              <w:rPr>
+                <w:b/>
+                <w:sz w:val="18"/>
+              </w:rPr>
+              <w:t>Population</w:t>
+            </w:r>
+          </w:p>
+        </w:tc>
+        <w:tc>
+          <w:tcPr>
+            <w:tcW w:type="dxa" w:w="1337"/>
+          </w:tcPr>
+          <w:p>
+            <w:r>
+              <w:rPr>
+                <w:b/>
+                <w:sz w:val="18"/>
+              </w:rPr>
+              <w:t>KKmart</w:t>
+            </w:r>
+          </w:p>
+        </w:tc>
+        <w:tc>
+          <w:tcPr>
+            <w:tcW w:type="dxa" w:w="1337"/>
+          </w:tcPr>
+          <w:p>
+            <w:r>
+              <w:rPr>
+                <w:b/>
+                <w:sz w:val="18"/>
+              </w:rPr>
+              <w:t>Competitors</w:t>
+            </w:r>
+          </w:p>
+        </w:tc>
+        <w:tc>
+          <w:tcPr>
+            <w:tcW w:type="dxa" w:w="1337"/>
+          </w:tcPr>
+          <w:p>
+            <w:r>
+              <w:rPr>
+                <w:b/>
+                <w:sz w:val="18"/>
+              </w:rPr>
+              <w:t>vs Peninsular avg</w:t>
+            </w:r>
+          </w:p>
+        </w:tc>
+        <w:tc>
+          <w:tcPr>
+            <w:tcW w:type="dxa" w:w="1337"/>
+          </w:tcPr>
+          <w:p>
+            <w:r>
+              <w:rPr>
+                <w:b/>
+                <w:sz w:val="18"/>
+              </w:rPr>
+              <w:t>Headroom</w:t>
+            </w:r>
+          </w:p>
+        </w:tc>
+        <w:tc>
+          <w:tcPr>
+            <w:tcW w:type="dxa" w:w="1337"/>
+          </w:tcPr>
+          <w:p>
+            <w:r>
+              <w:rPr>
+                <w:b/>
+                <w:sz w:val="18"/>
+              </w:rPr>
+              <w:t>KK fair-share gap</w:t>
+            </w:r>
+          </w:p>
+        </w:tc>
+      </w:tr>
+      <w:tr>
+        <w:tc>
+          <w:tcPr>
+            <w:tcW w:type="dxa" w:w="1337"/>
+          </w:tcPr>
+          <w:p>
+            <w:r>
+              <w:rPr>
+                <w:sz w:val="18"/>
+              </w:rPr>
+              <w:t>Timur Laut</w:t>
+            </w:r>
+          </w:p>
+        </w:tc>
+        <w:tc>
+          <w:tcPr>
+            <w:tcW w:type="dxa" w:w="1337"/>
+          </w:tcPr>
+          <w:p>
+            <w:r>
+              <w:rPr>
+                <w:sz w:val="18"/>
+              </w:rPr>
+              <w:t>570k</w:t>
+            </w:r>
+          </w:p>
+        </w:tc>
+        <w:tc>
+          <w:tcPr>
+            <w:tcW w:type="dxa" w:w="1337"/>
+          </w:tcPr>
+          <w:p>
+            <w:r>
+              <w:rPr>
+                <w:sz w:val="18"/>
+              </w:rPr>
+              <w:t>11</w:t>
+            </w:r>
+          </w:p>
+        </w:tc>
+        <w:tc>
+          <w:tcPr>
+            <w:tcW w:type="dxa" w:w="1337"/>
+          </w:tcPr>
+          <w:p>
+            <w:r>
+              <w:rPr>
+                <w:sz w:val="18"/>
+              </w:rPr>
+              <w:t>80</w:t>
+            </w:r>
+          </w:p>
+        </w:tc>
+        <w:tc>
+          <w:tcPr>
+            <w:tcW w:type="dxa" w:w="1337"/>
+          </w:tcPr>
+          <w:p>
+            <w:r>
+              <w:rPr>
+                <w:sz w:val="18"/>
+              </w:rPr>
+              <w:t>0.62x</w:t>
+            </w:r>
+          </w:p>
+        </w:tc>
+        <w:tc>
+          <w:tcPr>
+            <w:tcW w:type="dxa" w:w="1337"/>
+          </w:tcPr>
+          <w:p>
+            <w:r>
+              <w:rPr>
+                <w:sz w:val="18"/>
+              </w:rPr>
+              <w:t>57</w:t>
+            </w:r>
+          </w:p>
+        </w:tc>
+        <w:tc>
+          <w:tcPr>
+            <w:tcW w:type="dxa" w:w="1337"/>
+          </w:tcPr>
+          <w:p>
+            <w:r>
+              <w:rPr>
+                <w:sz w:val="18"/>
+              </w:rPr>
+              <w:t>2</w:t>
+            </w:r>
+          </w:p>
+        </w:tc>
+      </w:tr>
+      <w:tr>
+        <w:tc>
+          <w:tcPr>
+            <w:tcW w:type="dxa" w:w="1337"/>
+          </w:tcPr>
+          <w:p>
+            <w:r>
+              <w:rPr>
+                <w:sz w:val="18"/>
+              </w:rPr>
+              <w:t>Seberang Perai Tengah</w:t>
+            </w:r>
+          </w:p>
+        </w:tc>
+        <w:tc>
+          <w:tcPr>
+            <w:tcW w:type="dxa" w:w="1337"/>
+          </w:tcPr>
+          <w:p>
+            <w:r>
+              <w:rPr>
+                <w:sz w:val="18"/>
+              </w:rPr>
+              <w:t>443k</w:t>
+            </w:r>
+          </w:p>
+        </w:tc>
+        <w:tc>
+          <w:tcPr>
+            <w:tcW w:type="dxa" w:w="1337"/>
+          </w:tcPr>
+          <w:p>
+            <w:r>
+              <w:rPr>
+                <w:sz w:val="18"/>
+              </w:rPr>
+              <w:t>7</w:t>
+            </w:r>
+          </w:p>
+        </w:tc>
+        <w:tc>
+          <w:tcPr>
+            <w:tcW w:type="dxa" w:w="1337"/>
+          </w:tcPr>
+          <w:p>
+            <w:r>
+              <w:rPr>
+                <w:sz w:val="18"/>
+              </w:rPr>
+              <w:t>88</w:t>
+            </w:r>
+          </w:p>
+        </w:tc>
+        <w:tc>
+          <w:tcPr>
+            <w:tcW w:type="dxa" w:w="1337"/>
+          </w:tcPr>
+          <w:p>
+            <w:r>
+              <w:rPr>
+                <w:sz w:val="18"/>
+              </w:rPr>
+              <w:t>0.83x</w:t>
+            </w:r>
+          </w:p>
+        </w:tc>
+        <w:tc>
+          <w:tcPr>
+            <w:tcW w:type="dxa" w:w="1337"/>
+          </w:tcPr>
+          <w:p>
+            <w:r>
+              <w:rPr>
+                <w:sz w:val="18"/>
+              </w:rPr>
+              <w:t>20</w:t>
+            </w:r>
+          </w:p>
+        </w:tc>
+        <w:tc>
+          <w:tcPr>
+            <w:tcW w:type="dxa" w:w="1337"/>
+          </w:tcPr>
+          <w:p>
+            <w:r>
+              <w:rPr>
+                <w:sz w:val="18"/>
+              </w:rPr>
+              <w:t>7</w:t>
+            </w:r>
+          </w:p>
+        </w:tc>
+      </w:tr>
+      <w:tr>
+        <w:tc>
+          <w:tcPr>
+            <w:tcW w:type="dxa" w:w="1337"/>
+          </w:tcPr>
+          <w:p>
+            <w:r>
+              <w:rPr>
+                <w:sz w:val="18"/>
+              </w:rPr>
+              <w:t>Barat Daya</w:t>
+            </w:r>
+          </w:p>
+        </w:tc>
+        <w:tc>
+          <w:tcPr>
+            <w:tcW w:type="dxa" w:w="1337"/>
+          </w:tcPr>
+          <w:p>
+            <w:r>
+              <w:rPr>
+                <w:sz w:val="18"/>
+              </w:rPr>
+              <w:t>248k</w:t>
+            </w:r>
+          </w:p>
+        </w:tc>
+        <w:tc>
+          <w:tcPr>
+            <w:tcW w:type="dxa" w:w="1337"/>
+          </w:tcPr>
+          <w:p>
+            <w:r>
+              <w:rPr>
+                <w:sz w:val="18"/>
+              </w:rPr>
+              <w:t>4</w:t>
+            </w:r>
+          </w:p>
+        </w:tc>
+        <w:tc>
+          <w:tcPr>
+            <w:tcW w:type="dxa" w:w="1337"/>
+          </w:tcPr>
+          <w:p>
+            <w:r>
+              <w:rPr>
+                <w:sz w:val="18"/>
+              </w:rPr>
+              <w:t>46</w:t>
+            </w:r>
+          </w:p>
+        </w:tc>
+        <w:tc>
+          <w:tcPr>
+            <w:tcW w:type="dxa" w:w="1337"/>
+          </w:tcPr>
+          <w:p>
+            <w:r>
+              <w:rPr>
+                <w:sz w:val="18"/>
+              </w:rPr>
+              <w:t>0.78x</w:t>
+            </w:r>
+          </w:p>
+        </w:tc>
+        <w:tc>
+          <w:tcPr>
+            <w:tcW w:type="dxa" w:w="1337"/>
+          </w:tcPr>
+          <w:p>
+            <w:r>
+              <w:rPr>
+                <w:sz w:val="18"/>
+              </w:rPr>
+              <w:t>14</w:t>
+            </w:r>
+          </w:p>
+        </w:tc>
+        <w:tc>
+          <w:tcPr>
+            <w:tcW w:type="dxa" w:w="1337"/>
+          </w:tcPr>
+          <w:p>
+            <w:r>
+              <w:rPr>
+                <w:sz w:val="18"/>
+              </w:rPr>
+              <w:t>3</w:t>
+            </w:r>
+          </w:p>
+        </w:tc>
+      </w:tr>
+      <w:tr>
+        <w:tc>
+          <w:tcPr>
+            <w:tcW w:type="dxa" w:w="1337"/>
+          </w:tcPr>
+          <w:p>
+            <w:r>
+              <w:rPr>
+                <w:sz w:val="18"/>
+              </w:rPr>
+              <w:t>Seberang Perai Utara</w:t>
+            </w:r>
+          </w:p>
+        </w:tc>
+        <w:tc>
+          <w:tcPr>
+            <w:tcW w:type="dxa" w:w="1337"/>
+          </w:tcPr>
+          <w:p>
+            <w:r>
+              <w:rPr>
+                <w:sz w:val="18"/>
+              </w:rPr>
+              <w:t>351k</w:t>
+            </w:r>
+          </w:p>
+        </w:tc>
+        <w:tc>
+          <w:tcPr>
+            <w:tcW w:type="dxa" w:w="1337"/>
+          </w:tcPr>
+          <w:p>
+            <w:r>
+              <w:rPr>
+                <w:sz w:val="18"/>
+              </w:rPr>
+              <w:t>1</w:t>
+            </w:r>
+          </w:p>
+        </w:tc>
+        <w:tc>
+          <w:tcPr>
+            <w:tcW w:type="dxa" w:w="1337"/>
+          </w:tcPr>
+          <w:p>
+            <w:r>
+              <w:rPr>
+                <w:sz w:val="18"/>
+              </w:rPr>
+              <w:t>68</w:t>
+            </w:r>
+          </w:p>
+        </w:tc>
+        <w:tc>
+          <w:tcPr>
+            <w:tcW w:type="dxa" w:w="1337"/>
+          </w:tcPr>
+          <w:p>
+            <w:r>
+              <w:rPr>
+                <w:sz w:val="18"/>
+              </w:rPr>
+              <w:t>0.76x</w:t>
+            </w:r>
+          </w:p>
+        </w:tc>
+        <w:tc>
+          <w:tcPr>
+            <w:tcW w:type="dxa" w:w="1337"/>
+          </w:tcPr>
+          <w:p>
+            <w:r>
+              <w:rPr>
+                <w:sz w:val="18"/>
+              </w:rPr>
+              <w:t>22</w:t>
+            </w:r>
+          </w:p>
+        </w:tc>
+        <w:tc>
+          <w:tcPr>
+            <w:tcW w:type="dxa" w:w="1337"/>
+          </w:tcPr>
+          <w:p>
+            <w:r>
+              <w:rPr>
+                <w:sz w:val="18"/>
+              </w:rPr>
+              <w:t>9</w:t>
+            </w:r>
+          </w:p>
+        </w:tc>
+      </w:tr>
+      <w:tr>
+        <w:tc>
+          <w:tcPr>
+            <w:tcW w:type="dxa" w:w="1337"/>
+          </w:tcPr>
+          <w:p>
+            <w:r>
+              <w:rPr>
+                <w:sz w:val="18"/>
+              </w:rPr>
+              <w:t>Seberang Perai Selatan</w:t>
+            </w:r>
+          </w:p>
+        </w:tc>
+        <w:tc>
+          <w:tcPr>
+            <w:tcW w:type="dxa" w:w="1337"/>
+          </w:tcPr>
+          <w:p>
+            <w:r>
+              <w:rPr>
+                <w:sz w:val="18"/>
+              </w:rPr>
+              <w:t>188k</w:t>
+            </w:r>
+          </w:p>
+        </w:tc>
+        <w:tc>
+          <w:tcPr>
+            <w:tcW w:type="dxa" w:w="1337"/>
+          </w:tcPr>
+          <w:p>
+            <w:r>
+              <w:rPr>
+                <w:sz w:val="18"/>
+              </w:rPr>
+              <w:t>1</w:t>
+            </w:r>
+          </w:p>
+        </w:tc>
+        <w:tc>
+          <w:tcPr>
+            <w:tcW w:type="dxa" w:w="1337"/>
+          </w:tcPr>
+          <w:p>
+            <w:r>
+              <w:rPr>
+                <w:sz w:val="18"/>
+              </w:rPr>
+              <w:t>59</w:t>
+            </w:r>
+          </w:p>
+        </w:tc>
+        <w:tc>
+          <w:tcPr>
+            <w:tcW w:type="dxa" w:w="1337"/>
+          </w:tcPr>
+          <w:p>
+            <w:r>
+              <w:rPr>
+                <w:sz w:val="18"/>
+              </w:rPr>
+              <w:t>1.23x</w:t>
+            </w:r>
+          </w:p>
+        </w:tc>
+        <w:tc>
+          <w:tcPr>
+            <w:tcW w:type="dxa" w:w="1337"/>
+          </w:tcPr>
+          <w:p>
+            <w:r>
+              <w:rPr>
+                <w:sz w:val="18"/>
+              </w:rPr>
+              <w:t>-11</w:t>
+            </w:r>
+          </w:p>
+        </w:tc>
+        <w:tc>
+          <w:tcPr>
+            <w:tcW w:type="dxa" w:w="1337"/>
+          </w:tcPr>
+          <w:p>
+            <w:r>
+              <w:rPr>
+                <w:sz w:val="18"/>
+              </w:rPr>
+              <w:t>8</w:t>
+            </w:r>
+          </w:p>
+        </w:tc>
+      </w:tr>
+    </w:tbl>
+    <w:p/>
+    <w:p>
+      <w:r>
+        <w:t>Four of five districts sit below par with headroom to grow. Timur Laut (Georgetown) is the standout: the island's commercial core, median income of RM 6,714, and 57 stores of headroom — the single largest under-supplied urban market in the North. Mainland Seberang Perai is where KKmart is most under-indexed: 155 competitor outlets in SP Utara and SP Tengah against just 8 KKmart stores. The exception is Seberang Perai Selatan, already 1.23x par and 11 stores over; new openings there would be share-fighting.</w:t>
+      </w:r>
+    </w:p>
+    <w:p>
+      <w:pPr>
+        <w:pStyle w:val="Heading2"/>
+      </w:pPr>
+      <w:r>
+        <w:rPr>
+          <w:color w:val="1F3A5F"/>
+        </w:rPr>
+        <w:t>4.2 Johor — guidance holds only outside Johor Bahru</w:t>
+      </w:r>
+    </w:p>
+    <w:tbl>
+      <w:tblPr>
+        <w:tblStyle w:val="LightGrid-Accent1"/>
+        <w:tblW w:type="auto" w:w="0"/>
+        <w:tblLook w:firstColumn="1" w:firstRow="1" w:lastColumn="0" w:lastRow="0" w:noHBand="0" w:noVBand="1" w:val="04A0"/>
+      </w:tblPr>
+      <w:tblGrid>
+        <w:gridCol w:w="1337"/>
+        <w:gridCol w:w="1337"/>
+        <w:gridCol w:w="1337"/>
+        <w:gridCol w:w="1337"/>
+        <w:gridCol w:w="1337"/>
+        <w:gridCol w:w="1337"/>
+        <w:gridCol w:w="1337"/>
+      </w:tblGrid>
+      <w:tr>
+        <w:tc>
+          <w:tcPr>
+            <w:tcW w:type="dxa" w:w="1337"/>
+          </w:tcPr>
+          <w:p>
+            <w:r>
+              <w:rPr>
+                <w:b/>
+                <w:sz w:val="18"/>
+              </w:rPr>
+              <w:t>District</w:t>
+            </w:r>
+          </w:p>
+        </w:tc>
+        <w:tc>
+          <w:tcPr>
+            <w:tcW w:type="dxa" w:w="1337"/>
+          </w:tcPr>
+          <w:p>
+            <w:r>
+              <w:rPr>
+                <w:b/>
+                <w:sz w:val="18"/>
+              </w:rPr>
+              <w:t>Population</w:t>
+            </w:r>
+          </w:p>
+        </w:tc>
+        <w:tc>
+          <w:tcPr>
+            <w:tcW w:type="dxa" w:w="1337"/>
+          </w:tcPr>
+          <w:p>
+            <w:r>
+              <w:rPr>
+                <w:b/>
+                <w:sz w:val="18"/>
+              </w:rPr>
+              <w:t>KKmart</w:t>
+            </w:r>
+          </w:p>
+        </w:tc>
+        <w:tc>
+          <w:tcPr>
+            <w:tcW w:type="dxa" w:w="1337"/>
+          </w:tcPr>
+          <w:p>
+            <w:r>
+              <w:rPr>
+                <w:b/>
+                <w:sz w:val="18"/>
+              </w:rPr>
+              <w:t>Competitors</w:t>
+            </w:r>
+          </w:p>
+        </w:tc>
+        <w:tc>
+          <w:tcPr>
+            <w:tcW w:type="dxa" w:w="1337"/>
+          </w:tcPr>
+          <w:p>
+            <w:r>
+              <w:rPr>
+                <w:b/>
+                <w:sz w:val="18"/>
+              </w:rPr>
+              <w:t>vs Peninsular avg</w:t>
+            </w:r>
+          </w:p>
+        </w:tc>
+        <w:tc>
+          <w:tcPr>
+            <w:tcW w:type="dxa" w:w="1337"/>
+          </w:tcPr>
+          <w:p>
+            <w:r>
+              <w:rPr>
+                <w:b/>
+                <w:sz w:val="18"/>
+              </w:rPr>
+              <w:t>Headroom</w:t>
+            </w:r>
+          </w:p>
+        </w:tc>
+        <w:tc>
+          <w:tcPr>
+            <w:tcW w:type="dxa" w:w="1337"/>
+          </w:tcPr>
+          <w:p>
+            <w:r>
+              <w:rPr>
+                <w:b/>
+                <w:sz w:val="18"/>
+              </w:rPr>
+              <w:t>KK fair-share gap</w:t>
+            </w:r>
+          </w:p>
+        </w:tc>
+      </w:tr>
+      <w:tr>
+        <w:tc>
+          <w:tcPr>
+            <w:tcW w:type="dxa" w:w="1337"/>
+          </w:tcPr>
+          <w:p>
+            <w:r>
+              <w:rPr>
+                <w:sz w:val="18"/>
+              </w:rPr>
+              <w:t>Johor Bahru</w:t>
+            </w:r>
+          </w:p>
+        </w:tc>
+        <w:tc>
+          <w:tcPr>
+            <w:tcW w:type="dxa" w:w="1337"/>
+          </w:tcPr>
+          <w:p>
+            <w:r>
+              <w:rPr>
+                <w:sz w:val="18"/>
+              </w:rPr>
+              <w:t>1,800k</w:t>
+            </w:r>
+          </w:p>
+        </w:tc>
+        <w:tc>
+          <w:tcPr>
+            <w:tcW w:type="dxa" w:w="1337"/>
+          </w:tcPr>
+          <w:p>
+            <w:r>
+              <w:rPr>
+                <w:sz w:val="18"/>
+              </w:rPr>
+              <w:t>87</w:t>
+            </w:r>
+          </w:p>
+        </w:tc>
+        <w:tc>
+          <w:tcPr>
+            <w:tcW w:type="dxa" w:w="1337"/>
+          </w:tcPr>
+          <w:p>
+            <w:r>
+              <w:rPr>
+                <w:sz w:val="18"/>
+              </w:rPr>
+              <w:t>469</w:t>
+            </w:r>
+          </w:p>
+        </w:tc>
+        <w:tc>
+          <w:tcPr>
+            <w:tcW w:type="dxa" w:w="1337"/>
+          </w:tcPr>
+          <w:p>
+            <w:r>
+              <w:rPr>
+                <w:sz w:val="18"/>
+              </w:rPr>
+              <w:t>1.19x</w:t>
+            </w:r>
+          </w:p>
+        </w:tc>
+        <w:tc>
+          <w:tcPr>
+            <w:tcW w:type="dxa" w:w="1337"/>
+          </w:tcPr>
+          <w:p>
+            <w:r>
+              <w:rPr>
+                <w:sz w:val="18"/>
+              </w:rPr>
+              <w:t>-90</w:t>
+            </w:r>
+          </w:p>
+        </w:tc>
+        <w:tc>
+          <w:tcPr>
+            <w:tcW w:type="dxa" w:w="1337"/>
+          </w:tcPr>
+          <w:p>
+            <w:r>
+              <w:rPr>
+                <w:sz w:val="18"/>
+              </w:rPr>
+              <w:t>0</w:t>
+            </w:r>
+          </w:p>
+        </w:tc>
+      </w:tr>
+      <w:tr>
+        <w:tc>
+          <w:tcPr>
+            <w:tcW w:type="dxa" w:w="1337"/>
+          </w:tcPr>
+          <w:p>
+            <w:r>
+              <w:rPr>
+                <w:sz w:val="18"/>
+              </w:rPr>
+              <w:t>Kota Tinggi</w:t>
+            </w:r>
+          </w:p>
+        </w:tc>
+        <w:tc>
+          <w:tcPr>
+            <w:tcW w:type="dxa" w:w="1337"/>
+          </w:tcPr>
+          <w:p>
+            <w:r>
+              <w:rPr>
+                <w:sz w:val="18"/>
+              </w:rPr>
+              <w:t>234k</w:t>
+            </w:r>
+          </w:p>
+        </w:tc>
+        <w:tc>
+          <w:tcPr>
+            <w:tcW w:type="dxa" w:w="1337"/>
+          </w:tcPr>
+          <w:p>
+            <w:r>
+              <w:rPr>
+                <w:sz w:val="18"/>
+              </w:rPr>
+              <w:t>5</w:t>
+            </w:r>
+          </w:p>
+        </w:tc>
+        <w:tc>
+          <w:tcPr>
+            <w:tcW w:type="dxa" w:w="1337"/>
+          </w:tcPr>
+          <w:p>
+            <w:r>
+              <w:rPr>
+                <w:sz w:val="18"/>
+              </w:rPr>
+              <w:t>31</w:t>
+            </w:r>
+          </w:p>
+        </w:tc>
+        <w:tc>
+          <w:tcPr>
+            <w:tcW w:type="dxa" w:w="1337"/>
+          </w:tcPr>
+          <w:p>
+            <w:r>
+              <w:rPr>
+                <w:sz w:val="18"/>
+              </w:rPr>
+              <w:t>0.59x</w:t>
+            </w:r>
+          </w:p>
+        </w:tc>
+        <w:tc>
+          <w:tcPr>
+            <w:tcW w:type="dxa" w:w="1337"/>
+          </w:tcPr>
+          <w:p>
+            <w:r>
+              <w:rPr>
+                <w:sz w:val="18"/>
+              </w:rPr>
+              <w:t>25</w:t>
+            </w:r>
+          </w:p>
+        </w:tc>
+        <w:tc>
+          <w:tcPr>
+            <w:tcW w:type="dxa" w:w="1337"/>
+          </w:tcPr>
+          <w:p>
+            <w:r>
+              <w:rPr>
+                <w:sz w:val="18"/>
+              </w:rPr>
+              <w:t>0</w:t>
+            </w:r>
+          </w:p>
+        </w:tc>
+      </w:tr>
+      <w:tr>
+        <w:tc>
+          <w:tcPr>
+            <w:tcW w:type="dxa" w:w="1337"/>
+          </w:tcPr>
+          <w:p>
+            <w:r>
+              <w:rPr>
+                <w:sz w:val="18"/>
+              </w:rPr>
+              <w:t>Batu Pahat</w:t>
+            </w:r>
+          </w:p>
+        </w:tc>
+        <w:tc>
+          <w:tcPr>
+            <w:tcW w:type="dxa" w:w="1337"/>
+          </w:tcPr>
+          <w:p>
+            <w:r>
+              <w:rPr>
+                <w:sz w:val="18"/>
+              </w:rPr>
+              <w:t>510k</w:t>
+            </w:r>
+          </w:p>
+        </w:tc>
+        <w:tc>
+          <w:tcPr>
+            <w:tcW w:type="dxa" w:w="1337"/>
+          </w:tcPr>
+          <w:p>
+            <w:r>
+              <w:rPr>
+                <w:sz w:val="18"/>
+              </w:rPr>
+              <w:t>9</w:t>
+            </w:r>
+          </w:p>
+        </w:tc>
+        <w:tc>
+          <w:tcPr>
+            <w:tcW w:type="dxa" w:w="1337"/>
+          </w:tcPr>
+          <w:p>
+            <w:r>
+              <w:rPr>
+                <w:sz w:val="18"/>
+              </w:rPr>
+              <w:t>94</w:t>
+            </w:r>
+          </w:p>
+        </w:tc>
+        <w:tc>
+          <w:tcPr>
+            <w:tcW w:type="dxa" w:w="1337"/>
+          </w:tcPr>
+          <w:p>
+            <w:r>
+              <w:rPr>
+                <w:sz w:val="18"/>
+              </w:rPr>
+              <w:t>0.78x</w:t>
+            </w:r>
+          </w:p>
+        </w:tc>
+        <w:tc>
+          <w:tcPr>
+            <w:tcW w:type="dxa" w:w="1337"/>
+          </w:tcPr>
+          <w:p>
+            <w:r>
+              <w:rPr>
+                <w:sz w:val="18"/>
+              </w:rPr>
+              <w:t>29</w:t>
+            </w:r>
+          </w:p>
+        </w:tc>
+        <w:tc>
+          <w:tcPr>
+            <w:tcW w:type="dxa" w:w="1337"/>
+          </w:tcPr>
+          <w:p>
+            <w:r>
+              <w:rPr>
+                <w:sz w:val="18"/>
+              </w:rPr>
+              <w:t>6</w:t>
+            </w:r>
+          </w:p>
+        </w:tc>
+      </w:tr>
+      <w:tr>
+        <w:tc>
+          <w:tcPr>
+            <w:tcW w:type="dxa" w:w="1337"/>
+          </w:tcPr>
+          <w:p>
+            <w:r>
+              <w:rPr>
+                <w:sz w:val="18"/>
+              </w:rPr>
+              <w:t>Kulai</w:t>
+            </w:r>
+          </w:p>
+        </w:tc>
+        <w:tc>
+          <w:tcPr>
+            <w:tcW w:type="dxa" w:w="1337"/>
+          </w:tcPr>
+          <w:p>
+            <w:r>
+              <w:rPr>
+                <w:sz w:val="18"/>
+              </w:rPr>
+              <w:t>351k</w:t>
+            </w:r>
+          </w:p>
+        </w:tc>
+        <w:tc>
+          <w:tcPr>
+            <w:tcW w:type="dxa" w:w="1337"/>
+          </w:tcPr>
+          <w:p>
+            <w:r>
+              <w:rPr>
+                <w:sz w:val="18"/>
+              </w:rPr>
+              <w:t>11</w:t>
+            </w:r>
+          </w:p>
+        </w:tc>
+        <w:tc>
+          <w:tcPr>
+            <w:tcW w:type="dxa" w:w="1337"/>
+          </w:tcPr>
+          <w:p>
+            <w:r>
+              <w:rPr>
+                <w:sz w:val="18"/>
+              </w:rPr>
+              <w:t>70</w:t>
+            </w:r>
+          </w:p>
+        </w:tc>
+        <w:tc>
+          <w:tcPr>
+            <w:tcW w:type="dxa" w:w="1337"/>
+          </w:tcPr>
+          <w:p>
+            <w:r>
+              <w:rPr>
+                <w:sz w:val="18"/>
+              </w:rPr>
+              <w:t>0.89x</w:t>
+            </w:r>
+          </w:p>
+        </w:tc>
+        <w:tc>
+          <w:tcPr>
+            <w:tcW w:type="dxa" w:w="1337"/>
+          </w:tcPr>
+          <w:p>
+            <w:r>
+              <w:rPr>
+                <w:sz w:val="18"/>
+              </w:rPr>
+              <w:t>10</w:t>
+            </w:r>
+          </w:p>
+        </w:tc>
+        <w:tc>
+          <w:tcPr>
+            <w:tcW w:type="dxa" w:w="1337"/>
+          </w:tcPr>
+          <w:p>
+            <w:r>
+              <w:rPr>
+                <w:sz w:val="18"/>
+              </w:rPr>
+              <w:t>1</w:t>
+            </w:r>
+          </w:p>
+        </w:tc>
+      </w:tr>
+      <w:tr>
+        <w:tc>
+          <w:tcPr>
+            <w:tcW w:type="dxa" w:w="1337"/>
+          </w:tcPr>
+          <w:p>
+            <w:r>
+              <w:rPr>
+                <w:sz w:val="18"/>
+              </w:rPr>
+              <w:t>Muar</w:t>
+            </w:r>
+          </w:p>
+        </w:tc>
+        <w:tc>
+          <w:tcPr>
+            <w:tcW w:type="dxa" w:w="1337"/>
+          </w:tcPr>
+          <w:p>
+            <w:r>
+              <w:rPr>
+                <w:sz w:val="18"/>
+              </w:rPr>
+              <w:t>323k</w:t>
+            </w:r>
+          </w:p>
+        </w:tc>
+        <w:tc>
+          <w:tcPr>
+            <w:tcW w:type="dxa" w:w="1337"/>
+          </w:tcPr>
+          <w:p>
+            <w:r>
+              <w:rPr>
+                <w:sz w:val="18"/>
+              </w:rPr>
+              <w:t>5</w:t>
+            </w:r>
+          </w:p>
+        </w:tc>
+        <w:tc>
+          <w:tcPr>
+            <w:tcW w:type="dxa" w:w="1337"/>
+          </w:tcPr>
+          <w:p>
+            <w:r>
+              <w:rPr>
+                <w:sz w:val="18"/>
+              </w:rPr>
+              <w:t>61</w:t>
+            </w:r>
+          </w:p>
+        </w:tc>
+        <w:tc>
+          <w:tcPr>
+            <w:tcW w:type="dxa" w:w="1337"/>
+          </w:tcPr>
+          <w:p>
+            <w:r>
+              <w:rPr>
+                <w:sz w:val="18"/>
+              </w:rPr>
+              <w:t>0.79x</w:t>
+            </w:r>
+          </w:p>
+        </w:tc>
+        <w:tc>
+          <w:tcPr>
+            <w:tcW w:type="dxa" w:w="1337"/>
+          </w:tcPr>
+          <w:p>
+            <w:r>
+              <w:rPr>
+                <w:sz w:val="18"/>
+              </w:rPr>
+              <w:t>18</w:t>
+            </w:r>
+          </w:p>
+        </w:tc>
+        <w:tc>
+          <w:tcPr>
+            <w:tcW w:type="dxa" w:w="1337"/>
+          </w:tcPr>
+          <w:p>
+            <w:r>
+              <w:rPr>
+                <w:sz w:val="18"/>
+              </w:rPr>
+              <w:t>5</w:t>
+            </w:r>
+          </w:p>
+        </w:tc>
+      </w:tr>
+      <w:tr>
+        <w:tc>
+          <w:tcPr>
+            <w:tcW w:type="dxa" w:w="1337"/>
+          </w:tcPr>
+          <w:p>
+            <w:r>
+              <w:rPr>
+                <w:sz w:val="18"/>
+              </w:rPr>
+              <w:t>Kluang</w:t>
+            </w:r>
+          </w:p>
+        </w:tc>
+        <w:tc>
+          <w:tcPr>
+            <w:tcW w:type="dxa" w:w="1337"/>
+          </w:tcPr>
+          <w:p>
+            <w:r>
+              <w:rPr>
+                <w:sz w:val="18"/>
+              </w:rPr>
+              <w:t>334k</w:t>
+            </w:r>
+          </w:p>
+        </w:tc>
+        <w:tc>
+          <w:tcPr>
+            <w:tcW w:type="dxa" w:w="1337"/>
+          </w:tcPr>
+          <w:p>
+            <w:r>
+              <w:rPr>
+                <w:sz w:val="18"/>
+              </w:rPr>
+              <w:t>5</w:t>
+            </w:r>
+          </w:p>
+        </w:tc>
+        <w:tc>
+          <w:tcPr>
+            <w:tcW w:type="dxa" w:w="1337"/>
+          </w:tcPr>
+          <w:p>
+            <w:r>
+              <w:rPr>
+                <w:sz w:val="18"/>
+              </w:rPr>
+              <w:t>64</w:t>
+            </w:r>
+          </w:p>
+        </w:tc>
+        <w:tc>
+          <w:tcPr>
+            <w:tcW w:type="dxa" w:w="1337"/>
+          </w:tcPr>
+          <w:p>
+            <w:r>
+              <w:rPr>
+                <w:sz w:val="18"/>
+              </w:rPr>
+              <w:t>0.80x</w:t>
+            </w:r>
+          </w:p>
+        </w:tc>
+        <w:tc>
+          <w:tcPr>
+            <w:tcW w:type="dxa" w:w="1337"/>
+          </w:tcPr>
+          <w:p>
+            <w:r>
+              <w:rPr>
+                <w:sz w:val="18"/>
+              </w:rPr>
+              <w:t>17</w:t>
+            </w:r>
+          </w:p>
+        </w:tc>
+        <w:tc>
+          <w:tcPr>
+            <w:tcW w:type="dxa" w:w="1337"/>
+          </w:tcPr>
+          <w:p>
+            <w:r>
+              <w:rPr>
+                <w:sz w:val="18"/>
+              </w:rPr>
+              <w:t>5</w:t>
+            </w:r>
+          </w:p>
+        </w:tc>
+      </w:tr>
+      <w:tr>
+        <w:tc>
+          <w:tcPr>
+            <w:tcW w:type="dxa" w:w="1337"/>
+          </w:tcPr>
+          <w:p>
+            <w:r>
+              <w:rPr>
+                <w:sz w:val="18"/>
+              </w:rPr>
+              <w:t>Pontian</w:t>
+            </w:r>
+          </w:p>
+        </w:tc>
+        <w:tc>
+          <w:tcPr>
+            <w:tcW w:type="dxa" w:w="1337"/>
+          </w:tcPr>
+          <w:p>
+            <w:r>
+              <w:rPr>
+                <w:sz w:val="18"/>
+              </w:rPr>
+              <w:t>178k</w:t>
+            </w:r>
+          </w:p>
+        </w:tc>
+        <w:tc>
+          <w:tcPr>
+            <w:tcW w:type="dxa" w:w="1337"/>
+          </w:tcPr>
+          <w:p>
+            <w:r>
+              <w:rPr>
+                <w:sz w:val="18"/>
+              </w:rPr>
+              <w:t>4</w:t>
+            </w:r>
+          </w:p>
+        </w:tc>
+        <w:tc>
+          <w:tcPr>
+            <w:tcW w:type="dxa" w:w="1337"/>
+          </w:tcPr>
+          <w:p>
+            <w:r>
+              <w:rPr>
+                <w:sz w:val="18"/>
+              </w:rPr>
+              <w:t>32</w:t>
+            </w:r>
+          </w:p>
+        </w:tc>
+        <w:tc>
+          <w:tcPr>
+            <w:tcW w:type="dxa" w:w="1337"/>
+          </w:tcPr>
+          <w:p>
+            <w:r>
+              <w:rPr>
+                <w:sz w:val="18"/>
+              </w:rPr>
+              <w:t>0.78x</w:t>
+            </w:r>
+          </w:p>
+        </w:tc>
+        <w:tc>
+          <w:tcPr>
+            <w:tcW w:type="dxa" w:w="1337"/>
+          </w:tcPr>
+          <w:p>
+            <w:r>
+              <w:rPr>
+                <w:sz w:val="18"/>
+              </w:rPr>
+              <w:t>10</w:t>
+            </w:r>
+          </w:p>
+        </w:tc>
+        <w:tc>
+          <w:tcPr>
+            <w:tcW w:type="dxa" w:w="1337"/>
+          </w:tcPr>
+          <w:p>
+            <w:r>
+              <w:rPr>
+                <w:sz w:val="18"/>
+              </w:rPr>
+              <w:t>1</w:t>
+            </w:r>
+          </w:p>
+        </w:tc>
+      </w:tr>
+      <w:tr>
+        <w:tc>
+          <w:tcPr>
+            <w:tcW w:type="dxa" w:w="1337"/>
+          </w:tcPr>
+          <w:p>
+            <w:r>
+              <w:rPr>
+                <w:sz w:val="18"/>
+              </w:rPr>
+              <w:t>Tangkak</w:t>
+            </w:r>
+          </w:p>
+        </w:tc>
+        <w:tc>
+          <w:tcPr>
+            <w:tcW w:type="dxa" w:w="1337"/>
+          </w:tcPr>
+          <w:p>
+            <w:r>
+              <w:rPr>
+                <w:sz w:val="18"/>
+              </w:rPr>
+              <w:t>170k</w:t>
+            </w:r>
+          </w:p>
+        </w:tc>
+        <w:tc>
+          <w:tcPr>
+            <w:tcW w:type="dxa" w:w="1337"/>
+          </w:tcPr>
+          <w:p>
+            <w:r>
+              <w:rPr>
+                <w:sz w:val="18"/>
+              </w:rPr>
+              <w:t>4</w:t>
+            </w:r>
+          </w:p>
+        </w:tc>
+        <w:tc>
+          <w:tcPr>
+            <w:tcW w:type="dxa" w:w="1337"/>
+          </w:tcPr>
+          <w:p>
+            <w:r>
+              <w:rPr>
+                <w:sz w:val="18"/>
+              </w:rPr>
+              <w:t>31</w:t>
+            </w:r>
+          </w:p>
+        </w:tc>
+        <w:tc>
+          <w:tcPr>
+            <w:tcW w:type="dxa" w:w="1337"/>
+          </w:tcPr>
+          <w:p>
+            <w:r>
+              <w:rPr>
+                <w:sz w:val="18"/>
+              </w:rPr>
+              <w:t>0.80x</w:t>
+            </w:r>
+          </w:p>
+        </w:tc>
+        <w:tc>
+          <w:tcPr>
+            <w:tcW w:type="dxa" w:w="1337"/>
+          </w:tcPr>
+          <w:p>
+            <w:r>
+              <w:rPr>
+                <w:sz w:val="18"/>
+              </w:rPr>
+              <w:t>9</w:t>
+            </w:r>
+          </w:p>
+        </w:tc>
+        <w:tc>
+          <w:tcPr>
+            <w:tcW w:type="dxa" w:w="1337"/>
+          </w:tcPr>
+          <w:p>
+            <w:r>
+              <w:rPr>
+                <w:sz w:val="18"/>
+              </w:rPr>
+              <w:t>1</w:t>
+            </w:r>
+          </w:p>
+        </w:tc>
+      </w:tr>
+      <w:tr>
+        <w:tc>
+          <w:tcPr>
+            <w:tcW w:type="dxa" w:w="1337"/>
+          </w:tcPr>
+          <w:p>
+            <w:r>
+              <w:rPr>
+                <w:sz w:val="18"/>
+              </w:rPr>
+              <w:t>Segamat</w:t>
+            </w:r>
+          </w:p>
+        </w:tc>
+        <w:tc>
+          <w:tcPr>
+            <w:tcW w:type="dxa" w:w="1337"/>
+          </w:tcPr>
+          <w:p>
+            <w:r>
+              <w:rPr>
+                <w:sz w:val="18"/>
+              </w:rPr>
+              <w:t>205k</w:t>
+            </w:r>
+          </w:p>
+        </w:tc>
+        <w:tc>
+          <w:tcPr>
+            <w:tcW w:type="dxa" w:w="1337"/>
+          </w:tcPr>
+          <w:p>
+            <w:r>
+              <w:rPr>
+                <w:sz w:val="18"/>
+              </w:rPr>
+              <w:t>2</w:t>
+            </w:r>
+          </w:p>
+        </w:tc>
+        <w:tc>
+          <w:tcPr>
+            <w:tcW w:type="dxa" w:w="1337"/>
+          </w:tcPr>
+          <w:p>
+            <w:r>
+              <w:rPr>
+                <w:sz w:val="18"/>
+              </w:rPr>
+              <w:t>50</w:t>
+            </w:r>
+          </w:p>
+        </w:tc>
+        <w:tc>
+          <w:tcPr>
+            <w:tcW w:type="dxa" w:w="1337"/>
+          </w:tcPr>
+          <w:p>
+            <w:r>
+              <w:rPr>
+                <w:sz w:val="18"/>
+              </w:rPr>
+              <w:t>0.98x</w:t>
+            </w:r>
+          </w:p>
+        </w:tc>
+        <w:tc>
+          <w:tcPr>
+            <w:tcW w:type="dxa" w:w="1337"/>
+          </w:tcPr>
+          <w:p>
+            <w:r>
+              <w:rPr>
+                <w:sz w:val="18"/>
+              </w:rPr>
+              <w:t>1</w:t>
+            </w:r>
+          </w:p>
+        </w:tc>
+        <w:tc>
+          <w:tcPr>
+            <w:tcW w:type="dxa" w:w="1337"/>
+          </w:tcPr>
+          <w:p>
+            <w:r>
+              <w:rPr>
+                <w:sz w:val="18"/>
+              </w:rPr>
+              <w:t>6</w:t>
+            </w:r>
+          </w:p>
+        </w:tc>
+      </w:tr>
+      <w:tr>
+        <w:tc>
+          <w:tcPr>
+            <w:tcW w:type="dxa" w:w="1337"/>
+          </w:tcPr>
+          <w:p>
+            <w:r>
+              <w:rPr>
+                <w:sz w:val="18"/>
+              </w:rPr>
+              <w:t>Mersing</w:t>
+            </w:r>
+          </w:p>
+        </w:tc>
+        <w:tc>
+          <w:tcPr>
+            <w:tcW w:type="dxa" w:w="1337"/>
+          </w:tcPr>
+          <w:p>
+            <w:r>
+              <w:rPr>
+                <w:sz w:val="18"/>
+              </w:rPr>
+              <w:t>81k</w:t>
+            </w:r>
+          </w:p>
+        </w:tc>
+        <w:tc>
+          <w:tcPr>
+            <w:tcW w:type="dxa" w:w="1337"/>
+          </w:tcPr>
+          <w:p>
+            <w:r>
+              <w:rPr>
+                <w:sz w:val="18"/>
+              </w:rPr>
+              <w:t>0</w:t>
+            </w:r>
+          </w:p>
+        </w:tc>
+        <w:tc>
+          <w:tcPr>
+            <w:tcW w:type="dxa" w:w="1337"/>
+          </w:tcPr>
+          <w:p>
+            <w:r>
+              <w:rPr>
+                <w:sz w:val="18"/>
+              </w:rPr>
+              <w:t>19</w:t>
+            </w:r>
+          </w:p>
+        </w:tc>
+        <w:tc>
+          <w:tcPr>
+            <w:tcW w:type="dxa" w:w="1337"/>
+          </w:tcPr>
+          <w:p>
+            <w:r>
+              <w:rPr>
+                <w:sz w:val="18"/>
+              </w:rPr>
+              <w:t>0.90x</w:t>
+            </w:r>
+          </w:p>
+        </w:tc>
+        <w:tc>
+          <w:tcPr>
+            <w:tcW w:type="dxa" w:w="1337"/>
+          </w:tcPr>
+          <w:p>
+            <w:r>
+              <w:rPr>
+                <w:sz w:val="18"/>
+              </w:rPr>
+              <w:t>2</w:t>
+            </w:r>
+          </w:p>
+        </w:tc>
+        <w:tc>
+          <w:tcPr>
+            <w:tcW w:type="dxa" w:w="1337"/>
+          </w:tcPr>
+          <w:p>
+            <w:r>
+              <w:rPr>
+                <w:sz w:val="18"/>
+              </w:rPr>
+              <w:t>3</w:t>
+            </w:r>
+          </w:p>
+        </w:tc>
+      </w:tr>
+    </w:tbl>
+    <w:p/>
+    <w:p>
+      <w:r>
+        <w:t>Johor Bahru, the state's headline market, is already saturated: 556 stores, 1.19x Peninsular par, 90 stores over. Incremental JB openings compete with 469 competitor outlets for existing traffic. The genuine Johor runway is in secondary districts — Batu Pahat (+29 headroom), Kota Tinggi (+25), Muar (+18), Kluang (+17), with Kulai, Pontian and Tangkak adding roughly 10 each. Johor excluding JB offers approximately 120 stores of at-par headroom, comparable to Penang's 113 excluding SP Selatan.</w:t>
+      </w:r>
+    </w:p>
+    <w:p>
+      <w:pPr>
+        <w:pStyle w:val="Heading2"/>
+      </w:pPr>
+      <w:r>
+        <w:rPr>
+          <w:color w:val="1F3A5F"/>
+        </w:rPr>
+        <w:t>4.3 Adjacent Northern opportunity — Kedah and Perlis</w:t>
+      </w:r>
+    </w:p>
+    <w:p>
+      <w:r>
+        <w:t>If the Northern corridor is read more broadly than Penang alone, the largest headroom in the region actually sits next door: Kulim (+38 stores, zero KKmart, 53 competitors), Kuala Muda / Sungai Petani (+36, two KKmart vs 110 competitors) and Perlis (+43, zero KKmart). These districts border Penang's mainland corridor and could share its distribution infrastructure, at the cost of lower median incomes (RM 4,200-4,700 versus Penang's RM 6,200-7,200).</w:t>
+      </w:r>
+    </w:p>
+    <w:p>
+      <w:pPr>
+        <w:pStyle w:val="Heading2"/>
+      </w:pPr>
+      <w:r>
+        <w:rPr>
+          <w:color w:val="1F3A5F"/>
+        </w:rPr>
+        <w:t>4.4 Reading management execution</w:t>
+      </w:r>
+    </w:p>
+    <w:p>
+      <w:r>
+        <w:t>The guided focus states hold ~230 stores of combined at-par headroom, sufficient for ~20% network growth without entering saturated territory. The signal to monitor is the mix of actual openings: concentration in Johor Bahru city or Seberang Perai Selatan would indicate share-fighting in crowded markets (margin-dilutive), while openings weighted toward Timur Laut, mainland Seberang Perai and Johor's secondary towns would indicate genuine whitespace capture consistent with the guidance.</w:t>
+      </w:r>
+    </w:p>
+    <w:p>
+      <w:pPr>
+        <w:pStyle w:val="Heading1"/>
+      </w:pPr>
+      <w:r>
+        <w:rPr>
+          <w:color w:val="1F3A5F"/>
+        </w:rPr>
+        <w:t>5. Relevance for Investment Analysis</w:t>
       </w:r>
     </w:p>
     <w:p>
@@ -2763,7 +4477,7 @@
         <w:rPr>
           <w:color w:val="1F3A5F"/>
         </w:rPr>
-        <w:t>5. Caveats</w:t>
+        <w:t>6. Caveats</w:t>
       </w:r>
     </w:p>
     <w:p>
@@ -2805,7 +4519,7 @@
           <w:i/>
           <w:sz w:val="18"/>
         </w:rPr>
-        <w:t>Deliverables: interactive map (docs/index.html, deployable via GitHub Pages), full district ranking (output/whitespace_ranking.csv), reproducible pipeline (python -m src.pipeline).</w:t>
+        <w:t>Deliverables: interactive map (docs/index.html, deployable via GitHub Pages), full district ranking (output/whitespace_ranking.csv), Peninsular focus tables (output/focus_peninsular_ranking.csv, output/focus_penang_johor.csv), reproducible pipeline (python -m src.pipeline).</w:t>
       </w:r>
     </w:p>
     <w:sectPr>

</xml_diff>

<commit_message>
Split section 3.3 open whitespace into East and West Malaysia
Co-Authored-By: Claude Fable 5 <noreply@anthropic.com>
Claude-Session: https://claude.ai/code/session_01UBEYtRwKf6f3vxGesJBzvb
</commit_message>
<xml_diff>
--- a/output/KKmart_Whitespace_Report.docx
+++ b/output/KKmart_Whitespace_Report.docx
@@ -1438,6 +1438,22 @@
         <w:t>3.3 Open whitespace (high demand, few stores from any brand)</w:t>
       </w:r>
     </w:p>
+    <w:p>
+      <w:r>
+        <w:t>Of the 19 open-whitespace districts, 11 are in East Malaysia and 8 in West Malaysia. The two groups differ sharply in character and execution risk.</w:t>
+      </w:r>
+    </w:p>
+    <w:p>
+      <w:r>
+        <w:rPr>
+          <w:b/>
+        </w:rPr>
+        <w:t xml:space="preserve">East Malaysia (Sabah, Sarawak, Labuan). </w:t>
+      </w:r>
+      <w:r>
+        <w:t>The deepest whitespace in the country: Tawau (414k people, 8 stores in total across all brands), Semporna, Lahad Datu and Kinabatangan in Sabah; Bintulu and Sibu in Sarawak. Kalabakan and Kunak have no convenience store from any chain. Bintulu is notable for its high median income (RM 8,567 — above Klang) with no KKmart presence. The main execution risk is logistics: distribution-centre and shipping costs across the South China Sea.</w:t>
+      </w:r>
+    </w:p>
     <w:tbl>
       <w:tblPr>
         <w:tblStyle w:val="LightGrid-Accent1"/>
@@ -2063,9 +2079,638 @@
     <w:p/>
     <w:p>
       <w:r>
-        <w:t>East Malaysia dominates: Tawau (414k people, 8 stores in total across all brands), Semporna, Lahad Datu and Kinabatangan in Sabah; Bintulu and Sibu in Sarawak. Bintulu is notable for its high median income (RM 8,567 — above Klang) with no KKmart presence. The main execution risk in this group is East Malaysian logistics and supply-chain cost.</w:t>
+        <w:rPr>
+          <w:b/>
+        </w:rPr>
+        <w:t xml:space="preserve">West Malaysia (Peninsular East Coast). </w:t>
+      </w:r>
+      <w:r>
+        <w:t>Every Peninsular open-whitespace district lies on the East Coast, in Kelantan and Terengganu: Kota Bharu (584k people, 10 stores per 100k — less than half the Peninsular average), Pasir Mas, Bachok and Tumpat form a contiguous under-served cluster around the Kota Bharu conurbation. Unlike East Malaysia, these districts are reachable from existing Peninsular distribution infrastructure, making them the lower-risk half of the open whitespace despite lower median incomes (RM 3,500-4,300 in the Kelantan cluster; Kuala Nerus near Kuala Terengganu is the income outlier at RM 6,800).</w:t>
       </w:r>
     </w:p>
+    <w:tbl>
+      <w:tblPr>
+        <w:tblStyle w:val="LightGrid-Accent1"/>
+        <w:tblW w:type="auto" w:w="0"/>
+        <w:tblLook w:firstColumn="1" w:firstRow="1" w:lastColumn="0" w:lastRow="0" w:noHBand="0" w:noVBand="1" w:val="04A0"/>
+      </w:tblPr>
+      <w:tblGrid>
+        <w:gridCol w:w="1872"/>
+        <w:gridCol w:w="1872"/>
+        <w:gridCol w:w="1872"/>
+        <w:gridCol w:w="1872"/>
+        <w:gridCol w:w="1872"/>
+      </w:tblGrid>
+      <w:tr>
+        <w:tc>
+          <w:tcPr>
+            <w:tcW w:type="dxa" w:w="1872"/>
+          </w:tcPr>
+          <w:p>
+            <w:r>
+              <w:rPr>
+                <w:b/>
+                <w:sz w:val="18"/>
+              </w:rPr>
+              <w:t>District</w:t>
+            </w:r>
+          </w:p>
+        </w:tc>
+        <w:tc>
+          <w:tcPr>
+            <w:tcW w:type="dxa" w:w="1872"/>
+          </w:tcPr>
+          <w:p>
+            <w:r>
+              <w:rPr>
+                <w:b/>
+                <w:sz w:val="18"/>
+              </w:rPr>
+              <w:t>Population</w:t>
+            </w:r>
+          </w:p>
+        </w:tc>
+        <w:tc>
+          <w:tcPr>
+            <w:tcW w:type="dxa" w:w="1872"/>
+          </w:tcPr>
+          <w:p>
+            <w:r>
+              <w:rPr>
+                <w:b/>
+                <w:sz w:val="18"/>
+              </w:rPr>
+              <w:t>Median income (RM)</w:t>
+            </w:r>
+          </w:p>
+        </w:tc>
+        <w:tc>
+          <w:tcPr>
+            <w:tcW w:type="dxa" w:w="1872"/>
+          </w:tcPr>
+          <w:p>
+            <w:r>
+              <w:rPr>
+                <w:b/>
+                <w:sz w:val="18"/>
+              </w:rPr>
+              <w:t>Total stores</w:t>
+            </w:r>
+          </w:p>
+        </w:tc>
+        <w:tc>
+          <w:tcPr>
+            <w:tcW w:type="dxa" w:w="1872"/>
+          </w:tcPr>
+          <w:p>
+            <w:r>
+              <w:rPr>
+                <w:b/>
+                <w:sz w:val="18"/>
+              </w:rPr>
+              <w:t>Stores/100k</w:t>
+            </w:r>
+          </w:p>
+        </w:tc>
+      </w:tr>
+      <w:tr>
+        <w:tc>
+          <w:tcPr>
+            <w:tcW w:type="dxa" w:w="1872"/>
+          </w:tcPr>
+          <w:p>
+            <w:r>
+              <w:rPr>
+                <w:sz w:val="18"/>
+              </w:rPr>
+              <w:t>Kota Bharu, Kelantan</w:t>
+            </w:r>
+          </w:p>
+        </w:tc>
+        <w:tc>
+          <w:tcPr>
+            <w:tcW w:type="dxa" w:w="1872"/>
+          </w:tcPr>
+          <w:p>
+            <w:r>
+              <w:rPr>
+                <w:sz w:val="18"/>
+              </w:rPr>
+              <w:t>584k</w:t>
+            </w:r>
+          </w:p>
+        </w:tc>
+        <w:tc>
+          <w:tcPr>
+            <w:tcW w:type="dxa" w:w="1872"/>
+          </w:tcPr>
+          <w:p>
+            <w:r>
+              <w:rPr>
+                <w:sz w:val="18"/>
+              </w:rPr>
+              <w:t>4,330</w:t>
+            </w:r>
+          </w:p>
+        </w:tc>
+        <w:tc>
+          <w:tcPr>
+            <w:tcW w:type="dxa" w:w="1872"/>
+          </w:tcPr>
+          <w:p>
+            <w:r>
+              <w:rPr>
+                <w:sz w:val="18"/>
+              </w:rPr>
+              <w:t>59</w:t>
+            </w:r>
+          </w:p>
+        </w:tc>
+        <w:tc>
+          <w:tcPr>
+            <w:tcW w:type="dxa" w:w="1872"/>
+          </w:tcPr>
+          <w:p>
+            <w:r>
+              <w:rPr>
+                <w:sz w:val="18"/>
+              </w:rPr>
+              <w:t>10.1</w:t>
+            </w:r>
+          </w:p>
+        </w:tc>
+      </w:tr>
+      <w:tr>
+        <w:tc>
+          <w:tcPr>
+            <w:tcW w:type="dxa" w:w="1872"/>
+          </w:tcPr>
+          <w:p>
+            <w:r>
+              <w:rPr>
+                <w:sz w:val="18"/>
+              </w:rPr>
+              <w:t>Pasir Mas, Kelantan</w:t>
+            </w:r>
+          </w:p>
+        </w:tc>
+        <w:tc>
+          <w:tcPr>
+            <w:tcW w:type="dxa" w:w="1872"/>
+          </w:tcPr>
+          <w:p>
+            <w:r>
+              <w:rPr>
+                <w:sz w:val="18"/>
+              </w:rPr>
+              <w:t>241k</w:t>
+            </w:r>
+          </w:p>
+        </w:tc>
+        <w:tc>
+          <w:tcPr>
+            <w:tcW w:type="dxa" w:w="1872"/>
+          </w:tcPr>
+          <w:p>
+            <w:r>
+              <w:rPr>
+                <w:sz w:val="18"/>
+              </w:rPr>
+              <w:t>3,508</w:t>
+            </w:r>
+          </w:p>
+        </w:tc>
+        <w:tc>
+          <w:tcPr>
+            <w:tcW w:type="dxa" w:w="1872"/>
+          </w:tcPr>
+          <w:p>
+            <w:r>
+              <w:rPr>
+                <w:sz w:val="18"/>
+              </w:rPr>
+              <w:t>7</w:t>
+            </w:r>
+          </w:p>
+        </w:tc>
+        <w:tc>
+          <w:tcPr>
+            <w:tcW w:type="dxa" w:w="1872"/>
+          </w:tcPr>
+          <w:p>
+            <w:r>
+              <w:rPr>
+                <w:sz w:val="18"/>
+              </w:rPr>
+              <w:t>2.9</w:t>
+            </w:r>
+          </w:p>
+        </w:tc>
+      </w:tr>
+      <w:tr>
+        <w:tc>
+          <w:tcPr>
+            <w:tcW w:type="dxa" w:w="1872"/>
+          </w:tcPr>
+          <w:p>
+            <w:r>
+              <w:rPr>
+                <w:sz w:val="18"/>
+              </w:rPr>
+              <w:t>Bachok, Kelantan</w:t>
+            </w:r>
+          </w:p>
+        </w:tc>
+        <w:tc>
+          <w:tcPr>
+            <w:tcW w:type="dxa" w:w="1872"/>
+          </w:tcPr>
+          <w:p>
+            <w:r>
+              <w:rPr>
+                <w:sz w:val="18"/>
+              </w:rPr>
+              <w:t>166k</w:t>
+            </w:r>
+          </w:p>
+        </w:tc>
+        <w:tc>
+          <w:tcPr>
+            <w:tcW w:type="dxa" w:w="1872"/>
+          </w:tcPr>
+          <w:p>
+            <w:r>
+              <w:rPr>
+                <w:sz w:val="18"/>
+              </w:rPr>
+              <w:t>3,625</w:t>
+            </w:r>
+          </w:p>
+        </w:tc>
+        <w:tc>
+          <w:tcPr>
+            <w:tcW w:type="dxa" w:w="1872"/>
+          </w:tcPr>
+          <w:p>
+            <w:r>
+              <w:rPr>
+                <w:sz w:val="18"/>
+              </w:rPr>
+              <w:t>6</w:t>
+            </w:r>
+          </w:p>
+        </w:tc>
+        <w:tc>
+          <w:tcPr>
+            <w:tcW w:type="dxa" w:w="1872"/>
+          </w:tcPr>
+          <w:p>
+            <w:r>
+              <w:rPr>
+                <w:sz w:val="18"/>
+              </w:rPr>
+              <w:t>3.6</w:t>
+            </w:r>
+          </w:p>
+        </w:tc>
+      </w:tr>
+      <w:tr>
+        <w:tc>
+          <w:tcPr>
+            <w:tcW w:type="dxa" w:w="1872"/>
+          </w:tcPr>
+          <w:p>
+            <w:r>
+              <w:rPr>
+                <w:sz w:val="18"/>
+              </w:rPr>
+              <w:t>Tumpat, Kelantan</w:t>
+            </w:r>
+          </w:p>
+        </w:tc>
+        <w:tc>
+          <w:tcPr>
+            <w:tcW w:type="dxa" w:w="1872"/>
+          </w:tcPr>
+          <w:p>
+            <w:r>
+              <w:rPr>
+                <w:sz w:val="18"/>
+              </w:rPr>
+              <w:t>189k</w:t>
+            </w:r>
+          </w:p>
+        </w:tc>
+        <w:tc>
+          <w:tcPr>
+            <w:tcW w:type="dxa" w:w="1872"/>
+          </w:tcPr>
+          <w:p>
+            <w:r>
+              <w:rPr>
+                <w:sz w:val="18"/>
+              </w:rPr>
+              <w:t>3,749</w:t>
+            </w:r>
+          </w:p>
+        </w:tc>
+        <w:tc>
+          <w:tcPr>
+            <w:tcW w:type="dxa" w:w="1872"/>
+          </w:tcPr>
+          <w:p>
+            <w:r>
+              <w:rPr>
+                <w:sz w:val="18"/>
+              </w:rPr>
+              <w:t>10</w:t>
+            </w:r>
+          </w:p>
+        </w:tc>
+        <w:tc>
+          <w:tcPr>
+            <w:tcW w:type="dxa" w:w="1872"/>
+          </w:tcPr>
+          <w:p>
+            <w:r>
+              <w:rPr>
+                <w:sz w:val="18"/>
+              </w:rPr>
+              <w:t>5.3</w:t>
+            </w:r>
+          </w:p>
+        </w:tc>
+      </w:tr>
+      <w:tr>
+        <w:tc>
+          <w:tcPr>
+            <w:tcW w:type="dxa" w:w="1872"/>
+          </w:tcPr>
+          <w:p>
+            <w:r>
+              <w:rPr>
+                <w:sz w:val="18"/>
+              </w:rPr>
+              <w:t>Marang, Terengganu</w:t>
+            </w:r>
+          </w:p>
+        </w:tc>
+        <w:tc>
+          <w:tcPr>
+            <w:tcW w:type="dxa" w:w="1872"/>
+          </w:tcPr>
+          <w:p>
+            <w:r>
+              <w:rPr>
+                <w:sz w:val="18"/>
+              </w:rPr>
+              <w:t>127k</w:t>
+            </w:r>
+          </w:p>
+        </w:tc>
+        <w:tc>
+          <w:tcPr>
+            <w:tcW w:type="dxa" w:w="1872"/>
+          </w:tcPr>
+          <w:p>
+            <w:r>
+              <w:rPr>
+                <w:sz w:val="18"/>
+              </w:rPr>
+              <w:t>5,291</w:t>
+            </w:r>
+          </w:p>
+        </w:tc>
+        <w:tc>
+          <w:tcPr>
+            <w:tcW w:type="dxa" w:w="1872"/>
+          </w:tcPr>
+          <w:p>
+            <w:r>
+              <w:rPr>
+                <w:sz w:val="18"/>
+              </w:rPr>
+              <w:t>8</w:t>
+            </w:r>
+          </w:p>
+        </w:tc>
+        <w:tc>
+          <w:tcPr>
+            <w:tcW w:type="dxa" w:w="1872"/>
+          </w:tcPr>
+          <w:p>
+            <w:r>
+              <w:rPr>
+                <w:sz w:val="18"/>
+              </w:rPr>
+              <w:t>6.3</w:t>
+            </w:r>
+          </w:p>
+        </w:tc>
+      </w:tr>
+      <w:tr>
+        <w:tc>
+          <w:tcPr>
+            <w:tcW w:type="dxa" w:w="1872"/>
+          </w:tcPr>
+          <w:p>
+            <w:r>
+              <w:rPr>
+                <w:sz w:val="18"/>
+              </w:rPr>
+              <w:t>Kuala Nerus, Terengganu</w:t>
+            </w:r>
+          </w:p>
+        </w:tc>
+        <w:tc>
+          <w:tcPr>
+            <w:tcW w:type="dxa" w:w="1872"/>
+          </w:tcPr>
+          <w:p>
+            <w:r>
+              <w:rPr>
+                <w:sz w:val="18"/>
+              </w:rPr>
+              <w:t>156k</w:t>
+            </w:r>
+          </w:p>
+        </w:tc>
+        <w:tc>
+          <w:tcPr>
+            <w:tcW w:type="dxa" w:w="1872"/>
+          </w:tcPr>
+          <w:p>
+            <w:r>
+              <w:rPr>
+                <w:sz w:val="18"/>
+              </w:rPr>
+              <w:t>6,800</w:t>
+            </w:r>
+          </w:p>
+        </w:tc>
+        <w:tc>
+          <w:tcPr>
+            <w:tcW w:type="dxa" w:w="1872"/>
+          </w:tcPr>
+          <w:p>
+            <w:r>
+              <w:rPr>
+                <w:sz w:val="18"/>
+              </w:rPr>
+              <w:t>16</w:t>
+            </w:r>
+          </w:p>
+        </w:tc>
+        <w:tc>
+          <w:tcPr>
+            <w:tcW w:type="dxa" w:w="1872"/>
+          </w:tcPr>
+          <w:p>
+            <w:r>
+              <w:rPr>
+                <w:sz w:val="18"/>
+              </w:rPr>
+              <w:t>10.3</w:t>
+            </w:r>
+          </w:p>
+        </w:tc>
+      </w:tr>
+      <w:tr>
+        <w:tc>
+          <w:tcPr>
+            <w:tcW w:type="dxa" w:w="1872"/>
+          </w:tcPr>
+          <w:p>
+            <w:r>
+              <w:rPr>
+                <w:sz w:val="18"/>
+              </w:rPr>
+              <w:t>Gua Musang, Kelantan</w:t>
+            </w:r>
+          </w:p>
+        </w:tc>
+        <w:tc>
+          <w:tcPr>
+            <w:tcW w:type="dxa" w:w="1872"/>
+          </w:tcPr>
+          <w:p>
+            <w:r>
+              <w:rPr>
+                <w:sz w:val="18"/>
+              </w:rPr>
+              <w:t>110k</w:t>
+            </w:r>
+          </w:p>
+        </w:tc>
+        <w:tc>
+          <w:tcPr>
+            <w:tcW w:type="dxa" w:w="1872"/>
+          </w:tcPr>
+          <w:p>
+            <w:r>
+              <w:rPr>
+                <w:sz w:val="18"/>
+              </w:rPr>
+              <w:t>3,342</w:t>
+            </w:r>
+          </w:p>
+        </w:tc>
+        <w:tc>
+          <w:tcPr>
+            <w:tcW w:type="dxa" w:w="1872"/>
+          </w:tcPr>
+          <w:p>
+            <w:r>
+              <w:rPr>
+                <w:sz w:val="18"/>
+              </w:rPr>
+              <w:t>9</w:t>
+            </w:r>
+          </w:p>
+        </w:tc>
+        <w:tc>
+          <w:tcPr>
+            <w:tcW w:type="dxa" w:w="1872"/>
+          </w:tcPr>
+          <w:p>
+            <w:r>
+              <w:rPr>
+                <w:sz w:val="18"/>
+              </w:rPr>
+              <w:t>8.1</w:t>
+            </w:r>
+          </w:p>
+        </w:tc>
+      </w:tr>
+      <w:tr>
+        <w:tc>
+          <w:tcPr>
+            <w:tcW w:type="dxa" w:w="1872"/>
+          </w:tcPr>
+          <w:p>
+            <w:r>
+              <w:rPr>
+                <w:sz w:val="18"/>
+              </w:rPr>
+              <w:t>Besut, Terengganu</w:t>
+            </w:r>
+          </w:p>
+        </w:tc>
+        <w:tc>
+          <w:tcPr>
+            <w:tcW w:type="dxa" w:w="1872"/>
+          </w:tcPr>
+          <w:p>
+            <w:r>
+              <w:rPr>
+                <w:sz w:val="18"/>
+              </w:rPr>
+              <w:t>165k</w:t>
+            </w:r>
+          </w:p>
+        </w:tc>
+        <w:tc>
+          <w:tcPr>
+            <w:tcW w:type="dxa" w:w="1872"/>
+          </w:tcPr>
+          <w:p>
+            <w:r>
+              <w:rPr>
+                <w:sz w:val="18"/>
+              </w:rPr>
+              <w:t>4,743</w:t>
+            </w:r>
+          </w:p>
+        </w:tc>
+        <w:tc>
+          <w:tcPr>
+            <w:tcW w:type="dxa" w:w="1872"/>
+          </w:tcPr>
+          <w:p>
+            <w:r>
+              <w:rPr>
+                <w:sz w:val="18"/>
+              </w:rPr>
+              <w:t>16</w:t>
+            </w:r>
+          </w:p>
+        </w:tc>
+        <w:tc>
+          <w:tcPr>
+            <w:tcW w:type="dxa" w:w="1872"/>
+          </w:tcPr>
+          <w:p>
+            <w:r>
+              <w:rPr>
+                <w:sz w:val="18"/>
+              </w:rPr>
+              <w:t>9.7</w:t>
+            </w:r>
+          </w:p>
+        </w:tc>
+      </w:tr>
+    </w:tbl>
+    <w:p/>
     <w:p>
       <w:pPr>
         <w:pStyle w:val="Heading2"/>

</xml_diff>

<commit_message>
Expand section 3.4 with East/West split and brand mix detail
Co-Authored-By: Claude Fable 5 <noreply@anthropic.com>
Claude-Session: https://claude.ai/code/session_01UBEYtRwKf6f3vxGesJBzvb
</commit_message>
<xml_diff>
--- a/output/KKmart_Whitespace_Report.docx
+++ b/output/KKmart_Whitespace_Report.docx
@@ -2722,6 +2722,22 @@
         <w:t>3.4 Competitor-led markets (demand proven, KKmart absent)</w:t>
       </w:r>
     </w:p>
+    <w:p>
+      <w:r>
+        <w:t>These are arguably the lowest-risk expansion targets: competitors have already validated consumer demand, total density remains below the national rate, and KKmart is the missing brand. Of the 18 competitor-led districts, 7 are in East Malaysia and 11 in West Malaysia.</w:t>
+      </w:r>
+    </w:p>
+    <w:p>
+      <w:r>
+        <w:rPr>
+          <w:b/>
+        </w:rPr>
+        <w:t xml:space="preserve">East Malaysia — the greater Kota Kinabalu metro. </w:t>
+      </w:r>
+      <w:r>
+        <w:t>Five of the seven East Malaysian districts (Kota Kinabalu, Putatan, Penampang, Tuaran, Papar) form one contiguous urban corridor of 1.1 million people holding 191 competitor outlets and zero KKmart stores — the largest single competitor-validated market KKmart has not entered. Miri and Keningau complete the group. Market structure is also notable: FamilyMart and myNEWS have no presence in any of these districts, so the market is a 7-Eleven / 99 Speedmart duopoly. One Kota Kinabalu distribution centre would serve the entire metro cluster, partially offsetting the East Malaysian logistics disadvantage.</w:t>
+      </w:r>
+    </w:p>
     <w:tbl>
       <w:tblPr>
         <w:tblStyle w:val="LightGrid-Accent1"/>
@@ -2729,16 +2745,19 @@
         <w:tblLook w:firstColumn="1" w:firstRow="1" w:lastColumn="0" w:lastRow="0" w:noHBand="0" w:noVBand="1" w:val="04A0"/>
       </w:tblPr>
       <w:tblGrid>
-        <w:gridCol w:w="1872"/>
-        <w:gridCol w:w="1872"/>
-        <w:gridCol w:w="1872"/>
-        <w:gridCol w:w="1872"/>
-        <w:gridCol w:w="1872"/>
+        <w:gridCol w:w="1170"/>
+        <w:gridCol w:w="1170"/>
+        <w:gridCol w:w="1170"/>
+        <w:gridCol w:w="1170"/>
+        <w:gridCol w:w="1170"/>
+        <w:gridCol w:w="1170"/>
+        <w:gridCol w:w="1170"/>
+        <w:gridCol w:w="1170"/>
       </w:tblGrid>
       <w:tr>
         <w:tc>
           <w:tcPr>
-            <w:tcW w:type="dxa" w:w="1872"/>
+            <w:tcW w:type="dxa" w:w="1170"/>
           </w:tcPr>
           <w:p>
             <w:r>
@@ -2752,7 +2771,7 @@
         </w:tc>
         <w:tc>
           <w:tcPr>
-            <w:tcW w:type="dxa" w:w="1872"/>
+            <w:tcW w:type="dxa" w:w="1170"/>
           </w:tcPr>
           <w:p>
             <w:r>
@@ -2766,7 +2785,7 @@
         </w:tc>
         <w:tc>
           <w:tcPr>
-            <w:tcW w:type="dxa" w:w="1872"/>
+            <w:tcW w:type="dxa" w:w="1170"/>
           </w:tcPr>
           <w:p>
             <w:r>
@@ -2774,13 +2793,13 @@
                 <w:b/>
                 <w:sz w:val="18"/>
               </w:rPr>
-              <w:t>Competitors</w:t>
-            </w:r>
-          </w:p>
-        </w:tc>
-        <w:tc>
-          <w:tcPr>
-            <w:tcW w:type="dxa" w:w="1872"/>
+              <w:t>Median income (RM)</w:t>
+            </w:r>
+          </w:p>
+        </w:tc>
+        <w:tc>
+          <w:tcPr>
+            <w:tcW w:type="dxa" w:w="1170"/>
           </w:tcPr>
           <w:p>
             <w:r>
@@ -2788,13 +2807,55 @@
                 <w:b/>
                 <w:sz w:val="18"/>
               </w:rPr>
+              <w:t>7-Eleven</w:t>
+            </w:r>
+          </w:p>
+        </w:tc>
+        <w:tc>
+          <w:tcPr>
+            <w:tcW w:type="dxa" w:w="1170"/>
+          </w:tcPr>
+          <w:p>
+            <w:r>
+              <w:rPr>
+                <w:b/>
+                <w:sz w:val="18"/>
+              </w:rPr>
+              <w:t>99 Speedmart</w:t>
+            </w:r>
+          </w:p>
+        </w:tc>
+        <w:tc>
+          <w:tcPr>
+            <w:tcW w:type="dxa" w:w="1170"/>
+          </w:tcPr>
+          <w:p>
+            <w:r>
+              <w:rPr>
+                <w:b/>
+                <w:sz w:val="18"/>
+              </w:rPr>
+              <w:t>FamilyMart+myNEWS</w:t>
+            </w:r>
+          </w:p>
+        </w:tc>
+        <w:tc>
+          <w:tcPr>
+            <w:tcW w:type="dxa" w:w="1170"/>
+          </w:tcPr>
+          <w:p>
+            <w:r>
+              <w:rPr>
+                <w:b/>
+                <w:sz w:val="18"/>
+              </w:rPr>
               <w:t>Stores/100k</w:t>
             </w:r>
           </w:p>
         </w:tc>
         <w:tc>
           <w:tcPr>
-            <w:tcW w:type="dxa" w:w="1872"/>
+            <w:tcW w:type="dxa" w:w="1170"/>
           </w:tcPr>
           <w:p>
             <w:r>
@@ -2810,7 +2871,7 @@
       <w:tr>
         <w:tc>
           <w:tcPr>
-            <w:tcW w:type="dxa" w:w="1872"/>
+            <w:tcW w:type="dxa" w:w="1170"/>
           </w:tcPr>
           <w:p>
             <w:r>
@@ -2823,7 +2884,7 @@
         </w:tc>
         <w:tc>
           <w:tcPr>
-            <w:tcW w:type="dxa" w:w="1872"/>
+            <w:tcW w:type="dxa" w:w="1170"/>
           </w:tcPr>
           <w:p>
             <w:r>
@@ -2836,20 +2897,59 @@
         </w:tc>
         <w:tc>
           <w:tcPr>
-            <w:tcW w:type="dxa" w:w="1872"/>
-          </w:tcPr>
-          <w:p>
-            <w:r>
-              <w:rPr>
-                <w:sz w:val="18"/>
-              </w:rPr>
-              <w:t>96</w:t>
-            </w:r>
-          </w:p>
-        </w:tc>
-        <w:tc>
-          <w:tcPr>
-            <w:tcW w:type="dxa" w:w="1872"/>
+            <w:tcW w:type="dxa" w:w="1170"/>
+          </w:tcPr>
+          <w:p>
+            <w:r>
+              <w:rPr>
+                <w:sz w:val="18"/>
+              </w:rPr>
+              <w:t>5,957</w:t>
+            </w:r>
+          </w:p>
+        </w:tc>
+        <w:tc>
+          <w:tcPr>
+            <w:tcW w:type="dxa" w:w="1170"/>
+          </w:tcPr>
+          <w:p>
+            <w:r>
+              <w:rPr>
+                <w:sz w:val="18"/>
+              </w:rPr>
+              <w:t>45</w:t>
+            </w:r>
+          </w:p>
+        </w:tc>
+        <w:tc>
+          <w:tcPr>
+            <w:tcW w:type="dxa" w:w="1170"/>
+          </w:tcPr>
+          <w:p>
+            <w:r>
+              <w:rPr>
+                <w:sz w:val="18"/>
+              </w:rPr>
+              <w:t>51</w:t>
+            </w:r>
+          </w:p>
+        </w:tc>
+        <w:tc>
+          <w:tcPr>
+            <w:tcW w:type="dxa" w:w="1170"/>
+          </w:tcPr>
+          <w:p>
+            <w:r>
+              <w:rPr>
+                <w:sz w:val="18"/>
+              </w:rPr>
+              <w:t>0</w:t>
+            </w:r>
+          </w:p>
+        </w:tc>
+        <w:tc>
+          <w:tcPr>
+            <w:tcW w:type="dxa" w:w="1170"/>
           </w:tcPr>
           <w:p>
             <w:r>
@@ -2862,14 +2962,14 @@
         </w:tc>
         <w:tc>
           <w:tcPr>
-            <w:tcW w:type="dxa" w:w="1872"/>
-          </w:tcPr>
-          <w:p>
-            <w:r>
-              <w:rPr>
-                <w:sz w:val="18"/>
-              </w:rPr>
-              <w:t>0.8x</w:t>
+            <w:tcW w:type="dxa" w:w="1170"/>
+          </w:tcPr>
+          <w:p>
+            <w:r>
+              <w:rPr>
+                <w:sz w:val="18"/>
+              </w:rPr>
+              <w:t>0.78x</w:t>
             </w:r>
           </w:p>
         </w:tc>
@@ -2877,66 +2977,105 @@
       <w:tr>
         <w:tc>
           <w:tcPr>
-            <w:tcW w:type="dxa" w:w="1872"/>
-          </w:tcPr>
-          <w:p>
-            <w:r>
-              <w:rPr>
-                <w:sz w:val="18"/>
-              </w:rPr>
-              <w:t>Kota Setar, Kedah</w:t>
-            </w:r>
-          </w:p>
-        </w:tc>
-        <w:tc>
-          <w:tcPr>
-            <w:tcW w:type="dxa" w:w="1872"/>
-          </w:tcPr>
-          <w:p>
-            <w:r>
-              <w:rPr>
-                <w:sz w:val="18"/>
-              </w:rPr>
-              <w:t>382k</w:t>
-            </w:r>
-          </w:p>
-        </w:tc>
-        <w:tc>
-          <w:tcPr>
-            <w:tcW w:type="dxa" w:w="1872"/>
-          </w:tcPr>
-          <w:p>
-            <w:r>
-              <w:rPr>
-                <w:sz w:val="18"/>
-              </w:rPr>
-              <w:t>85</w:t>
-            </w:r>
-          </w:p>
-        </w:tc>
-        <w:tc>
-          <w:tcPr>
-            <w:tcW w:type="dxa" w:w="1872"/>
-          </w:tcPr>
-          <w:p>
-            <w:r>
-              <w:rPr>
-                <w:sz w:val="18"/>
-              </w:rPr>
-              <w:t>22.3</w:t>
-            </w:r>
-          </w:p>
-        </w:tc>
-        <w:tc>
-          <w:tcPr>
-            <w:tcW w:type="dxa" w:w="1872"/>
-          </w:tcPr>
-          <w:p>
-            <w:r>
-              <w:rPr>
-                <w:sz w:val="18"/>
-              </w:rPr>
-              <w:t>1.0x</w:t>
+            <w:tcW w:type="dxa" w:w="1170"/>
+          </w:tcPr>
+          <w:p>
+            <w:r>
+              <w:rPr>
+                <w:sz w:val="18"/>
+              </w:rPr>
+              <w:t>Miri, Sarawak</w:t>
+            </w:r>
+          </w:p>
+        </w:tc>
+        <w:tc>
+          <w:tcPr>
+            <w:tcW w:type="dxa" w:w="1170"/>
+          </w:tcPr>
+          <w:p>
+            <w:r>
+              <w:rPr>
+                <w:sz w:val="18"/>
+              </w:rPr>
+              <w:t>256k</w:t>
+            </w:r>
+          </w:p>
+        </w:tc>
+        <w:tc>
+          <w:tcPr>
+            <w:tcW w:type="dxa" w:w="1170"/>
+          </w:tcPr>
+          <w:p>
+            <w:r>
+              <w:rPr>
+                <w:sz w:val="18"/>
+              </w:rPr>
+              <w:t>6,449</w:t>
+            </w:r>
+          </w:p>
+        </w:tc>
+        <w:tc>
+          <w:tcPr>
+            <w:tcW w:type="dxa" w:w="1170"/>
+          </w:tcPr>
+          <w:p>
+            <w:r>
+              <w:rPr>
+                <w:sz w:val="18"/>
+              </w:rPr>
+              <w:t>18</w:t>
+            </w:r>
+          </w:p>
+        </w:tc>
+        <w:tc>
+          <w:tcPr>
+            <w:tcW w:type="dxa" w:w="1170"/>
+          </w:tcPr>
+          <w:p>
+            <w:r>
+              <w:rPr>
+                <w:sz w:val="18"/>
+              </w:rPr>
+              <w:t>14</w:t>
+            </w:r>
+          </w:p>
+        </w:tc>
+        <w:tc>
+          <w:tcPr>
+            <w:tcW w:type="dxa" w:w="1170"/>
+          </w:tcPr>
+          <w:p>
+            <w:r>
+              <w:rPr>
+                <w:sz w:val="18"/>
+              </w:rPr>
+              <w:t>0</w:t>
+            </w:r>
+          </w:p>
+        </w:tc>
+        <w:tc>
+          <w:tcPr>
+            <w:tcW w:type="dxa" w:w="1170"/>
+          </w:tcPr>
+          <w:p>
+            <w:r>
+              <w:rPr>
+                <w:sz w:val="18"/>
+              </w:rPr>
+              <w:t>12.5</w:t>
+            </w:r>
+          </w:p>
+        </w:tc>
+        <w:tc>
+          <w:tcPr>
+            <w:tcW w:type="dxa" w:w="1170"/>
+          </w:tcPr>
+          <w:p>
+            <w:r>
+              <w:rPr>
+                <w:sz w:val="18"/>
+              </w:rPr>
+              <w:t>0.56x</w:t>
             </w:r>
           </w:p>
         </w:tc>
@@ -2944,66 +3083,105 @@
       <w:tr>
         <w:tc>
           <w:tcPr>
-            <w:tcW w:type="dxa" w:w="1872"/>
-          </w:tcPr>
-          <w:p>
-            <w:r>
-              <w:rPr>
-                <w:sz w:val="18"/>
-              </w:rPr>
-              <w:t>Kuala Terengganu, Terengganu</w:t>
-            </w:r>
-          </w:p>
-        </w:tc>
-        <w:tc>
-          <w:tcPr>
-            <w:tcW w:type="dxa" w:w="1872"/>
-          </w:tcPr>
-          <w:p>
-            <w:r>
-              <w:rPr>
-                <w:sz w:val="18"/>
-              </w:rPr>
-              <w:t>245k</w:t>
-            </w:r>
-          </w:p>
-        </w:tc>
-        <w:tc>
-          <w:tcPr>
-            <w:tcW w:type="dxa" w:w="1872"/>
-          </w:tcPr>
-          <w:p>
-            <w:r>
-              <w:rPr>
-                <w:sz w:val="18"/>
-              </w:rPr>
-              <w:t>38</w:t>
-            </w:r>
-          </w:p>
-        </w:tc>
-        <w:tc>
-          <w:tcPr>
-            <w:tcW w:type="dxa" w:w="1872"/>
-          </w:tcPr>
-          <w:p>
-            <w:r>
-              <w:rPr>
-                <w:sz w:val="18"/>
-              </w:rPr>
-              <w:t>15.5</w:t>
-            </w:r>
-          </w:p>
-        </w:tc>
-        <w:tc>
-          <w:tcPr>
-            <w:tcW w:type="dxa" w:w="1872"/>
-          </w:tcPr>
-          <w:p>
-            <w:r>
-              <w:rPr>
-                <w:sz w:val="18"/>
-              </w:rPr>
-              <w:t>0.7x</w:t>
+            <w:tcW w:type="dxa" w:w="1170"/>
+          </w:tcPr>
+          <w:p>
+            <w:r>
+              <w:rPr>
+                <w:sz w:val="18"/>
+              </w:rPr>
+              <w:t>Putatan, Sabah</w:t>
+            </w:r>
+          </w:p>
+        </w:tc>
+        <w:tc>
+          <w:tcPr>
+            <w:tcW w:type="dxa" w:w="1170"/>
+          </w:tcPr>
+          <w:p>
+            <w:r>
+              <w:rPr>
+                <w:sz w:val="18"/>
+              </w:rPr>
+              <w:t>71k</w:t>
+            </w:r>
+          </w:p>
+        </w:tc>
+        <w:tc>
+          <w:tcPr>
+            <w:tcW w:type="dxa" w:w="1170"/>
+          </w:tcPr>
+          <w:p>
+            <w:r>
+              <w:rPr>
+                <w:sz w:val="18"/>
+              </w:rPr>
+              <w:t>5,699</w:t>
+            </w:r>
+          </w:p>
+        </w:tc>
+        <w:tc>
+          <w:tcPr>
+            <w:tcW w:type="dxa" w:w="1170"/>
+          </w:tcPr>
+          <w:p>
+            <w:r>
+              <w:rPr>
+                <w:sz w:val="18"/>
+              </w:rPr>
+              <w:t>3</w:t>
+            </w:r>
+          </w:p>
+        </w:tc>
+        <w:tc>
+          <w:tcPr>
+            <w:tcW w:type="dxa" w:w="1170"/>
+          </w:tcPr>
+          <w:p>
+            <w:r>
+              <w:rPr>
+                <w:sz w:val="18"/>
+              </w:rPr>
+              <w:t>10</w:t>
+            </w:r>
+          </w:p>
+        </w:tc>
+        <w:tc>
+          <w:tcPr>
+            <w:tcW w:type="dxa" w:w="1170"/>
+          </w:tcPr>
+          <w:p>
+            <w:r>
+              <w:rPr>
+                <w:sz w:val="18"/>
+              </w:rPr>
+              <w:t>0</w:t>
+            </w:r>
+          </w:p>
+        </w:tc>
+        <w:tc>
+          <w:tcPr>
+            <w:tcW w:type="dxa" w:w="1170"/>
+          </w:tcPr>
+          <w:p>
+            <w:r>
+              <w:rPr>
+                <w:sz w:val="18"/>
+              </w:rPr>
+              <w:t>18.3</w:t>
+            </w:r>
+          </w:p>
+        </w:tc>
+        <w:tc>
+          <w:tcPr>
+            <w:tcW w:type="dxa" w:w="1170"/>
+          </w:tcPr>
+          <w:p>
+            <w:r>
+              <w:rPr>
+                <w:sz w:val="18"/>
+              </w:rPr>
+              <w:t>0.81x</w:t>
             </w:r>
           </w:p>
         </w:tc>
@@ -3011,66 +3189,105 @@
       <w:tr>
         <w:tc>
           <w:tcPr>
-            <w:tcW w:type="dxa" w:w="1872"/>
-          </w:tcPr>
-          <w:p>
-            <w:r>
-              <w:rPr>
-                <w:sz w:val="18"/>
-              </w:rPr>
-              <w:t>Perlis, Perlis</w:t>
-            </w:r>
-          </w:p>
-        </w:tc>
-        <w:tc>
-          <w:tcPr>
-            <w:tcW w:type="dxa" w:w="1872"/>
-          </w:tcPr>
-          <w:p>
-            <w:r>
-              <w:rPr>
-                <w:sz w:val="18"/>
-              </w:rPr>
-              <w:t>297k</w:t>
-            </w:r>
-          </w:p>
-        </w:tc>
-        <w:tc>
-          <w:tcPr>
-            <w:tcW w:type="dxa" w:w="1872"/>
-          </w:tcPr>
-          <w:p>
-            <w:r>
-              <w:rPr>
-                <w:sz w:val="18"/>
-              </w:rPr>
-              <w:t>34</w:t>
-            </w:r>
-          </w:p>
-        </w:tc>
-        <w:tc>
-          <w:tcPr>
-            <w:tcW w:type="dxa" w:w="1872"/>
-          </w:tcPr>
-          <w:p>
-            <w:r>
-              <w:rPr>
-                <w:sz w:val="18"/>
-              </w:rPr>
-              <w:t>11.5</w:t>
-            </w:r>
-          </w:p>
-        </w:tc>
-        <w:tc>
-          <w:tcPr>
-            <w:tcW w:type="dxa" w:w="1872"/>
-          </w:tcPr>
-          <w:p>
-            <w:r>
-              <w:rPr>
-                <w:sz w:val="18"/>
-              </w:rPr>
-              <w:t>0.5x</w:t>
+            <w:tcW w:type="dxa" w:w="1170"/>
+          </w:tcPr>
+          <w:p>
+            <w:r>
+              <w:rPr>
+                <w:sz w:val="18"/>
+              </w:rPr>
+              <w:t>Penampang, Sabah</w:t>
+            </w:r>
+          </w:p>
+        </w:tc>
+        <w:tc>
+          <w:tcPr>
+            <w:tcW w:type="dxa" w:w="1170"/>
+          </w:tcPr>
+          <w:p>
+            <w:r>
+              <w:rPr>
+                <w:sz w:val="18"/>
+              </w:rPr>
+              <w:t>168k</w:t>
+            </w:r>
+          </w:p>
+        </w:tc>
+        <w:tc>
+          <w:tcPr>
+            <w:tcW w:type="dxa" w:w="1170"/>
+          </w:tcPr>
+          <w:p>
+            <w:r>
+              <w:rPr>
+                <w:sz w:val="18"/>
+              </w:rPr>
+              <w:t>6,265</w:t>
+            </w:r>
+          </w:p>
+        </w:tc>
+        <w:tc>
+          <w:tcPr>
+            <w:tcW w:type="dxa" w:w="1170"/>
+          </w:tcPr>
+          <w:p>
+            <w:r>
+              <w:rPr>
+                <w:sz w:val="18"/>
+              </w:rPr>
+              <w:t>9</w:t>
+            </w:r>
+          </w:p>
+        </w:tc>
+        <w:tc>
+          <w:tcPr>
+            <w:tcW w:type="dxa" w:w="1170"/>
+          </w:tcPr>
+          <w:p>
+            <w:r>
+              <w:rPr>
+                <w:sz w:val="18"/>
+              </w:rPr>
+              <w:t>21</w:t>
+            </w:r>
+          </w:p>
+        </w:tc>
+        <w:tc>
+          <w:tcPr>
+            <w:tcW w:type="dxa" w:w="1170"/>
+          </w:tcPr>
+          <w:p>
+            <w:r>
+              <w:rPr>
+                <w:sz w:val="18"/>
+              </w:rPr>
+              <w:t>0</w:t>
+            </w:r>
+          </w:p>
+        </w:tc>
+        <w:tc>
+          <w:tcPr>
+            <w:tcW w:type="dxa" w:w="1170"/>
+          </w:tcPr>
+          <w:p>
+            <w:r>
+              <w:rPr>
+                <w:sz w:val="18"/>
+              </w:rPr>
+              <w:t>17.9</w:t>
+            </w:r>
+          </w:p>
+        </w:tc>
+        <w:tc>
+          <w:tcPr>
+            <w:tcW w:type="dxa" w:w="1170"/>
+          </w:tcPr>
+          <w:p>
+            <w:r>
+              <w:rPr>
+                <w:sz w:val="18"/>
+              </w:rPr>
+              <w:t>0.80x</w:t>
             </w:r>
           </w:p>
         </w:tc>
@@ -3078,66 +3295,105 @@
       <w:tr>
         <w:tc>
           <w:tcPr>
-            <w:tcW w:type="dxa" w:w="1872"/>
-          </w:tcPr>
-          <w:p>
-            <w:r>
-              <w:rPr>
-                <w:sz w:val="18"/>
-              </w:rPr>
-              <w:t>Kulim, Kedah</w:t>
-            </w:r>
-          </w:p>
-        </w:tc>
-        <w:tc>
-          <w:tcPr>
-            <w:tcW w:type="dxa" w:w="1872"/>
-          </w:tcPr>
-          <w:p>
-            <w:r>
-              <w:rPr>
-                <w:sz w:val="18"/>
-              </w:rPr>
-              <w:t>352k</w:t>
-            </w:r>
-          </w:p>
-        </w:tc>
-        <w:tc>
-          <w:tcPr>
-            <w:tcW w:type="dxa" w:w="1872"/>
-          </w:tcPr>
-          <w:p>
-            <w:r>
-              <w:rPr>
-                <w:sz w:val="18"/>
-              </w:rPr>
-              <w:t>53</w:t>
-            </w:r>
-          </w:p>
-        </w:tc>
-        <w:tc>
-          <w:tcPr>
-            <w:tcW w:type="dxa" w:w="1872"/>
-          </w:tcPr>
-          <w:p>
-            <w:r>
-              <w:rPr>
-                <w:sz w:val="18"/>
-              </w:rPr>
-              <w:t>15.0</w:t>
-            </w:r>
-          </w:p>
-        </w:tc>
-        <w:tc>
-          <w:tcPr>
-            <w:tcW w:type="dxa" w:w="1872"/>
-          </w:tcPr>
-          <w:p>
-            <w:r>
-              <w:rPr>
-                <w:sz w:val="18"/>
-              </w:rPr>
-              <w:t>0.7x</w:t>
+            <w:tcW w:type="dxa" w:w="1170"/>
+          </w:tcPr>
+          <w:p>
+            <w:r>
+              <w:rPr>
+                <w:sz w:val="18"/>
+              </w:rPr>
+              <w:t>Keningau, Sabah</w:t>
+            </w:r>
+          </w:p>
+        </w:tc>
+        <w:tc>
+          <w:tcPr>
+            <w:tcW w:type="dxa" w:w="1170"/>
+          </w:tcPr>
+          <w:p>
+            <w:r>
+              <w:rPr>
+                <w:sz w:val="18"/>
+              </w:rPr>
+              <w:t>158k</w:t>
+            </w:r>
+          </w:p>
+        </w:tc>
+        <w:tc>
+          <w:tcPr>
+            <w:tcW w:type="dxa" w:w="1170"/>
+          </w:tcPr>
+          <w:p>
+            <w:r>
+              <w:rPr>
+                <w:sz w:val="18"/>
+              </w:rPr>
+              <w:t>4,502</w:t>
+            </w:r>
+          </w:p>
+        </w:tc>
+        <w:tc>
+          <w:tcPr>
+            <w:tcW w:type="dxa" w:w="1170"/>
+          </w:tcPr>
+          <w:p>
+            <w:r>
+              <w:rPr>
+                <w:sz w:val="18"/>
+              </w:rPr>
+              <w:t>6</w:t>
+            </w:r>
+          </w:p>
+        </w:tc>
+        <w:tc>
+          <w:tcPr>
+            <w:tcW w:type="dxa" w:w="1170"/>
+          </w:tcPr>
+          <w:p>
+            <w:r>
+              <w:rPr>
+                <w:sz w:val="18"/>
+              </w:rPr>
+              <w:t>17</w:t>
+            </w:r>
+          </w:p>
+        </w:tc>
+        <w:tc>
+          <w:tcPr>
+            <w:tcW w:type="dxa" w:w="1170"/>
+          </w:tcPr>
+          <w:p>
+            <w:r>
+              <w:rPr>
+                <w:sz w:val="18"/>
+              </w:rPr>
+              <w:t>0</w:t>
+            </w:r>
+          </w:p>
+        </w:tc>
+        <w:tc>
+          <w:tcPr>
+            <w:tcW w:type="dxa" w:w="1170"/>
+          </w:tcPr>
+          <w:p>
+            <w:r>
+              <w:rPr>
+                <w:sz w:val="18"/>
+              </w:rPr>
+              <w:t>14.6</w:t>
+            </w:r>
+          </w:p>
+        </w:tc>
+        <w:tc>
+          <w:tcPr>
+            <w:tcW w:type="dxa" w:w="1170"/>
+          </w:tcPr>
+          <w:p>
+            <w:r>
+              <w:rPr>
+                <w:sz w:val="18"/>
+              </w:rPr>
+              <w:t>0.65x</w:t>
             </w:r>
           </w:p>
         </w:tc>
@@ -3145,33 +3401,59 @@
       <w:tr>
         <w:tc>
           <w:tcPr>
-            <w:tcW w:type="dxa" w:w="1872"/>
-          </w:tcPr>
-          <w:p>
-            <w:r>
-              <w:rPr>
-                <w:sz w:val="18"/>
-              </w:rPr>
-              <w:t>Dungun, Terengganu</w:t>
-            </w:r>
-          </w:p>
-        </w:tc>
-        <w:tc>
-          <w:tcPr>
-            <w:tcW w:type="dxa" w:w="1872"/>
-          </w:tcPr>
-          <w:p>
-            <w:r>
-              <w:rPr>
-                <w:sz w:val="18"/>
-              </w:rPr>
-              <w:t>168k</w:t>
-            </w:r>
-          </w:p>
-        </w:tc>
-        <w:tc>
-          <w:tcPr>
-            <w:tcW w:type="dxa" w:w="1872"/>
+            <w:tcW w:type="dxa" w:w="1170"/>
+          </w:tcPr>
+          <w:p>
+            <w:r>
+              <w:rPr>
+                <w:sz w:val="18"/>
+              </w:rPr>
+              <w:t>Papar, Sabah</w:t>
+            </w:r>
+          </w:p>
+        </w:tc>
+        <w:tc>
+          <w:tcPr>
+            <w:tcW w:type="dxa" w:w="1170"/>
+          </w:tcPr>
+          <w:p>
+            <w:r>
+              <w:rPr>
+                <w:sz w:val="18"/>
+              </w:rPr>
+              <w:t>156k</w:t>
+            </w:r>
+          </w:p>
+        </w:tc>
+        <w:tc>
+          <w:tcPr>
+            <w:tcW w:type="dxa" w:w="1170"/>
+          </w:tcPr>
+          <w:p>
+            <w:r>
+              <w:rPr>
+                <w:sz w:val="18"/>
+              </w:rPr>
+              <w:t>4,871</w:t>
+            </w:r>
+          </w:p>
+        </w:tc>
+        <w:tc>
+          <w:tcPr>
+            <w:tcW w:type="dxa" w:w="1170"/>
+          </w:tcPr>
+          <w:p>
+            <w:r>
+              <w:rPr>
+                <w:sz w:val="18"/>
+              </w:rPr>
+              <w:t>6</w:t>
+            </w:r>
+          </w:p>
+        </w:tc>
+        <w:tc>
+          <w:tcPr>
+            <w:tcW w:type="dxa" w:w="1170"/>
           </w:tcPr>
           <w:p>
             <w:r>
@@ -3184,27 +3466,40 @@
         </w:tc>
         <w:tc>
           <w:tcPr>
-            <w:tcW w:type="dxa" w:w="1872"/>
-          </w:tcPr>
-          <w:p>
-            <w:r>
-              <w:rPr>
-                <w:sz w:val="18"/>
-              </w:rPr>
-              <w:t>11.9</w:t>
-            </w:r>
-          </w:p>
-        </w:tc>
-        <w:tc>
-          <w:tcPr>
-            <w:tcW w:type="dxa" w:w="1872"/>
-          </w:tcPr>
-          <w:p>
-            <w:r>
-              <w:rPr>
-                <w:sz w:val="18"/>
-              </w:rPr>
-              <w:t>0.5x</w:t>
+            <w:tcW w:type="dxa" w:w="1170"/>
+          </w:tcPr>
+          <w:p>
+            <w:r>
+              <w:rPr>
+                <w:sz w:val="18"/>
+              </w:rPr>
+              <w:t>0</w:t>
+            </w:r>
+          </w:p>
+        </w:tc>
+        <w:tc>
+          <w:tcPr>
+            <w:tcW w:type="dxa" w:w="1170"/>
+          </w:tcPr>
+          <w:p>
+            <w:r>
+              <w:rPr>
+                <w:sz w:val="18"/>
+              </w:rPr>
+              <w:t>16.6</w:t>
+            </w:r>
+          </w:p>
+        </w:tc>
+        <w:tc>
+          <w:tcPr>
+            <w:tcW w:type="dxa" w:w="1170"/>
+          </w:tcPr>
+          <w:p>
+            <w:r>
+              <w:rPr>
+                <w:sz w:val="18"/>
+              </w:rPr>
+              <w:t>0.74x</w:t>
             </w:r>
           </w:p>
         </w:tc>
@@ -3212,133 +3507,105 @@
       <w:tr>
         <w:tc>
           <w:tcPr>
-            <w:tcW w:type="dxa" w:w="1872"/>
-          </w:tcPr>
-          <w:p>
-            <w:r>
-              <w:rPr>
-                <w:sz w:val="18"/>
-              </w:rPr>
-              <w:t>Kemaman, Terengganu</w:t>
-            </w:r>
-          </w:p>
-        </w:tc>
-        <w:tc>
-          <w:tcPr>
-            <w:tcW w:type="dxa" w:w="1872"/>
-          </w:tcPr>
-          <w:p>
-            <w:r>
-              <w:rPr>
-                <w:sz w:val="18"/>
-              </w:rPr>
-              <w:t>232k</w:t>
-            </w:r>
-          </w:p>
-        </w:tc>
-        <w:tc>
-          <w:tcPr>
-            <w:tcW w:type="dxa" w:w="1872"/>
-          </w:tcPr>
-          <w:p>
-            <w:r>
-              <w:rPr>
-                <w:sz w:val="18"/>
-              </w:rPr>
-              <w:t>29</w:t>
-            </w:r>
-          </w:p>
-        </w:tc>
-        <w:tc>
-          <w:tcPr>
-            <w:tcW w:type="dxa" w:w="1872"/>
-          </w:tcPr>
-          <w:p>
-            <w:r>
-              <w:rPr>
-                <w:sz w:val="18"/>
-              </w:rPr>
-              <w:t>12.5</w:t>
-            </w:r>
-          </w:p>
-        </w:tc>
-        <w:tc>
-          <w:tcPr>
-            <w:tcW w:type="dxa" w:w="1872"/>
-          </w:tcPr>
-          <w:p>
-            <w:r>
-              <w:rPr>
-                <w:sz w:val="18"/>
-              </w:rPr>
-              <w:t>0.6x</w:t>
-            </w:r>
-          </w:p>
-        </w:tc>
-      </w:tr>
-      <w:tr>
-        <w:tc>
-          <w:tcPr>
-            <w:tcW w:type="dxa" w:w="1872"/>
-          </w:tcPr>
-          <w:p>
-            <w:r>
-              <w:rPr>
-                <w:sz w:val="18"/>
-              </w:rPr>
-              <w:t>Miri, Sarawak</w:t>
-            </w:r>
-          </w:p>
-        </w:tc>
-        <w:tc>
-          <w:tcPr>
-            <w:tcW w:type="dxa" w:w="1872"/>
-          </w:tcPr>
-          <w:p>
-            <w:r>
-              <w:rPr>
-                <w:sz w:val="18"/>
-              </w:rPr>
-              <w:t>256k</w:t>
-            </w:r>
-          </w:p>
-        </w:tc>
-        <w:tc>
-          <w:tcPr>
-            <w:tcW w:type="dxa" w:w="1872"/>
-          </w:tcPr>
-          <w:p>
-            <w:r>
-              <w:rPr>
-                <w:sz w:val="18"/>
-              </w:rPr>
-              <w:t>32</w:t>
-            </w:r>
-          </w:p>
-        </w:tc>
-        <w:tc>
-          <w:tcPr>
-            <w:tcW w:type="dxa" w:w="1872"/>
-          </w:tcPr>
-          <w:p>
-            <w:r>
-              <w:rPr>
-                <w:sz w:val="18"/>
-              </w:rPr>
-              <w:t>12.5</w:t>
-            </w:r>
-          </w:p>
-        </w:tc>
-        <w:tc>
-          <w:tcPr>
-            <w:tcW w:type="dxa" w:w="1872"/>
-          </w:tcPr>
-          <w:p>
-            <w:r>
-              <w:rPr>
-                <w:sz w:val="18"/>
-              </w:rPr>
-              <w:t>0.6x</w:t>
+            <w:tcW w:type="dxa" w:w="1170"/>
+          </w:tcPr>
+          <w:p>
+            <w:r>
+              <w:rPr>
+                <w:sz w:val="18"/>
+              </w:rPr>
+              <w:t>Tuaran, Sabah</w:t>
+            </w:r>
+          </w:p>
+        </w:tc>
+        <w:tc>
+          <w:tcPr>
+            <w:tcW w:type="dxa" w:w="1170"/>
+          </w:tcPr>
+          <w:p>
+            <w:r>
+              <w:rPr>
+                <w:sz w:val="18"/>
+              </w:rPr>
+              <w:t>142k</w:t>
+            </w:r>
+          </w:p>
+        </w:tc>
+        <w:tc>
+          <w:tcPr>
+            <w:tcW w:type="dxa" w:w="1170"/>
+          </w:tcPr>
+          <w:p>
+            <w:r>
+              <w:rPr>
+                <w:sz w:val="18"/>
+              </w:rPr>
+              <w:t>3,921</w:t>
+            </w:r>
+          </w:p>
+        </w:tc>
+        <w:tc>
+          <w:tcPr>
+            <w:tcW w:type="dxa" w:w="1170"/>
+          </w:tcPr>
+          <w:p>
+            <w:r>
+              <w:rPr>
+                <w:sz w:val="18"/>
+              </w:rPr>
+              <w:t>3</w:t>
+            </w:r>
+          </w:p>
+        </w:tc>
+        <w:tc>
+          <w:tcPr>
+            <w:tcW w:type="dxa" w:w="1170"/>
+          </w:tcPr>
+          <w:p>
+            <w:r>
+              <w:rPr>
+                <w:sz w:val="18"/>
+              </w:rPr>
+              <w:t>23</w:t>
+            </w:r>
+          </w:p>
+        </w:tc>
+        <w:tc>
+          <w:tcPr>
+            <w:tcW w:type="dxa" w:w="1170"/>
+          </w:tcPr>
+          <w:p>
+            <w:r>
+              <w:rPr>
+                <w:sz w:val="18"/>
+              </w:rPr>
+              <w:t>0</w:t>
+            </w:r>
+          </w:p>
+        </w:tc>
+        <w:tc>
+          <w:tcPr>
+            <w:tcW w:type="dxa" w:w="1170"/>
+          </w:tcPr>
+          <w:p>
+            <w:r>
+              <w:rPr>
+                <w:sz w:val="18"/>
+              </w:rPr>
+              <w:t>18.3</w:t>
+            </w:r>
+          </w:p>
+        </w:tc>
+        <w:tc>
+          <w:tcPr>
+            <w:tcW w:type="dxa" w:w="1170"/>
+          </w:tcPr>
+          <w:p>
+            <w:r>
+              <w:rPr>
+                <w:sz w:val="18"/>
+              </w:rPr>
+              <w:t>0.81x</w:t>
             </w:r>
           </w:p>
         </w:tc>
@@ -3347,9 +3614,1313 @@
     <w:p/>
     <w:p>
       <w:r>
-        <w:t>These are arguably the lowest-risk expansion targets: competitors have already validated consumer demand, yet total density remains below the national rate, and KKmart is the missing brand. Kota Kinabalu stands out — 547k people, 96 competitor outlets, zero KKmart stores.</w:t>
+        <w:rPr>
+          <w:b/>
+        </w:rPr>
+        <w:t xml:space="preserve">West Malaysia — the Northern cluster and East Coast towns. </w:t>
+      </w:r>
+      <w:r>
+        <w:t>Five of the eleven Peninsular districts sit in the guided Northern corridor: Kota Setar / Alor Setar (85 competitor outlets, nearly at par yet zero KKmart), Kulim, Kubang Pasu and Perlis, plus Larut dan Matang (Taiping) in Perak. These adjoin the Penang expansion corridor and could share its distribution (see section 4.3). The remainder are East Coast towns, including the higher-income oil-and-gas centres Kemaman (RM 6,425 median) and Dungun (RM 6,356). Kuala Terengganu is a special case: 33 of its 38 competitor outlets are 7-Eleven and 99 Speedmart has no store there, so the value-grocery position KKmart competes for is effectively uncontested.</w:t>
       </w:r>
     </w:p>
+    <w:tbl>
+      <w:tblPr>
+        <w:tblStyle w:val="LightGrid-Accent1"/>
+        <w:tblW w:type="auto" w:w="0"/>
+        <w:tblLook w:firstColumn="1" w:firstRow="1" w:lastColumn="0" w:lastRow="0" w:noHBand="0" w:noVBand="1" w:val="04A0"/>
+      </w:tblPr>
+      <w:tblGrid>
+        <w:gridCol w:w="1170"/>
+        <w:gridCol w:w="1170"/>
+        <w:gridCol w:w="1170"/>
+        <w:gridCol w:w="1170"/>
+        <w:gridCol w:w="1170"/>
+        <w:gridCol w:w="1170"/>
+        <w:gridCol w:w="1170"/>
+        <w:gridCol w:w="1170"/>
+      </w:tblGrid>
+      <w:tr>
+        <w:tc>
+          <w:tcPr>
+            <w:tcW w:type="dxa" w:w="1170"/>
+          </w:tcPr>
+          <w:p>
+            <w:r>
+              <w:rPr>
+                <w:b/>
+                <w:sz w:val="18"/>
+              </w:rPr>
+              <w:t>District</w:t>
+            </w:r>
+          </w:p>
+        </w:tc>
+        <w:tc>
+          <w:tcPr>
+            <w:tcW w:type="dxa" w:w="1170"/>
+          </w:tcPr>
+          <w:p>
+            <w:r>
+              <w:rPr>
+                <w:b/>
+                <w:sz w:val="18"/>
+              </w:rPr>
+              <w:t>Population</w:t>
+            </w:r>
+          </w:p>
+        </w:tc>
+        <w:tc>
+          <w:tcPr>
+            <w:tcW w:type="dxa" w:w="1170"/>
+          </w:tcPr>
+          <w:p>
+            <w:r>
+              <w:rPr>
+                <w:b/>
+                <w:sz w:val="18"/>
+              </w:rPr>
+              <w:t>Median income (RM)</w:t>
+            </w:r>
+          </w:p>
+        </w:tc>
+        <w:tc>
+          <w:tcPr>
+            <w:tcW w:type="dxa" w:w="1170"/>
+          </w:tcPr>
+          <w:p>
+            <w:r>
+              <w:rPr>
+                <w:b/>
+                <w:sz w:val="18"/>
+              </w:rPr>
+              <w:t>7-Eleven</w:t>
+            </w:r>
+          </w:p>
+        </w:tc>
+        <w:tc>
+          <w:tcPr>
+            <w:tcW w:type="dxa" w:w="1170"/>
+          </w:tcPr>
+          <w:p>
+            <w:r>
+              <w:rPr>
+                <w:b/>
+                <w:sz w:val="18"/>
+              </w:rPr>
+              <w:t>99 Speedmart</w:t>
+            </w:r>
+          </w:p>
+        </w:tc>
+        <w:tc>
+          <w:tcPr>
+            <w:tcW w:type="dxa" w:w="1170"/>
+          </w:tcPr>
+          <w:p>
+            <w:r>
+              <w:rPr>
+                <w:b/>
+                <w:sz w:val="18"/>
+              </w:rPr>
+              <w:t>FamilyMart+myNEWS</w:t>
+            </w:r>
+          </w:p>
+        </w:tc>
+        <w:tc>
+          <w:tcPr>
+            <w:tcW w:type="dxa" w:w="1170"/>
+          </w:tcPr>
+          <w:p>
+            <w:r>
+              <w:rPr>
+                <w:b/>
+                <w:sz w:val="18"/>
+              </w:rPr>
+              <w:t>Stores/100k</w:t>
+            </w:r>
+          </w:p>
+        </w:tc>
+        <w:tc>
+          <w:tcPr>
+            <w:tcW w:type="dxa" w:w="1170"/>
+          </w:tcPr>
+          <w:p>
+            <w:r>
+              <w:rPr>
+                <w:b/>
+                <w:sz w:val="18"/>
+              </w:rPr>
+              <w:t>vs national</w:t>
+            </w:r>
+          </w:p>
+        </w:tc>
+      </w:tr>
+      <w:tr>
+        <w:tc>
+          <w:tcPr>
+            <w:tcW w:type="dxa" w:w="1170"/>
+          </w:tcPr>
+          <w:p>
+            <w:r>
+              <w:rPr>
+                <w:sz w:val="18"/>
+              </w:rPr>
+              <w:t>Kota Setar, Kedah</w:t>
+            </w:r>
+          </w:p>
+        </w:tc>
+        <w:tc>
+          <w:tcPr>
+            <w:tcW w:type="dxa" w:w="1170"/>
+          </w:tcPr>
+          <w:p>
+            <w:r>
+              <w:rPr>
+                <w:sz w:val="18"/>
+              </w:rPr>
+              <w:t>382k</w:t>
+            </w:r>
+          </w:p>
+        </w:tc>
+        <w:tc>
+          <w:tcPr>
+            <w:tcW w:type="dxa" w:w="1170"/>
+          </w:tcPr>
+          <w:p>
+            <w:r>
+              <w:rPr>
+                <w:sz w:val="18"/>
+              </w:rPr>
+              <w:t>4,751</w:t>
+            </w:r>
+          </w:p>
+        </w:tc>
+        <w:tc>
+          <w:tcPr>
+            <w:tcW w:type="dxa" w:w="1170"/>
+          </w:tcPr>
+          <w:p>
+            <w:r>
+              <w:rPr>
+                <w:sz w:val="18"/>
+              </w:rPr>
+              <w:t>36</w:t>
+            </w:r>
+          </w:p>
+        </w:tc>
+        <w:tc>
+          <w:tcPr>
+            <w:tcW w:type="dxa" w:w="1170"/>
+          </w:tcPr>
+          <w:p>
+            <w:r>
+              <w:rPr>
+                <w:sz w:val="18"/>
+              </w:rPr>
+              <w:t>40</w:t>
+            </w:r>
+          </w:p>
+        </w:tc>
+        <w:tc>
+          <w:tcPr>
+            <w:tcW w:type="dxa" w:w="1170"/>
+          </w:tcPr>
+          <w:p>
+            <w:r>
+              <w:rPr>
+                <w:sz w:val="18"/>
+              </w:rPr>
+              <w:t>9</w:t>
+            </w:r>
+          </w:p>
+        </w:tc>
+        <w:tc>
+          <w:tcPr>
+            <w:tcW w:type="dxa" w:w="1170"/>
+          </w:tcPr>
+          <w:p>
+            <w:r>
+              <w:rPr>
+                <w:sz w:val="18"/>
+              </w:rPr>
+              <w:t>22.3</w:t>
+            </w:r>
+          </w:p>
+        </w:tc>
+        <w:tc>
+          <w:tcPr>
+            <w:tcW w:type="dxa" w:w="1170"/>
+          </w:tcPr>
+          <w:p>
+            <w:r>
+              <w:rPr>
+                <w:sz w:val="18"/>
+              </w:rPr>
+              <w:t>0.99x</w:t>
+            </w:r>
+          </w:p>
+        </w:tc>
+      </w:tr>
+      <w:tr>
+        <w:tc>
+          <w:tcPr>
+            <w:tcW w:type="dxa" w:w="1170"/>
+          </w:tcPr>
+          <w:p>
+            <w:r>
+              <w:rPr>
+                <w:sz w:val="18"/>
+              </w:rPr>
+              <w:t>Kuala Terengganu, Terengganu</w:t>
+            </w:r>
+          </w:p>
+        </w:tc>
+        <w:tc>
+          <w:tcPr>
+            <w:tcW w:type="dxa" w:w="1170"/>
+          </w:tcPr>
+          <w:p>
+            <w:r>
+              <w:rPr>
+                <w:sz w:val="18"/>
+              </w:rPr>
+              <w:t>245k</w:t>
+            </w:r>
+          </w:p>
+        </w:tc>
+        <w:tc>
+          <w:tcPr>
+            <w:tcW w:type="dxa" w:w="1170"/>
+          </w:tcPr>
+          <w:p>
+            <w:r>
+              <w:rPr>
+                <w:sz w:val="18"/>
+              </w:rPr>
+              <w:t>5,872</w:t>
+            </w:r>
+          </w:p>
+        </w:tc>
+        <w:tc>
+          <w:tcPr>
+            <w:tcW w:type="dxa" w:w="1170"/>
+          </w:tcPr>
+          <w:p>
+            <w:r>
+              <w:rPr>
+                <w:sz w:val="18"/>
+              </w:rPr>
+              <w:t>33</w:t>
+            </w:r>
+          </w:p>
+        </w:tc>
+        <w:tc>
+          <w:tcPr>
+            <w:tcW w:type="dxa" w:w="1170"/>
+          </w:tcPr>
+          <w:p>
+            <w:r>
+              <w:rPr>
+                <w:sz w:val="18"/>
+              </w:rPr>
+              <w:t>0</w:t>
+            </w:r>
+          </w:p>
+        </w:tc>
+        <w:tc>
+          <w:tcPr>
+            <w:tcW w:type="dxa" w:w="1170"/>
+          </w:tcPr>
+          <w:p>
+            <w:r>
+              <w:rPr>
+                <w:sz w:val="18"/>
+              </w:rPr>
+              <w:t>5</w:t>
+            </w:r>
+          </w:p>
+        </w:tc>
+        <w:tc>
+          <w:tcPr>
+            <w:tcW w:type="dxa" w:w="1170"/>
+          </w:tcPr>
+          <w:p>
+            <w:r>
+              <w:rPr>
+                <w:sz w:val="18"/>
+              </w:rPr>
+              <w:t>15.5</w:t>
+            </w:r>
+          </w:p>
+        </w:tc>
+        <w:tc>
+          <w:tcPr>
+            <w:tcW w:type="dxa" w:w="1170"/>
+          </w:tcPr>
+          <w:p>
+            <w:r>
+              <w:rPr>
+                <w:sz w:val="18"/>
+              </w:rPr>
+              <w:t>0.69x</w:t>
+            </w:r>
+          </w:p>
+        </w:tc>
+      </w:tr>
+      <w:tr>
+        <w:tc>
+          <w:tcPr>
+            <w:tcW w:type="dxa" w:w="1170"/>
+          </w:tcPr>
+          <w:p>
+            <w:r>
+              <w:rPr>
+                <w:sz w:val="18"/>
+              </w:rPr>
+              <w:t>Perlis, Perlis</w:t>
+            </w:r>
+          </w:p>
+        </w:tc>
+        <w:tc>
+          <w:tcPr>
+            <w:tcW w:type="dxa" w:w="1170"/>
+          </w:tcPr>
+          <w:p>
+            <w:r>
+              <w:rPr>
+                <w:sz w:val="18"/>
+              </w:rPr>
+              <w:t>297k</w:t>
+            </w:r>
+          </w:p>
+        </w:tc>
+        <w:tc>
+          <w:tcPr>
+            <w:tcW w:type="dxa" w:w="1170"/>
+          </w:tcPr>
+          <w:p>
+            <w:r>
+              <w:rPr>
+                <w:sz w:val="18"/>
+              </w:rPr>
+              <w:t>4,713</w:t>
+            </w:r>
+          </w:p>
+        </w:tc>
+        <w:tc>
+          <w:tcPr>
+            <w:tcW w:type="dxa" w:w="1170"/>
+          </w:tcPr>
+          <w:p>
+            <w:r>
+              <w:rPr>
+                <w:sz w:val="18"/>
+              </w:rPr>
+              <w:t>18</w:t>
+            </w:r>
+          </w:p>
+        </w:tc>
+        <w:tc>
+          <w:tcPr>
+            <w:tcW w:type="dxa" w:w="1170"/>
+          </w:tcPr>
+          <w:p>
+            <w:r>
+              <w:rPr>
+                <w:sz w:val="18"/>
+              </w:rPr>
+              <w:t>14</w:t>
+            </w:r>
+          </w:p>
+        </w:tc>
+        <w:tc>
+          <w:tcPr>
+            <w:tcW w:type="dxa" w:w="1170"/>
+          </w:tcPr>
+          <w:p>
+            <w:r>
+              <w:rPr>
+                <w:sz w:val="18"/>
+              </w:rPr>
+              <w:t>2</w:t>
+            </w:r>
+          </w:p>
+        </w:tc>
+        <w:tc>
+          <w:tcPr>
+            <w:tcW w:type="dxa" w:w="1170"/>
+          </w:tcPr>
+          <w:p>
+            <w:r>
+              <w:rPr>
+                <w:sz w:val="18"/>
+              </w:rPr>
+              <w:t>11.5</w:t>
+            </w:r>
+          </w:p>
+        </w:tc>
+        <w:tc>
+          <w:tcPr>
+            <w:tcW w:type="dxa" w:w="1170"/>
+          </w:tcPr>
+          <w:p>
+            <w:r>
+              <w:rPr>
+                <w:sz w:val="18"/>
+              </w:rPr>
+              <w:t>0.51x</w:t>
+            </w:r>
+          </w:p>
+        </w:tc>
+      </w:tr>
+      <w:tr>
+        <w:tc>
+          <w:tcPr>
+            <w:tcW w:type="dxa" w:w="1170"/>
+          </w:tcPr>
+          <w:p>
+            <w:r>
+              <w:rPr>
+                <w:sz w:val="18"/>
+              </w:rPr>
+              <w:t>Kulim, Kedah</w:t>
+            </w:r>
+          </w:p>
+        </w:tc>
+        <w:tc>
+          <w:tcPr>
+            <w:tcW w:type="dxa" w:w="1170"/>
+          </w:tcPr>
+          <w:p>
+            <w:r>
+              <w:rPr>
+                <w:sz w:val="18"/>
+              </w:rPr>
+              <w:t>352k</w:t>
+            </w:r>
+          </w:p>
+        </w:tc>
+        <w:tc>
+          <w:tcPr>
+            <w:tcW w:type="dxa" w:w="1170"/>
+          </w:tcPr>
+          <w:p>
+            <w:r>
+              <w:rPr>
+                <w:sz w:val="18"/>
+              </w:rPr>
+              <w:t>4,498</w:t>
+            </w:r>
+          </w:p>
+        </w:tc>
+        <w:tc>
+          <w:tcPr>
+            <w:tcW w:type="dxa" w:w="1170"/>
+          </w:tcPr>
+          <w:p>
+            <w:r>
+              <w:rPr>
+                <w:sz w:val="18"/>
+              </w:rPr>
+              <w:t>11</w:t>
+            </w:r>
+          </w:p>
+        </w:tc>
+        <w:tc>
+          <w:tcPr>
+            <w:tcW w:type="dxa" w:w="1170"/>
+          </w:tcPr>
+          <w:p>
+            <w:r>
+              <w:rPr>
+                <w:sz w:val="18"/>
+              </w:rPr>
+              <w:t>38</w:t>
+            </w:r>
+          </w:p>
+        </w:tc>
+        <w:tc>
+          <w:tcPr>
+            <w:tcW w:type="dxa" w:w="1170"/>
+          </w:tcPr>
+          <w:p>
+            <w:r>
+              <w:rPr>
+                <w:sz w:val="18"/>
+              </w:rPr>
+              <w:t>4</w:t>
+            </w:r>
+          </w:p>
+        </w:tc>
+        <w:tc>
+          <w:tcPr>
+            <w:tcW w:type="dxa" w:w="1170"/>
+          </w:tcPr>
+          <w:p>
+            <w:r>
+              <w:rPr>
+                <w:sz w:val="18"/>
+              </w:rPr>
+              <w:t>15.0</w:t>
+            </w:r>
+          </w:p>
+        </w:tc>
+        <w:tc>
+          <w:tcPr>
+            <w:tcW w:type="dxa" w:w="1170"/>
+          </w:tcPr>
+          <w:p>
+            <w:r>
+              <w:rPr>
+                <w:sz w:val="18"/>
+              </w:rPr>
+              <w:t>0.67x</w:t>
+            </w:r>
+          </w:p>
+        </w:tc>
+      </w:tr>
+      <w:tr>
+        <w:tc>
+          <w:tcPr>
+            <w:tcW w:type="dxa" w:w="1170"/>
+          </w:tcPr>
+          <w:p>
+            <w:r>
+              <w:rPr>
+                <w:sz w:val="18"/>
+              </w:rPr>
+              <w:t>Dungun, Terengganu</w:t>
+            </w:r>
+          </w:p>
+        </w:tc>
+        <w:tc>
+          <w:tcPr>
+            <w:tcW w:type="dxa" w:w="1170"/>
+          </w:tcPr>
+          <w:p>
+            <w:r>
+              <w:rPr>
+                <w:sz w:val="18"/>
+              </w:rPr>
+              <w:t>168k</w:t>
+            </w:r>
+          </w:p>
+        </w:tc>
+        <w:tc>
+          <w:tcPr>
+            <w:tcW w:type="dxa" w:w="1170"/>
+          </w:tcPr>
+          <w:p>
+            <w:r>
+              <w:rPr>
+                <w:sz w:val="18"/>
+              </w:rPr>
+              <w:t>6,356</w:t>
+            </w:r>
+          </w:p>
+        </w:tc>
+        <w:tc>
+          <w:tcPr>
+            <w:tcW w:type="dxa" w:w="1170"/>
+          </w:tcPr>
+          <w:p>
+            <w:r>
+              <w:rPr>
+                <w:sz w:val="18"/>
+              </w:rPr>
+              <w:t>15</w:t>
+            </w:r>
+          </w:p>
+        </w:tc>
+        <w:tc>
+          <w:tcPr>
+            <w:tcW w:type="dxa" w:w="1170"/>
+          </w:tcPr>
+          <w:p>
+            <w:r>
+              <w:rPr>
+                <w:sz w:val="18"/>
+              </w:rPr>
+              <w:t>4</w:t>
+            </w:r>
+          </w:p>
+        </w:tc>
+        <w:tc>
+          <w:tcPr>
+            <w:tcW w:type="dxa" w:w="1170"/>
+          </w:tcPr>
+          <w:p>
+            <w:r>
+              <w:rPr>
+                <w:sz w:val="18"/>
+              </w:rPr>
+              <w:t>1</w:t>
+            </w:r>
+          </w:p>
+        </w:tc>
+        <w:tc>
+          <w:tcPr>
+            <w:tcW w:type="dxa" w:w="1170"/>
+          </w:tcPr>
+          <w:p>
+            <w:r>
+              <w:rPr>
+                <w:sz w:val="18"/>
+              </w:rPr>
+              <w:t>11.9</w:t>
+            </w:r>
+          </w:p>
+        </w:tc>
+        <w:tc>
+          <w:tcPr>
+            <w:tcW w:type="dxa" w:w="1170"/>
+          </w:tcPr>
+          <w:p>
+            <w:r>
+              <w:rPr>
+                <w:sz w:val="18"/>
+              </w:rPr>
+              <w:t>0.53x</w:t>
+            </w:r>
+          </w:p>
+        </w:tc>
+      </w:tr>
+      <w:tr>
+        <w:tc>
+          <w:tcPr>
+            <w:tcW w:type="dxa" w:w="1170"/>
+          </w:tcPr>
+          <w:p>
+            <w:r>
+              <w:rPr>
+                <w:sz w:val="18"/>
+              </w:rPr>
+              <w:t>Kemaman, Terengganu</w:t>
+            </w:r>
+          </w:p>
+        </w:tc>
+        <w:tc>
+          <w:tcPr>
+            <w:tcW w:type="dxa" w:w="1170"/>
+          </w:tcPr>
+          <w:p>
+            <w:r>
+              <w:rPr>
+                <w:sz w:val="18"/>
+              </w:rPr>
+              <w:t>232k</w:t>
+            </w:r>
+          </w:p>
+        </w:tc>
+        <w:tc>
+          <w:tcPr>
+            <w:tcW w:type="dxa" w:w="1170"/>
+          </w:tcPr>
+          <w:p>
+            <w:r>
+              <w:rPr>
+                <w:sz w:val="18"/>
+              </w:rPr>
+              <w:t>6,425</w:t>
+            </w:r>
+          </w:p>
+        </w:tc>
+        <w:tc>
+          <w:tcPr>
+            <w:tcW w:type="dxa" w:w="1170"/>
+          </w:tcPr>
+          <w:p>
+            <w:r>
+              <w:rPr>
+                <w:sz w:val="18"/>
+              </w:rPr>
+              <w:t>19</w:t>
+            </w:r>
+          </w:p>
+        </w:tc>
+        <w:tc>
+          <w:tcPr>
+            <w:tcW w:type="dxa" w:w="1170"/>
+          </w:tcPr>
+          <w:p>
+            <w:r>
+              <w:rPr>
+                <w:sz w:val="18"/>
+              </w:rPr>
+              <w:t>9</w:t>
+            </w:r>
+          </w:p>
+        </w:tc>
+        <w:tc>
+          <w:tcPr>
+            <w:tcW w:type="dxa" w:w="1170"/>
+          </w:tcPr>
+          <w:p>
+            <w:r>
+              <w:rPr>
+                <w:sz w:val="18"/>
+              </w:rPr>
+              <w:t>1</w:t>
+            </w:r>
+          </w:p>
+        </w:tc>
+        <w:tc>
+          <w:tcPr>
+            <w:tcW w:type="dxa" w:w="1170"/>
+          </w:tcPr>
+          <w:p>
+            <w:r>
+              <w:rPr>
+                <w:sz w:val="18"/>
+              </w:rPr>
+              <w:t>12.5</w:t>
+            </w:r>
+          </w:p>
+        </w:tc>
+        <w:tc>
+          <w:tcPr>
+            <w:tcW w:type="dxa" w:w="1170"/>
+          </w:tcPr>
+          <w:p>
+            <w:r>
+              <w:rPr>
+                <w:sz w:val="18"/>
+              </w:rPr>
+              <w:t>0.56x</w:t>
+            </w:r>
+          </w:p>
+        </w:tc>
+      </w:tr>
+      <w:tr>
+        <w:tc>
+          <w:tcPr>
+            <w:tcW w:type="dxa" w:w="1170"/>
+          </w:tcPr>
+          <w:p>
+            <w:r>
+              <w:rPr>
+                <w:sz w:val="18"/>
+              </w:rPr>
+              <w:t>Kubang Pasu, Kedah</w:t>
+            </w:r>
+          </w:p>
+        </w:tc>
+        <w:tc>
+          <w:tcPr>
+            <w:tcW w:type="dxa" w:w="1170"/>
+          </w:tcPr>
+          <w:p>
+            <w:r>
+              <w:rPr>
+                <w:sz w:val="18"/>
+              </w:rPr>
+              <w:t>253k</w:t>
+            </w:r>
+          </w:p>
+        </w:tc>
+        <w:tc>
+          <w:tcPr>
+            <w:tcW w:type="dxa" w:w="1170"/>
+          </w:tcPr>
+          <w:p>
+            <w:r>
+              <w:rPr>
+                <w:sz w:val="18"/>
+              </w:rPr>
+              <w:t>5,201</w:t>
+            </w:r>
+          </w:p>
+        </w:tc>
+        <w:tc>
+          <w:tcPr>
+            <w:tcW w:type="dxa" w:w="1170"/>
+          </w:tcPr>
+          <w:p>
+            <w:r>
+              <w:rPr>
+                <w:sz w:val="18"/>
+              </w:rPr>
+              <w:t>12</w:t>
+            </w:r>
+          </w:p>
+        </w:tc>
+        <w:tc>
+          <w:tcPr>
+            <w:tcW w:type="dxa" w:w="1170"/>
+          </w:tcPr>
+          <w:p>
+            <w:r>
+              <w:rPr>
+                <w:sz w:val="18"/>
+              </w:rPr>
+              <w:t>28</w:t>
+            </w:r>
+          </w:p>
+        </w:tc>
+        <w:tc>
+          <w:tcPr>
+            <w:tcW w:type="dxa" w:w="1170"/>
+          </w:tcPr>
+          <w:p>
+            <w:r>
+              <w:rPr>
+                <w:sz w:val="18"/>
+              </w:rPr>
+              <w:t>4</w:t>
+            </w:r>
+          </w:p>
+        </w:tc>
+        <w:tc>
+          <w:tcPr>
+            <w:tcW w:type="dxa" w:w="1170"/>
+          </w:tcPr>
+          <w:p>
+            <w:r>
+              <w:rPr>
+                <w:sz w:val="18"/>
+              </w:rPr>
+              <w:t>17.4</w:t>
+            </w:r>
+          </w:p>
+        </w:tc>
+        <w:tc>
+          <w:tcPr>
+            <w:tcW w:type="dxa" w:w="1170"/>
+          </w:tcPr>
+          <w:p>
+            <w:r>
+              <w:rPr>
+                <w:sz w:val="18"/>
+              </w:rPr>
+              <w:t>0.77x</w:t>
+            </w:r>
+          </w:p>
+        </w:tc>
+      </w:tr>
+      <w:tr>
+        <w:tc>
+          <w:tcPr>
+            <w:tcW w:type="dxa" w:w="1170"/>
+          </w:tcPr>
+          <w:p>
+            <w:r>
+              <w:rPr>
+                <w:sz w:val="18"/>
+              </w:rPr>
+              <w:t>Larut Dan Matang, Perak</w:t>
+            </w:r>
+          </w:p>
+        </w:tc>
+        <w:tc>
+          <w:tcPr>
+            <w:tcW w:type="dxa" w:w="1170"/>
+          </w:tcPr>
+          <w:p>
+            <w:r>
+              <w:rPr>
+                <w:sz w:val="18"/>
+              </w:rPr>
+              <w:t>278k</w:t>
+            </w:r>
+          </w:p>
+        </w:tc>
+        <w:tc>
+          <w:tcPr>
+            <w:tcW w:type="dxa" w:w="1170"/>
+          </w:tcPr>
+          <w:p>
+            <w:r>
+              <w:rPr>
+                <w:sz w:val="18"/>
+              </w:rPr>
+              <w:t>4,029</w:t>
+            </w:r>
+          </w:p>
+        </w:tc>
+        <w:tc>
+          <w:tcPr>
+            <w:tcW w:type="dxa" w:w="1170"/>
+          </w:tcPr>
+          <w:p>
+            <w:r>
+              <w:rPr>
+                <w:sz w:val="18"/>
+              </w:rPr>
+              <w:t>22</w:t>
+            </w:r>
+          </w:p>
+        </w:tc>
+        <w:tc>
+          <w:tcPr>
+            <w:tcW w:type="dxa" w:w="1170"/>
+          </w:tcPr>
+          <w:p>
+            <w:r>
+              <w:rPr>
+                <w:sz w:val="18"/>
+              </w:rPr>
+              <w:t>41</w:t>
+            </w:r>
+          </w:p>
+        </w:tc>
+        <w:tc>
+          <w:tcPr>
+            <w:tcW w:type="dxa" w:w="1170"/>
+          </w:tcPr>
+          <w:p>
+            <w:r>
+              <w:rPr>
+                <w:sz w:val="18"/>
+              </w:rPr>
+              <w:t>4</w:t>
+            </w:r>
+          </w:p>
+        </w:tc>
+        <w:tc>
+          <w:tcPr>
+            <w:tcW w:type="dxa" w:w="1170"/>
+          </w:tcPr>
+          <w:p>
+            <w:r>
+              <w:rPr>
+                <w:sz w:val="18"/>
+              </w:rPr>
+              <w:t>24.1</w:t>
+            </w:r>
+          </w:p>
+        </w:tc>
+        <w:tc>
+          <w:tcPr>
+            <w:tcW w:type="dxa" w:w="1170"/>
+          </w:tcPr>
+          <w:p>
+            <w:r>
+              <w:rPr>
+                <w:sz w:val="18"/>
+              </w:rPr>
+              <w:t>1.07x</w:t>
+            </w:r>
+          </w:p>
+        </w:tc>
+      </w:tr>
+      <w:tr>
+        <w:tc>
+          <w:tcPr>
+            <w:tcW w:type="dxa" w:w="1170"/>
+          </w:tcPr>
+          <w:p>
+            <w:r>
+              <w:rPr>
+                <w:sz w:val="18"/>
+              </w:rPr>
+              <w:t>Lipis, Pahang</w:t>
+            </w:r>
+          </w:p>
+        </w:tc>
+        <w:tc>
+          <w:tcPr>
+            <w:tcW w:type="dxa" w:w="1170"/>
+          </w:tcPr>
+          <w:p>
+            <w:r>
+              <w:rPr>
+                <w:sz w:val="18"/>
+              </w:rPr>
+              <w:t>102k</w:t>
+            </w:r>
+          </w:p>
+        </w:tc>
+        <w:tc>
+          <w:tcPr>
+            <w:tcW w:type="dxa" w:w="1170"/>
+          </w:tcPr>
+          <w:p>
+            <w:r>
+              <w:rPr>
+                <w:sz w:val="18"/>
+              </w:rPr>
+              <w:t>4,115</w:t>
+            </w:r>
+          </w:p>
+        </w:tc>
+        <w:tc>
+          <w:tcPr>
+            <w:tcW w:type="dxa" w:w="1170"/>
+          </w:tcPr>
+          <w:p>
+            <w:r>
+              <w:rPr>
+                <w:sz w:val="18"/>
+              </w:rPr>
+              <w:t>4</w:t>
+            </w:r>
+          </w:p>
+        </w:tc>
+        <w:tc>
+          <w:tcPr>
+            <w:tcW w:type="dxa" w:w="1170"/>
+          </w:tcPr>
+          <w:p>
+            <w:r>
+              <w:rPr>
+                <w:sz w:val="18"/>
+              </w:rPr>
+              <w:t>7</w:t>
+            </w:r>
+          </w:p>
+        </w:tc>
+        <w:tc>
+          <w:tcPr>
+            <w:tcW w:type="dxa" w:w="1170"/>
+          </w:tcPr>
+          <w:p>
+            <w:r>
+              <w:rPr>
+                <w:sz w:val="18"/>
+              </w:rPr>
+              <w:t>1</w:t>
+            </w:r>
+          </w:p>
+        </w:tc>
+        <w:tc>
+          <w:tcPr>
+            <w:tcW w:type="dxa" w:w="1170"/>
+          </w:tcPr>
+          <w:p>
+            <w:r>
+              <w:rPr>
+                <w:sz w:val="18"/>
+              </w:rPr>
+              <w:t>11.7</w:t>
+            </w:r>
+          </w:p>
+        </w:tc>
+        <w:tc>
+          <w:tcPr>
+            <w:tcW w:type="dxa" w:w="1170"/>
+          </w:tcPr>
+          <w:p>
+            <w:r>
+              <w:rPr>
+                <w:sz w:val="18"/>
+              </w:rPr>
+              <w:t>0.52x</w:t>
+            </w:r>
+          </w:p>
+        </w:tc>
+      </w:tr>
+      <w:tr>
+        <w:tc>
+          <w:tcPr>
+            <w:tcW w:type="dxa" w:w="1170"/>
+          </w:tcPr>
+          <w:p>
+            <w:r>
+              <w:rPr>
+                <w:sz w:val="18"/>
+              </w:rPr>
+              <w:t>Mersing, Johor</w:t>
+            </w:r>
+          </w:p>
+        </w:tc>
+        <w:tc>
+          <w:tcPr>
+            <w:tcW w:type="dxa" w:w="1170"/>
+          </w:tcPr>
+          <w:p>
+            <w:r>
+              <w:rPr>
+                <w:sz w:val="18"/>
+              </w:rPr>
+              <w:t>81k</w:t>
+            </w:r>
+          </w:p>
+        </w:tc>
+        <w:tc>
+          <w:tcPr>
+            <w:tcW w:type="dxa" w:w="1170"/>
+          </w:tcPr>
+          <w:p>
+            <w:r>
+              <w:rPr>
+                <w:sz w:val="18"/>
+              </w:rPr>
+              <w:t>4,445</w:t>
+            </w:r>
+          </w:p>
+        </w:tc>
+        <w:tc>
+          <w:tcPr>
+            <w:tcW w:type="dxa" w:w="1170"/>
+          </w:tcPr>
+          <w:p>
+            <w:r>
+              <w:rPr>
+                <w:sz w:val="18"/>
+              </w:rPr>
+              <w:t>7</w:t>
+            </w:r>
+          </w:p>
+        </w:tc>
+        <w:tc>
+          <w:tcPr>
+            <w:tcW w:type="dxa" w:w="1170"/>
+          </w:tcPr>
+          <w:p>
+            <w:r>
+              <w:rPr>
+                <w:sz w:val="18"/>
+              </w:rPr>
+              <w:t>9</w:t>
+            </w:r>
+          </w:p>
+        </w:tc>
+        <w:tc>
+          <w:tcPr>
+            <w:tcW w:type="dxa" w:w="1170"/>
+          </w:tcPr>
+          <w:p>
+            <w:r>
+              <w:rPr>
+                <w:sz w:val="18"/>
+              </w:rPr>
+              <w:t>3</w:t>
+            </w:r>
+          </w:p>
+        </w:tc>
+        <w:tc>
+          <w:tcPr>
+            <w:tcW w:type="dxa" w:w="1170"/>
+          </w:tcPr>
+          <w:p>
+            <w:r>
+              <w:rPr>
+                <w:sz w:val="18"/>
+              </w:rPr>
+              <w:t>23.4</w:t>
+            </w:r>
+          </w:p>
+        </w:tc>
+        <w:tc>
+          <w:tcPr>
+            <w:tcW w:type="dxa" w:w="1170"/>
+          </w:tcPr>
+          <w:p>
+            <w:r>
+              <w:rPr>
+                <w:sz w:val="18"/>
+              </w:rPr>
+              <w:t>1.04x</w:t>
+            </w:r>
+          </w:p>
+        </w:tc>
+      </w:tr>
+      <w:tr>
+        <w:tc>
+          <w:tcPr>
+            <w:tcW w:type="dxa" w:w="1170"/>
+          </w:tcPr>
+          <w:p>
+            <w:r>
+              <w:rPr>
+                <w:sz w:val="18"/>
+              </w:rPr>
+              <w:t>Temerloh, Pahang</w:t>
+            </w:r>
+          </w:p>
+        </w:tc>
+        <w:tc>
+          <w:tcPr>
+            <w:tcW w:type="dxa" w:w="1170"/>
+          </w:tcPr>
+          <w:p>
+            <w:r>
+              <w:rPr>
+                <w:sz w:val="18"/>
+              </w:rPr>
+              <w:t>178k</w:t>
+            </w:r>
+          </w:p>
+        </w:tc>
+        <w:tc>
+          <w:tcPr>
+            <w:tcW w:type="dxa" w:w="1170"/>
+          </w:tcPr>
+          <w:p>
+            <w:r>
+              <w:rPr>
+                <w:sz w:val="18"/>
+              </w:rPr>
+              <w:t>4,283</w:t>
+            </w:r>
+          </w:p>
+        </w:tc>
+        <w:tc>
+          <w:tcPr>
+            <w:tcW w:type="dxa" w:w="1170"/>
+          </w:tcPr>
+          <w:p>
+            <w:r>
+              <w:rPr>
+                <w:sz w:val="18"/>
+              </w:rPr>
+              <w:t>17</w:t>
+            </w:r>
+          </w:p>
+        </w:tc>
+        <w:tc>
+          <w:tcPr>
+            <w:tcW w:type="dxa" w:w="1170"/>
+          </w:tcPr>
+          <w:p>
+            <w:r>
+              <w:rPr>
+                <w:sz w:val="18"/>
+              </w:rPr>
+              <w:t>16</w:t>
+            </w:r>
+          </w:p>
+        </w:tc>
+        <w:tc>
+          <w:tcPr>
+            <w:tcW w:type="dxa" w:w="1170"/>
+          </w:tcPr>
+          <w:p>
+            <w:r>
+              <w:rPr>
+                <w:sz w:val="18"/>
+              </w:rPr>
+              <w:t>2</w:t>
+            </w:r>
+          </w:p>
+        </w:tc>
+        <w:tc>
+          <w:tcPr>
+            <w:tcW w:type="dxa" w:w="1170"/>
+          </w:tcPr>
+          <w:p>
+            <w:r>
+              <w:rPr>
+                <w:sz w:val="18"/>
+              </w:rPr>
+              <w:t>19.7</w:t>
+            </w:r>
+          </w:p>
+        </w:tc>
+        <w:tc>
+          <w:tcPr>
+            <w:tcW w:type="dxa" w:w="1170"/>
+          </w:tcPr>
+          <w:p>
+            <w:r>
+              <w:rPr>
+                <w:sz w:val="18"/>
+              </w:rPr>
+              <w:t>0.87x</w:t>
+            </w:r>
+          </w:p>
+        </w:tc>
+      </w:tr>
+    </w:tbl>
+    <w:p/>
     <w:p>
       <w:pPr>
         <w:pStyle w:val="Heading1"/>

</xml_diff>

<commit_message>
Refresh to latest DOSM vintages: population 2025, HIES 2024
- Re-download parquets; population now 2020-2025, HIES adds 2024
- Canonicalize district name variants in new vintages (Cameron
  Highland, Sp */S.P.* Seberang Perai, Larut & Matang, Hulu, Lubok antu)
- HIES 2024 omits Perlis and the federal territories: fall back to 2022
  for those four, tracked in new income_year column
- Reweight demand index for data recency: population 35%, expenditure
  (HIES 2024) 20%, Census-2020 households downweighted to 10%
- Update vintage labels and cited figures in map and report

Co-Authored-By: Claude Fable 5 <noreply@anthropic.com>
Claude-Session: https://claude.ai/code/session_01UBEYtRwKf6f3vxGesJBzvb
</commit_message>
<xml_diff>
--- a/output/KKmart_Whitespace_Report.docx
+++ b/output/KKmart_Whitespace_Report.docx
@@ -24,7 +24,7 @@
           <w:i/>
           <w:sz w:val="22"/>
         </w:rPr>
-        <w:t>District-level expansion opportunity assessment  |  04 July 2026</w:t>
+        <w:t>District-level expansion opportunity assessment  |  06 July 2026</w:t>
       </w:r>
     </w:p>
     <w:p>
@@ -40,12 +40,12 @@
     </w:p>
     <w:p>
       <w:r>
-        <w:t>This analysis maps all 1,054 KKmart stores against 6,613 competitor outlets (7-Eleven, 99 Speedmart, FamilyMart, myNEWS) and official demographic data from the Department of Statistics Malaysia (DOSM) across all 160 administrative districts. KKmart holds a 14% share of the combined convenience-store network and is present in only 51 of 160 districts, covering 65% of the national population. The national benchmark is 22.5 convenience stores per 100,000 people. Twenty districts are saturated (&gt;1.2x the national rate) — including KKmart's core markets of Kuala Lumpur, Petaling and Johor Bahru — while 76 districts remain structurally underserved (&lt;0.5x). The clearest expansion opportunities fall into two groups: open whitespace in East Malaysia (Tawau, Semporna, Lahad Datu) and competitor-validated markets where KKmart is absent (Kota Kinabalu, Alor Setar, Kuala Terengganu).</w:t>
+        <w:t>This analysis maps all 1,054 KKmart stores against 6,613 competitor outlets (7-Eleven, 99 Speedmart, FamilyMart, myNEWS) and official demographic data from the Department of Statistics Malaysia (DOSM) across all 160 administrative districts. KKmart holds a 14% share of the combined convenience-store network and is present in only 51 of 160 districts, covering 65% of the national population. The national benchmark is 22.4 convenience stores per 100,000 people. Twenty districts are saturated (&gt;1.2x the national rate) — including KKmart's core markets of Kuala Lumpur, Petaling and Johor Bahru — while 76 districts remain structurally underserved (&lt;0.5x). The clearest expansion opportunities fall into two groups: open whitespace in East Malaysia (Tawau, Semporna, Lahad Datu) and competitor-validated markets where KKmart is absent (Kota Kinabalu, Alor Setar, Kuala Terengganu).</w:t>
       </w:r>
     </w:p>
     <w:p>
       <w:r>
-        <w:t>Management has guided expansion toward Northern and Southern Peninsular Malaysia, with Pulau Pinang and Johor as focus states. Benchmarked against the Peninsular average of 25.9 stores per 100k, this guidance is directionally sound: the two states hold roughly 230 stores of at-par headroom — enough to grow the KKmart network by about 20% without entering saturated territory. The critical execution question is mix: the headroom sits in Georgetown (Timur Laut), mainland Seberang Perai, and Johor's secondary districts — not in Johor Bahru, which is already 90 stores over par.</w:t>
+        <w:t>Management has guided expansion toward Northern and Southern Peninsular Malaysia, with Pulau Pinang and Johor as focus states. Benchmarked against the Peninsular average of 25.8 stores per 100k, this guidance is directionally sound: the two states hold roughly 230 stores of at-par headroom — enough to grow the KKmart network by about 20% without entering saturated territory. The critical execution question is mix: the headroom sits in Georgetown (Timur Laut), mainland Seberang Perai, and Johor's secondary districts — not in Johor Bahru, which is already 88 stores over par.</w:t>
       </w:r>
     </w:p>
     <w:p>
@@ -176,7 +176,7 @@
               <w:rPr>
                 <w:sz w:val="18"/>
               </w:rPr>
-              <w:t>Population by district, 2024</w:t>
+              <w:t>Population by district, 2025</w:t>
             </w:r>
           </w:p>
         </w:tc>
@@ -232,7 +232,7 @@
               <w:rPr>
                 <w:sz w:val="18"/>
               </w:rPr>
-              <w:t>Income, expenditure, poverty, Gini (HIES 2022)</w:t>
+              <w:t>Income, expenditure, poverty, Gini (HIES 2024)</w:t>
             </w:r>
           </w:p>
         </w:tc>
@@ -245,7 +245,7 @@
               <w:rPr>
                 <w:sz w:val="18"/>
               </w:rPr>
-              <w:t>DOSM OpenDOSM: hies_district</w:t>
+              <w:t>DOSM OpenDOSM: hies_district (2022 fallback for Perlis &amp; federal territories)</w:t>
             </w:r>
           </w:p>
         </w:tc>
@@ -312,7 +312,7 @@
         <w:pStyle w:val="ListNumber"/>
       </w:pPr>
       <w:r>
-        <w:t>Demand index per district: weighted blend of normalized indicators — population 2024 (30%), households (20%), population density (20%), mean household expenditure (15%), share of population aged 15-39 (10%), and population growth 2020-2024 (5%).</w:t>
+        <w:t>Demand index per district: weighted blend of normalized indicators — population 2025 (35%), households (10%), population density (20%), mean household expenditure, HIES 2024 (20%), share of population aged 15-39 (10%), and population growth 2020-2025 (5%). Weights favour recency: the vintage Census 2020 household count is downweighted in favour of 2025 population and 2024 expenditure.</w:t>
       </w:r>
     </w:p>
     <w:p>
@@ -320,7 +320,7 @@
         <w:pStyle w:val="ListNumber"/>
       </w:pPr>
       <w:r>
-        <w:t>Saturation ratio: district convenience stores per 100k population divided by the national rate (22.5/100k). Above 1.2x = saturated; below 0.5x = underserved.</w:t>
+        <w:t>Saturation ratio: district convenience stores per 100k population divided by the national rate (22.4/100k). Above 1.2x = saturated; below 0.5x = underserved.</w:t>
       </w:r>
     </w:p>
     <w:p>
@@ -808,7 +808,7 @@
               <w:rPr>
                 <w:sz w:val="18"/>
               </w:rPr>
-              <w:t>44k</w:t>
+              <w:t>45k</w:t>
             </w:r>
           </w:p>
         </w:tc>
@@ -847,7 +847,7 @@
               <w:rPr>
                 <w:sz w:val="18"/>
               </w:rPr>
-              <w:t>60.7</w:t>
+              <w:t>60.3</w:t>
             </w:r>
           </w:p>
         </w:tc>
@@ -888,7 +888,7 @@
               <w:rPr>
                 <w:sz w:val="18"/>
               </w:rPr>
-              <w:t>347k</w:t>
+              <w:t>350k</w:t>
             </w:r>
           </w:p>
         </w:tc>
@@ -927,7 +927,7 @@
               <w:rPr>
                 <w:sz w:val="18"/>
               </w:rPr>
-              <w:t>50.2</w:t>
+              <w:t>49.7</w:t>
             </w:r>
           </w:p>
         </w:tc>
@@ -968,7 +968,7 @@
               <w:rPr>
                 <w:sz w:val="18"/>
               </w:rPr>
-              <w:t>2,068k</w:t>
+              <w:t>2,074k</w:t>
             </w:r>
           </w:p>
         </w:tc>
@@ -1007,7 +1007,7 @@
               <w:rPr>
                 <w:sz w:val="18"/>
               </w:rPr>
-              <w:t>45.2</w:t>
+              <w:t>45.0</w:t>
             </w:r>
           </w:p>
         </w:tc>
@@ -1048,7 +1048,7 @@
               <w:rPr>
                 <w:sz w:val="18"/>
               </w:rPr>
-              <w:t>135k</w:t>
+              <w:t>136k</w:t>
             </w:r>
           </w:p>
         </w:tc>
@@ -1087,7 +1087,7 @@
               <w:rPr>
                 <w:sz w:val="18"/>
               </w:rPr>
-              <w:t>40.7</w:t>
+              <w:t>40.6</w:t>
             </w:r>
           </w:p>
         </w:tc>
@@ -1128,7 +1128,7 @@
               <w:rPr>
                 <w:sz w:val="18"/>
               </w:rPr>
-              <w:t>2,360k</w:t>
+              <w:t>2,371k</w:t>
             </w:r>
           </w:p>
         </w:tc>
@@ -1167,7 +1167,7 @@
               <w:rPr>
                 <w:sz w:val="18"/>
               </w:rPr>
-              <w:t>39.4</w:t>
+              <w:t>39.2</w:t>
             </w:r>
           </w:p>
         </w:tc>
@@ -1180,7 +1180,7 @@
               <w:rPr>
                 <w:sz w:val="18"/>
               </w:rPr>
-              <w:t>1.7x</w:t>
+              <w:t>1.8x</w:t>
             </w:r>
           </w:p>
         </w:tc>
@@ -1208,7 +1208,7 @@
               <w:rPr>
                 <w:sz w:val="18"/>
               </w:rPr>
-              <w:t>121k</w:t>
+              <w:t>120k</w:t>
             </w:r>
           </w:p>
         </w:tc>
@@ -1247,7 +1247,7 @@
               <w:rPr>
                 <w:sz w:val="18"/>
               </w:rPr>
-              <w:t>38.8</w:t>
+              <w:t>39.2</w:t>
             </w:r>
           </w:p>
         </w:tc>
@@ -1288,7 +1288,7 @@
               <w:rPr>
                 <w:sz w:val="18"/>
               </w:rPr>
-              <w:t>630k</w:t>
+              <w:t>633k</w:t>
             </w:r>
           </w:p>
         </w:tc>
@@ -1327,7 +1327,7 @@
               <w:rPr>
                 <w:sz w:val="18"/>
               </w:rPr>
-              <w:t>37.8</w:t>
+              <w:t>37.6</w:t>
             </w:r>
           </w:p>
         </w:tc>
@@ -1368,7 +1368,7 @@
               <w:rPr>
                 <w:sz w:val="18"/>
               </w:rPr>
-              <w:t>713k</w:t>
+              <w:t>717k</w:t>
             </w:r>
           </w:p>
         </w:tc>
@@ -1407,7 +1407,7 @@
               <w:rPr>
                 <w:sz w:val="18"/>
               </w:rPr>
-              <w:t>37.5</w:t>
+              <w:t>37.2</w:t>
             </w:r>
           </w:p>
         </w:tc>
@@ -1451,7 +1451,7 @@
         <w:t xml:space="preserve">East Malaysia (Sabah, Sarawak, Labuan). </w:t>
       </w:r>
       <w:r>
-        <w:t>The deepest whitespace in the country: Tawau (414k people, 8 stores in total across all brands), Semporna, Lahad Datu and Kinabatangan in Sabah; Bintulu and Sibu in Sarawak. Kalabakan and Kunak have no convenience store from any chain. Bintulu is notable for its high median income (RM 8,567 — above Klang) with no KKmart presence. The main execution risk is logistics: distribution-centre and shipping costs across the South China Sea.</w:t>
+        <w:t>The deepest whitespace in the country: Tawau (414k people, 8 stores in total across all brands), Semporna, Lahad Datu and Kinabatangan in Sabah; Bintulu and Sibu in Sarawak. Kalabakan and Kunak have no convenience store from any chain. Bintulu is notable for its high median income (RM 8,317 — among the highest outside the Klang Valley) with no KKmart presence. The main execution risk is logistics: distribution-centre and shipping costs across the South China Sea.</w:t>
       </w:r>
     </w:p>
     <w:tbl>
@@ -1562,7 +1562,7 @@
               <w:rPr>
                 <w:sz w:val="18"/>
               </w:rPr>
-              <w:t>414k</w:t>
+              <w:t>416k</w:t>
             </w:r>
           </w:p>
         </w:tc>
@@ -1575,7 +1575,7 @@
               <w:rPr>
                 <w:sz w:val="18"/>
               </w:rPr>
-              <w:t>4,783</w:t>
+              <w:t>4,852</w:t>
             </w:r>
           </w:p>
         </w:tc>
@@ -1629,7 +1629,7 @@
               <w:rPr>
                 <w:sz w:val="18"/>
               </w:rPr>
-              <w:t>164k</w:t>
+              <w:t>165k</w:t>
             </w:r>
           </w:p>
         </w:tc>
@@ -1642,7 +1642,7 @@
               <w:rPr>
                 <w:sz w:val="18"/>
               </w:rPr>
-              <w:t>4,162</w:t>
+              <w:t>4,897</w:t>
             </w:r>
           </w:p>
         </w:tc>
@@ -1709,7 +1709,7 @@
               <w:rPr>
                 <w:sz w:val="18"/>
               </w:rPr>
-              <w:t>3,931</w:t>
+              <w:t>3,304</w:t>
             </w:r>
           </w:p>
         </w:tc>
@@ -1750,7 +1750,7 @@
               <w:rPr>
                 <w:sz w:val="18"/>
               </w:rPr>
-              <w:t>Kunak, Sabah</w:t>
+              <w:t>Lahad Datu, Sabah</w:t>
             </w:r>
           </w:p>
         </w:tc>
@@ -1763,7 +1763,7 @@
               <w:rPr>
                 <w:sz w:val="18"/>
               </w:rPr>
-              <w:t>80k</w:t>
+              <w:t>253k</w:t>
             </w:r>
           </w:p>
         </w:tc>
@@ -1776,7 +1776,7 @@
               <w:rPr>
                 <w:sz w:val="18"/>
               </w:rPr>
-              <w:t>4,480</w:t>
+              <w:t>5,526</w:t>
             </w:r>
           </w:p>
         </w:tc>
@@ -1789,7 +1789,7 @@
               <w:rPr>
                 <w:sz w:val="18"/>
               </w:rPr>
-              <w:t>0</w:t>
+              <w:t>5</w:t>
             </w:r>
           </w:p>
         </w:tc>
@@ -1802,7 +1802,7 @@
               <w:rPr>
                 <w:sz w:val="18"/>
               </w:rPr>
-              <w:t>0.0</w:t>
+              <w:t>2.0</w:t>
             </w:r>
           </w:p>
         </w:tc>
@@ -1830,7 +1830,7 @@
               <w:rPr>
                 <w:sz w:val="18"/>
               </w:rPr>
-              <w:t>199k</w:t>
+              <w:t>201k</w:t>
             </w:r>
           </w:p>
         </w:tc>
@@ -1843,7 +1843,7 @@
               <w:rPr>
                 <w:sz w:val="18"/>
               </w:rPr>
-              <w:t>4,093</w:t>
+              <w:t>4,059</w:t>
             </w:r>
           </w:p>
         </w:tc>
@@ -1884,7 +1884,7 @@
               <w:rPr>
                 <w:sz w:val="18"/>
               </w:rPr>
-              <w:t>Lahad Datu, Sabah</w:t>
+              <w:t>Kunak, Sabah</w:t>
             </w:r>
           </w:p>
         </w:tc>
@@ -1897,7 +1897,7 @@
               <w:rPr>
                 <w:sz w:val="18"/>
               </w:rPr>
-              <w:t>254k</w:t>
+              <w:t>78k</w:t>
             </w:r>
           </w:p>
         </w:tc>
@@ -1910,7 +1910,7 @@
               <w:rPr>
                 <w:sz w:val="18"/>
               </w:rPr>
-              <w:t>4,457</w:t>
+              <w:t>4,539</w:t>
             </w:r>
           </w:p>
         </w:tc>
@@ -1923,7 +1923,7 @@
               <w:rPr>
                 <w:sz w:val="18"/>
               </w:rPr>
-              <w:t>5</w:t>
+              <w:t>0</w:t>
             </w:r>
           </w:p>
         </w:tc>
@@ -1936,7 +1936,7 @@
               <w:rPr>
                 <w:sz w:val="18"/>
               </w:rPr>
-              <w:t>2.0</w:t>
+              <w:t>0.0</w:t>
             </w:r>
           </w:p>
         </w:tc>
@@ -1964,7 +1964,7 @@
               <w:rPr>
                 <w:sz w:val="18"/>
               </w:rPr>
-              <w:t>189k</w:t>
+              <w:t>190k</w:t>
             </w:r>
           </w:p>
         </w:tc>
@@ -1977,7 +1977,7 @@
               <w:rPr>
                 <w:sz w:val="18"/>
               </w:rPr>
-              <w:t>8,567</w:t>
+              <w:t>8,317</w:t>
             </w:r>
           </w:p>
         </w:tc>
@@ -2018,7 +2018,7 @@
               <w:rPr>
                 <w:sz w:val="18"/>
               </w:rPr>
-              <w:t>W.P. Labuan, W.P. Labuan</w:t>
+              <w:t>Beluran, Sabah</w:t>
             </w:r>
           </w:p>
         </w:tc>
@@ -2031,7 +2031,7 @@
               <w:rPr>
                 <w:sz w:val="18"/>
               </w:rPr>
-              <w:t>101k</w:t>
+              <w:t>91k</w:t>
             </w:r>
           </w:p>
         </w:tc>
@@ -2044,7 +2044,7 @@
               <w:rPr>
                 <w:sz w:val="18"/>
               </w:rPr>
-              <w:t>6,904</w:t>
+              <w:t>4,436</w:t>
             </w:r>
           </w:p>
         </w:tc>
@@ -2057,7 +2057,7 @@
               <w:rPr>
                 <w:sz w:val="18"/>
               </w:rPr>
-              <w:t>2</w:t>
+              <w:t>1</w:t>
             </w:r>
           </w:p>
         </w:tc>
@@ -2070,7 +2070,7 @@
               <w:rPr>
                 <w:sz w:val="18"/>
               </w:rPr>
-              <w:t>2.0</w:t>
+              <w:t>1.1</w:t>
             </w:r>
           </w:p>
         </w:tc>
@@ -2085,7 +2085,7 @@
         <w:t xml:space="preserve">West Malaysia (Peninsular East Coast). </w:t>
       </w:r>
       <w:r>
-        <w:t>Every Peninsular open-whitespace district lies on the East Coast, in Kelantan and Terengganu: Kota Bharu (584k people, 10 stores per 100k — less than half the Peninsular average), Pasir Mas, Bachok and Tumpat form a contiguous under-served cluster around the Kota Bharu conurbation. Unlike East Malaysia, these districts are reachable from existing Peninsular distribution infrastructure, making them the lower-risk half of the open whitespace despite lower median incomes (RM 3,500-4,300 in the Kelantan cluster; Kuala Nerus near Kuala Terengganu is the income outlier at RM 6,800).</w:t>
+        <w:t>Every Peninsular open-whitespace district lies on the East Coast, in Kelantan and Terengganu: Kota Bharu (584k people, 10 stores per 100k — less than half the Peninsular average), Pasir Mas, Bachok and Tumpat form a contiguous under-served cluster around the Kota Bharu conurbation. Unlike East Malaysia, these districts are reachable from existing Peninsular distribution infrastructure, making them the lower-risk half of the open whitespace despite lower median incomes (RM 3,600-4,700 in the Kelantan cluster; Kuala Nerus near Kuala Terengganu is the income outlier at RM 7,300).</w:t>
       </w:r>
     </w:p>
     <w:tbl>
@@ -2196,7 +2196,7 @@
               <w:rPr>
                 <w:sz w:val="18"/>
               </w:rPr>
-              <w:t>584k</w:t>
+              <w:t>590k</w:t>
             </w:r>
           </w:p>
         </w:tc>
@@ -2209,7 +2209,7 @@
               <w:rPr>
                 <w:sz w:val="18"/>
               </w:rPr>
-              <w:t>4,330</w:t>
+              <w:t>4,729</w:t>
             </w:r>
           </w:p>
         </w:tc>
@@ -2235,7 +2235,7 @@
               <w:rPr>
                 <w:sz w:val="18"/>
               </w:rPr>
-              <w:t>10.1</w:t>
+              <w:t>10.0</w:t>
             </w:r>
           </w:p>
         </w:tc>
@@ -2263,7 +2263,7 @@
               <w:rPr>
                 <w:sz w:val="18"/>
               </w:rPr>
-              <w:t>241k</w:t>
+              <w:t>243k</w:t>
             </w:r>
           </w:p>
         </w:tc>
@@ -2276,7 +2276,7 @@
               <w:rPr>
                 <w:sz w:val="18"/>
               </w:rPr>
-              <w:t>3,508</w:t>
+              <w:t>3,591</w:t>
             </w:r>
           </w:p>
         </w:tc>
@@ -2330,7 +2330,7 @@
               <w:rPr>
                 <w:sz w:val="18"/>
               </w:rPr>
-              <w:t>166k</w:t>
+              <w:t>168k</w:t>
             </w:r>
           </w:p>
         </w:tc>
@@ -2343,7 +2343,7 @@
               <w:rPr>
                 <w:sz w:val="18"/>
               </w:rPr>
-              <w:t>3,625</w:t>
+              <w:t>4,187</w:t>
             </w:r>
           </w:p>
         </w:tc>
@@ -2397,7 +2397,7 @@
               <w:rPr>
                 <w:sz w:val="18"/>
               </w:rPr>
-              <w:t>189k</w:t>
+              <w:t>191k</w:t>
             </w:r>
           </w:p>
         </w:tc>
@@ -2410,7 +2410,7 @@
               <w:rPr>
                 <w:sz w:val="18"/>
               </w:rPr>
-              <w:t>3,749</w:t>
+              <w:t>3,904</w:t>
             </w:r>
           </w:p>
         </w:tc>
@@ -2436,7 +2436,7 @@
               <w:rPr>
                 <w:sz w:val="18"/>
               </w:rPr>
-              <w:t>5.3</w:t>
+              <w:t>5.2</w:t>
             </w:r>
           </w:p>
         </w:tc>
@@ -2464,7 +2464,7 @@
               <w:rPr>
                 <w:sz w:val="18"/>
               </w:rPr>
-              <w:t>127k</w:t>
+              <w:t>129k</w:t>
             </w:r>
           </w:p>
         </w:tc>
@@ -2477,7 +2477,7 @@
               <w:rPr>
                 <w:sz w:val="18"/>
               </w:rPr>
-              <w:t>5,291</w:t>
+              <w:t>6,246</w:t>
             </w:r>
           </w:p>
         </w:tc>
@@ -2503,7 +2503,7 @@
               <w:rPr>
                 <w:sz w:val="18"/>
               </w:rPr>
-              <w:t>6.3</w:t>
+              <w:t>6.2</w:t>
             </w:r>
           </w:p>
         </w:tc>
@@ -2531,7 +2531,7 @@
               <w:rPr>
                 <w:sz w:val="18"/>
               </w:rPr>
-              <w:t>156k</w:t>
+              <w:t>158k</w:t>
             </w:r>
           </w:p>
         </w:tc>
@@ -2544,7 +2544,7 @@
               <w:rPr>
                 <w:sz w:val="18"/>
               </w:rPr>
-              <w:t>6,800</w:t>
+              <w:t>7,304</w:t>
             </w:r>
           </w:p>
         </w:tc>
@@ -2570,7 +2570,7 @@
               <w:rPr>
                 <w:sz w:val="18"/>
               </w:rPr>
-              <w:t>10.3</w:t>
+              <w:t>10.2</w:t>
             </w:r>
           </w:p>
         </w:tc>
@@ -2585,7 +2585,7 @@
               <w:rPr>
                 <w:sz w:val="18"/>
               </w:rPr>
-              <w:t>Gua Musang, Kelantan</w:t>
+              <w:t>Besut, Terengganu</w:t>
             </w:r>
           </w:p>
         </w:tc>
@@ -2598,7 +2598,7 @@
               <w:rPr>
                 <w:sz w:val="18"/>
               </w:rPr>
-              <w:t>110k</w:t>
+              <w:t>168k</w:t>
             </w:r>
           </w:p>
         </w:tc>
@@ -2611,7 +2611,7 @@
               <w:rPr>
                 <w:sz w:val="18"/>
               </w:rPr>
-              <w:t>3,342</w:t>
+              <w:t>5,820</w:t>
             </w:r>
           </w:p>
         </w:tc>
@@ -2624,7 +2624,7 @@
               <w:rPr>
                 <w:sz w:val="18"/>
               </w:rPr>
-              <w:t>9</w:t>
+              <w:t>16</w:t>
             </w:r>
           </w:p>
         </w:tc>
@@ -2637,7 +2637,7 @@
               <w:rPr>
                 <w:sz w:val="18"/>
               </w:rPr>
-              <w:t>8.1</w:t>
+              <w:t>9.6</w:t>
             </w:r>
           </w:p>
         </w:tc>
@@ -2652,7 +2652,7 @@
               <w:rPr>
                 <w:sz w:val="18"/>
               </w:rPr>
-              <w:t>Besut, Terengganu</w:t>
+              <w:t>Setiu, Terengganu</w:t>
             </w:r>
           </w:p>
         </w:tc>
@@ -2665,7 +2665,7 @@
               <w:rPr>
                 <w:sz w:val="18"/>
               </w:rPr>
-              <w:t>165k</w:t>
+              <w:t>65k</w:t>
             </w:r>
           </w:p>
         </w:tc>
@@ -2678,7 +2678,7 @@
               <w:rPr>
                 <w:sz w:val="18"/>
               </w:rPr>
-              <w:t>4,743</w:t>
+              <w:t>6,125</w:t>
             </w:r>
           </w:p>
         </w:tc>
@@ -2691,7 +2691,7 @@
               <w:rPr>
                 <w:sz w:val="18"/>
               </w:rPr>
-              <w:t>16</w:t>
+              <w:t>6</w:t>
             </w:r>
           </w:p>
         </w:tc>
@@ -2704,7 +2704,7 @@
               <w:rPr>
                 <w:sz w:val="18"/>
               </w:rPr>
-              <w:t>9.7</w:t>
+              <w:t>9.2</w:t>
             </w:r>
           </w:p>
         </w:tc>
@@ -2724,7 +2724,7 @@
     </w:p>
     <w:p>
       <w:r>
-        <w:t>These are arguably the lowest-risk expansion targets: competitors have already validated consumer demand, total density remains below the national rate, and KKmart is the missing brand. Of the 18 competitor-led districts, 7 are in East Malaysia and 11 in West Malaysia.</w:t>
+        <w:t>These are arguably the lowest-risk expansion targets: competitors have already validated consumer demand, total density remains below the national rate, and KKmart is the missing brand. Of the 17 competitor-led districts, 6 are in East Malaysia and 11 in West Malaysia.</w:t>
       </w:r>
     </w:p>
     <w:p>
@@ -2735,7 +2735,7 @@
         <w:t xml:space="preserve">East Malaysia — the greater Kota Kinabalu metro. </w:t>
       </w:r>
       <w:r>
-        <w:t>Five of the seven East Malaysian districts (Kota Kinabalu, Putatan, Penampang, Tuaran, Papar) form one contiguous urban corridor of 1.1 million people holding 191 competitor outlets and zero KKmart stores — the largest single competitor-validated market KKmart has not entered. Miri and Keningau complete the group. Market structure is also notable: FamilyMart and myNEWS have no presence in any of these districts, so the market is a 7-Eleven / 99 Speedmart duopoly. One Kota Kinabalu distribution centre would serve the entire metro cluster, partially offsetting the East Malaysian logistics disadvantage.</w:t>
+        <w:t>Five of the seven East Malaysian districts (Kota Kinabalu, Putatan, Penampang, Tuaran, Papar) form one contiguous urban corridor of 0.9 million people holding 165 competitor outlets and zero KKmart stores — the largest single competitor-validated market KKmart has not entered. Miri and Keningau complete the group. Market structure is also notable: FamilyMart and myNEWS have no presence in any of these districts, so the market is a 7-Eleven / 99 Speedmart duopoly. One Kota Kinabalu distribution centre would serve the entire metro cluster, partially offsetting the East Malaysian logistics disadvantage.</w:t>
       </w:r>
     </w:p>
     <w:tbl>
@@ -2891,7 +2891,7 @@
               <w:rPr>
                 <w:sz w:val="18"/>
               </w:rPr>
-              <w:t>547k</w:t>
+              <w:t>552k</w:t>
             </w:r>
           </w:p>
         </w:tc>
@@ -2904,7 +2904,7 @@
               <w:rPr>
                 <w:sz w:val="18"/>
               </w:rPr>
-              <w:t>5,957</w:t>
+              <w:t>5,896</w:t>
             </w:r>
           </w:p>
         </w:tc>
@@ -2956,7 +2956,7 @@
               <w:rPr>
                 <w:sz w:val="18"/>
               </w:rPr>
-              <w:t>17.6</w:t>
+              <w:t>17.4</w:t>
             </w:r>
           </w:p>
         </w:tc>
@@ -2997,7 +2997,7 @@
               <w:rPr>
                 <w:sz w:val="18"/>
               </w:rPr>
-              <w:t>256k</w:t>
+              <w:t>258k</w:t>
             </w:r>
           </w:p>
         </w:tc>
@@ -3010,7 +3010,7 @@
               <w:rPr>
                 <w:sz w:val="18"/>
               </w:rPr>
-              <w:t>6,449</w:t>
+              <w:t>6,600</w:t>
             </w:r>
           </w:p>
         </w:tc>
@@ -3062,7 +3062,7 @@
               <w:rPr>
                 <w:sz w:val="18"/>
               </w:rPr>
-              <w:t>12.5</w:t>
+              <w:t>12.4</w:t>
             </w:r>
           </w:p>
         </w:tc>
@@ -3116,7 +3116,7 @@
               <w:rPr>
                 <w:sz w:val="18"/>
               </w:rPr>
-              <w:t>5,699</w:t>
+              <w:t>6,563</w:t>
             </w:r>
           </w:p>
         </w:tc>
@@ -3181,7 +3181,7 @@
               <w:rPr>
                 <w:sz w:val="18"/>
               </w:rPr>
-              <w:t>0.81x</w:t>
+              <w:t>0.82x</w:t>
             </w:r>
           </w:p>
         </w:tc>
@@ -3209,7 +3209,7 @@
               <w:rPr>
                 <w:sz w:val="18"/>
               </w:rPr>
-              <w:t>168k</w:t>
+              <w:t>167k</w:t>
             </w:r>
           </w:p>
         </w:tc>
@@ -3222,7 +3222,7 @@
               <w:rPr>
                 <w:sz w:val="18"/>
               </w:rPr>
-              <w:t>6,265</w:t>
+              <w:t>6,090</w:t>
             </w:r>
           </w:p>
         </w:tc>
@@ -3274,7 +3274,7 @@
               <w:rPr>
                 <w:sz w:val="18"/>
               </w:rPr>
-              <w:t>17.9</w:t>
+              <w:t>18.0</w:t>
             </w:r>
           </w:p>
         </w:tc>
@@ -3302,7 +3302,7 @@
               <w:rPr>
                 <w:sz w:val="18"/>
               </w:rPr>
-              <w:t>Keningau, Sabah</w:t>
+              <w:t>Papar, Sabah</w:t>
             </w:r>
           </w:p>
         </w:tc>
@@ -3315,7 +3315,7 @@
               <w:rPr>
                 <w:sz w:val="18"/>
               </w:rPr>
-              <w:t>158k</w:t>
+              <w:t>156k</w:t>
             </w:r>
           </w:p>
         </w:tc>
@@ -3328,7 +3328,7 @@
               <w:rPr>
                 <w:sz w:val="18"/>
               </w:rPr>
-              <w:t>4,502</w:t>
+              <w:t>5,177</w:t>
             </w:r>
           </w:p>
         </w:tc>
@@ -3354,7 +3354,7 @@
               <w:rPr>
                 <w:sz w:val="18"/>
               </w:rPr>
-              <w:t>17</w:t>
+              <w:t>20</w:t>
             </w:r>
           </w:p>
         </w:tc>
@@ -3380,7 +3380,7 @@
               <w:rPr>
                 <w:sz w:val="18"/>
               </w:rPr>
-              <w:t>14.6</w:t>
+              <w:t>16.6</w:t>
             </w:r>
           </w:p>
         </w:tc>
@@ -3393,7 +3393,7 @@
               <w:rPr>
                 <w:sz w:val="18"/>
               </w:rPr>
-              <w:t>0.65x</w:t>
+              <w:t>0.74x</w:t>
             </w:r>
           </w:p>
         </w:tc>
@@ -3408,7 +3408,7 @@
               <w:rPr>
                 <w:sz w:val="18"/>
               </w:rPr>
-              <w:t>Papar, Sabah</w:t>
+              <w:t>Keningau, Sabah</w:t>
             </w:r>
           </w:p>
         </w:tc>
@@ -3421,7 +3421,7 @@
               <w:rPr>
                 <w:sz w:val="18"/>
               </w:rPr>
-              <w:t>156k</w:t>
+              <w:t>158k</w:t>
             </w:r>
           </w:p>
         </w:tc>
@@ -3434,7 +3434,7 @@
               <w:rPr>
                 <w:sz w:val="18"/>
               </w:rPr>
-              <w:t>4,871</w:t>
+              <w:t>4,801</w:t>
             </w:r>
           </w:p>
         </w:tc>
@@ -3460,7 +3460,7 @@
               <w:rPr>
                 <w:sz w:val="18"/>
               </w:rPr>
-              <w:t>20</w:t>
+              <w:t>17</w:t>
             </w:r>
           </w:p>
         </w:tc>
@@ -3486,7 +3486,7 @@
               <w:rPr>
                 <w:sz w:val="18"/>
               </w:rPr>
-              <w:t>16.6</w:t>
+              <w:t>14.6</w:t>
             </w:r>
           </w:p>
         </w:tc>
@@ -3499,113 +3499,7 @@
               <w:rPr>
                 <w:sz w:val="18"/>
               </w:rPr>
-              <w:t>0.74x</w:t>
-            </w:r>
-          </w:p>
-        </w:tc>
-      </w:tr>
-      <w:tr>
-        <w:tc>
-          <w:tcPr>
-            <w:tcW w:type="dxa" w:w="1170"/>
-          </w:tcPr>
-          <w:p>
-            <w:r>
-              <w:rPr>
-                <w:sz w:val="18"/>
-              </w:rPr>
-              <w:t>Tuaran, Sabah</w:t>
-            </w:r>
-          </w:p>
-        </w:tc>
-        <w:tc>
-          <w:tcPr>
-            <w:tcW w:type="dxa" w:w="1170"/>
-          </w:tcPr>
-          <w:p>
-            <w:r>
-              <w:rPr>
-                <w:sz w:val="18"/>
-              </w:rPr>
-              <w:t>142k</w:t>
-            </w:r>
-          </w:p>
-        </w:tc>
-        <w:tc>
-          <w:tcPr>
-            <w:tcW w:type="dxa" w:w="1170"/>
-          </w:tcPr>
-          <w:p>
-            <w:r>
-              <w:rPr>
-                <w:sz w:val="18"/>
-              </w:rPr>
-              <w:t>3,921</w:t>
-            </w:r>
-          </w:p>
-        </w:tc>
-        <w:tc>
-          <w:tcPr>
-            <w:tcW w:type="dxa" w:w="1170"/>
-          </w:tcPr>
-          <w:p>
-            <w:r>
-              <w:rPr>
-                <w:sz w:val="18"/>
-              </w:rPr>
-              <w:t>3</w:t>
-            </w:r>
-          </w:p>
-        </w:tc>
-        <w:tc>
-          <w:tcPr>
-            <w:tcW w:type="dxa" w:w="1170"/>
-          </w:tcPr>
-          <w:p>
-            <w:r>
-              <w:rPr>
-                <w:sz w:val="18"/>
-              </w:rPr>
-              <w:t>23</w:t>
-            </w:r>
-          </w:p>
-        </w:tc>
-        <w:tc>
-          <w:tcPr>
-            <w:tcW w:type="dxa" w:w="1170"/>
-          </w:tcPr>
-          <w:p>
-            <w:r>
-              <w:rPr>
-                <w:sz w:val="18"/>
-              </w:rPr>
-              <w:t>0</w:t>
-            </w:r>
-          </w:p>
-        </w:tc>
-        <w:tc>
-          <w:tcPr>
-            <w:tcW w:type="dxa" w:w="1170"/>
-          </w:tcPr>
-          <w:p>
-            <w:r>
-              <w:rPr>
-                <w:sz w:val="18"/>
-              </w:rPr>
-              <w:t>18.3</w:t>
-            </w:r>
-          </w:p>
-        </w:tc>
-        <w:tc>
-          <w:tcPr>
-            <w:tcW w:type="dxa" w:w="1170"/>
-          </w:tcPr>
-          <w:p>
-            <w:r>
-              <w:rPr>
-                <w:sz w:val="18"/>
-              </w:rPr>
-              <w:t>0.81x</w:t>
+              <w:t>0.65x</w:t>
             </w:r>
           </w:p>
         </w:tc>
@@ -3620,7 +3514,7 @@
         <w:t xml:space="preserve">West Malaysia — the Northern cluster and East Coast towns. </w:t>
       </w:r>
       <w:r>
-        <w:t>Five of the eleven Peninsular districts sit in the guided Northern corridor: Kota Setar / Alor Setar (85 competitor outlets, nearly at par yet zero KKmart), Kulim, Kubang Pasu and Perlis, plus Larut dan Matang (Taiping) in Perak. These adjoin the Penang expansion corridor and could share its distribution (see section 4.3). The remainder are East Coast towns, including the higher-income oil-and-gas centres Kemaman (RM 6,425 median) and Dungun (RM 6,356). Kuala Terengganu is a special case: 33 of its 38 competitor outlets are 7-Eleven and 99 Speedmart has no store there, so the value-grocery position KKmart competes for is effectively uncontested.</w:t>
+        <w:t>Five of the eleven Peninsular districts sit in the guided Northern corridor: Kota Setar / Alor Setar (85 competitor outlets, nearly at par yet zero KKmart), Kulim, Kubang Pasu and Perlis, plus Larut dan Matang (Taiping) in Perak. These adjoin the Penang expansion corridor and could share its distribution (see section 4.3). The remainder are East Coast towns, including the higher-income oil-and-gas centres Kemaman (RM 7,709 median) and Dungun (RM 7,156). Kuala Terengganu is a special case: 33 of its 38 competitor outlets are 7-Eleven and 99 Speedmart has no store there, so the value-grocery position KKmart competes for is effectively uncontested.</w:t>
       </w:r>
     </w:p>
     <w:tbl>
@@ -3763,7 +3657,7 @@
               <w:rPr>
                 <w:sz w:val="18"/>
               </w:rPr>
-              <w:t>Kota Setar, Kedah</w:t>
+              <w:t>Kuala Terengganu, Terengganu</w:t>
             </w:r>
           </w:p>
         </w:tc>
@@ -3776,7 +3670,7 @@
               <w:rPr>
                 <w:sz w:val="18"/>
               </w:rPr>
-              <w:t>382k</w:t>
+              <w:t>248k</w:t>
             </w:r>
           </w:p>
         </w:tc>
@@ -3789,7 +3683,7 @@
               <w:rPr>
                 <w:sz w:val="18"/>
               </w:rPr>
-              <w:t>4,751</w:t>
+              <w:t>6,615</w:t>
             </w:r>
           </w:p>
         </w:tc>
@@ -3802,7 +3696,7 @@
               <w:rPr>
                 <w:sz w:val="18"/>
               </w:rPr>
-              <w:t>36</w:t>
+              <w:t>33</w:t>
             </w:r>
           </w:p>
         </w:tc>
@@ -3815,7 +3709,7 @@
               <w:rPr>
                 <w:sz w:val="18"/>
               </w:rPr>
-              <w:t>40</w:t>
+              <w:t>0</w:t>
             </w:r>
           </w:p>
         </w:tc>
@@ -3828,7 +3722,7 @@
               <w:rPr>
                 <w:sz w:val="18"/>
               </w:rPr>
-              <w:t>9</w:t>
+              <w:t>5</w:t>
             </w:r>
           </w:p>
         </w:tc>
@@ -3841,7 +3735,7 @@
               <w:rPr>
                 <w:sz w:val="18"/>
               </w:rPr>
-              <w:t>22.3</w:t>
+              <w:t>15.3</w:t>
             </w:r>
           </w:p>
         </w:tc>
@@ -3854,7 +3748,7 @@
               <w:rPr>
                 <w:sz w:val="18"/>
               </w:rPr>
-              <w:t>0.99x</w:t>
+              <w:t>0.68x</w:t>
             </w:r>
           </w:p>
         </w:tc>
@@ -3869,7 +3763,7 @@
               <w:rPr>
                 <w:sz w:val="18"/>
               </w:rPr>
-              <w:t>Kuala Terengganu, Terengganu</w:t>
+              <w:t>Kota Setar, Kedah</w:t>
             </w:r>
           </w:p>
         </w:tc>
@@ -3882,7 +3776,7 @@
               <w:rPr>
                 <w:sz w:val="18"/>
               </w:rPr>
-              <w:t>245k</w:t>
+              <w:t>383k</w:t>
             </w:r>
           </w:p>
         </w:tc>
@@ -3895,7 +3789,7 @@
               <w:rPr>
                 <w:sz w:val="18"/>
               </w:rPr>
-              <w:t>5,872</w:t>
+              <w:t>5,208</w:t>
             </w:r>
           </w:p>
         </w:tc>
@@ -3908,7 +3802,7 @@
               <w:rPr>
                 <w:sz w:val="18"/>
               </w:rPr>
-              <w:t>33</w:t>
+              <w:t>36</w:t>
             </w:r>
           </w:p>
         </w:tc>
@@ -3921,7 +3815,7 @@
               <w:rPr>
                 <w:sz w:val="18"/>
               </w:rPr>
-              <w:t>0</w:t>
+              <w:t>40</w:t>
             </w:r>
           </w:p>
         </w:tc>
@@ -3934,7 +3828,7 @@
               <w:rPr>
                 <w:sz w:val="18"/>
               </w:rPr>
-              <w:t>5</w:t>
+              <w:t>9</w:t>
             </w:r>
           </w:p>
         </w:tc>
@@ -3947,7 +3841,7 @@
               <w:rPr>
                 <w:sz w:val="18"/>
               </w:rPr>
-              <w:t>15.5</w:t>
+              <w:t>22.2</w:t>
             </w:r>
           </w:p>
         </w:tc>
@@ -3960,7 +3854,7 @@
               <w:rPr>
                 <w:sz w:val="18"/>
               </w:rPr>
-              <w:t>0.69x</w:t>
+              <w:t>0.99x</w:t>
             </w:r>
           </w:p>
         </w:tc>
@@ -3975,7 +3869,7 @@
               <w:rPr>
                 <w:sz w:val="18"/>
               </w:rPr>
-              <w:t>Perlis, Perlis</w:t>
+              <w:t>Kemaman, Terengganu</w:t>
             </w:r>
           </w:p>
         </w:tc>
@@ -3988,7 +3882,7 @@
               <w:rPr>
                 <w:sz w:val="18"/>
               </w:rPr>
-              <w:t>297k</w:t>
+              <w:t>235k</w:t>
             </w:r>
           </w:p>
         </w:tc>
@@ -4001,7 +3895,7 @@
               <w:rPr>
                 <w:sz w:val="18"/>
               </w:rPr>
-              <w:t>4,713</w:t>
+              <w:t>7,709</w:t>
             </w:r>
           </w:p>
         </w:tc>
@@ -4014,7 +3908,7 @@
               <w:rPr>
                 <w:sz w:val="18"/>
               </w:rPr>
-              <w:t>18</w:t>
+              <w:t>19</w:t>
             </w:r>
           </w:p>
         </w:tc>
@@ -4027,7 +3921,7 @@
               <w:rPr>
                 <w:sz w:val="18"/>
               </w:rPr>
-              <w:t>14</w:t>
+              <w:t>9</w:t>
             </w:r>
           </w:p>
         </w:tc>
@@ -4040,7 +3934,7 @@
               <w:rPr>
                 <w:sz w:val="18"/>
               </w:rPr>
-              <w:t>2</w:t>
+              <w:t>1</w:t>
             </w:r>
           </w:p>
         </w:tc>
@@ -4053,7 +3947,7 @@
               <w:rPr>
                 <w:sz w:val="18"/>
               </w:rPr>
-              <w:t>11.5</w:t>
+              <w:t>12.3</w:t>
             </w:r>
           </w:p>
         </w:tc>
@@ -4066,7 +3960,7 @@
               <w:rPr>
                 <w:sz w:val="18"/>
               </w:rPr>
-              <w:t>0.51x</w:t>
+              <w:t>0.55x</w:t>
             </w:r>
           </w:p>
         </w:tc>
@@ -4081,7 +3975,7 @@
               <w:rPr>
                 <w:sz w:val="18"/>
               </w:rPr>
-              <w:t>Kulim, Kedah</w:t>
+              <w:t>Dungun, Terengganu</w:t>
             </w:r>
           </w:p>
         </w:tc>
@@ -4094,7 +3988,7 @@
               <w:rPr>
                 <w:sz w:val="18"/>
               </w:rPr>
-              <w:t>352k</w:t>
+              <w:t>170k</w:t>
             </w:r>
           </w:p>
         </w:tc>
@@ -4107,7 +4001,7 @@
               <w:rPr>
                 <w:sz w:val="18"/>
               </w:rPr>
-              <w:t>4,498</w:t>
+              <w:t>7,156</w:t>
             </w:r>
           </w:p>
         </w:tc>
@@ -4120,7 +4014,7 @@
               <w:rPr>
                 <w:sz w:val="18"/>
               </w:rPr>
-              <w:t>11</w:t>
+              <w:t>15</w:t>
             </w:r>
           </w:p>
         </w:tc>
@@ -4133,7 +4027,7 @@
               <w:rPr>
                 <w:sz w:val="18"/>
               </w:rPr>
-              <w:t>38</w:t>
+              <w:t>4</w:t>
             </w:r>
           </w:p>
         </w:tc>
@@ -4146,7 +4040,7 @@
               <w:rPr>
                 <w:sz w:val="18"/>
               </w:rPr>
-              <w:t>4</w:t>
+              <w:t>1</w:t>
             </w:r>
           </w:p>
         </w:tc>
@@ -4159,7 +4053,7 @@
               <w:rPr>
                 <w:sz w:val="18"/>
               </w:rPr>
-              <w:t>15.0</w:t>
+              <w:t>11.8</w:t>
             </w:r>
           </w:p>
         </w:tc>
@@ -4172,7 +4066,7 @@
               <w:rPr>
                 <w:sz w:val="18"/>
               </w:rPr>
-              <w:t>0.67x</w:t>
+              <w:t>0.53x</w:t>
             </w:r>
           </w:p>
         </w:tc>
@@ -4187,7 +4081,7 @@
               <w:rPr>
                 <w:sz w:val="18"/>
               </w:rPr>
-              <w:t>Dungun, Terengganu</w:t>
+              <w:t>Kulim, Kedah</w:t>
             </w:r>
           </w:p>
         </w:tc>
@@ -4200,7 +4094,7 @@
               <w:rPr>
                 <w:sz w:val="18"/>
               </w:rPr>
-              <w:t>168k</w:t>
+              <w:t>354k</w:t>
             </w:r>
           </w:p>
         </w:tc>
@@ -4213,7 +4107,7 @@
               <w:rPr>
                 <w:sz w:val="18"/>
               </w:rPr>
-              <w:t>6,356</w:t>
+              <w:t>5,236</w:t>
             </w:r>
           </w:p>
         </w:tc>
@@ -4226,7 +4120,7 @@
               <w:rPr>
                 <w:sz w:val="18"/>
               </w:rPr>
-              <w:t>15</w:t>
+              <w:t>11</w:t>
             </w:r>
           </w:p>
         </w:tc>
@@ -4239,6 +4133,19 @@
               <w:rPr>
                 <w:sz w:val="18"/>
               </w:rPr>
+              <w:t>38</w:t>
+            </w:r>
+          </w:p>
+        </w:tc>
+        <w:tc>
+          <w:tcPr>
+            <w:tcW w:type="dxa" w:w="1170"/>
+          </w:tcPr>
+          <w:p>
+            <w:r>
+              <w:rPr>
+                <w:sz w:val="18"/>
+              </w:rPr>
               <w:t>4</w:t>
             </w:r>
           </w:p>
@@ -4252,7 +4159,7 @@
               <w:rPr>
                 <w:sz w:val="18"/>
               </w:rPr>
-              <w:t>1</w:t>
+              <w:t>15.0</w:t>
             </w:r>
           </w:p>
         </w:tc>
@@ -4265,20 +4172,7 @@
               <w:rPr>
                 <w:sz w:val="18"/>
               </w:rPr>
-              <w:t>11.9</w:t>
-            </w:r>
-          </w:p>
-        </w:tc>
-        <w:tc>
-          <w:tcPr>
-            <w:tcW w:type="dxa" w:w="1170"/>
-          </w:tcPr>
-          <w:p>
-            <w:r>
-              <w:rPr>
-                <w:sz w:val="18"/>
-              </w:rPr>
-              <w:t>0.53x</w:t>
+              <w:t>0.67x</w:t>
             </w:r>
           </w:p>
         </w:tc>
@@ -4293,7 +4187,7 @@
               <w:rPr>
                 <w:sz w:val="18"/>
               </w:rPr>
-              <w:t>Kemaman, Terengganu</w:t>
+              <w:t>Perlis, Perlis</w:t>
             </w:r>
           </w:p>
         </w:tc>
@@ -4306,7 +4200,7 @@
               <w:rPr>
                 <w:sz w:val="18"/>
               </w:rPr>
-              <w:t>232k</w:t>
+              <w:t>298k</w:t>
             </w:r>
           </w:p>
         </w:tc>
@@ -4319,7 +4213,7 @@
               <w:rPr>
                 <w:sz w:val="18"/>
               </w:rPr>
-              <w:t>6,425</w:t>
+              <w:t>4,713</w:t>
             </w:r>
           </w:p>
         </w:tc>
@@ -4332,7 +4226,7 @@
               <w:rPr>
                 <w:sz w:val="18"/>
               </w:rPr>
-              <w:t>19</w:t>
+              <w:t>18</w:t>
             </w:r>
           </w:p>
         </w:tc>
@@ -4345,7 +4239,7 @@
               <w:rPr>
                 <w:sz w:val="18"/>
               </w:rPr>
-              <w:t>9</w:t>
+              <w:t>14</w:t>
             </w:r>
           </w:p>
         </w:tc>
@@ -4358,7 +4252,7 @@
               <w:rPr>
                 <w:sz w:val="18"/>
               </w:rPr>
-              <w:t>1</w:t>
+              <w:t>2</w:t>
             </w:r>
           </w:p>
         </w:tc>
@@ -4371,7 +4265,7 @@
               <w:rPr>
                 <w:sz w:val="18"/>
               </w:rPr>
-              <w:t>12.5</w:t>
+              <w:t>11.4</w:t>
             </w:r>
           </w:p>
         </w:tc>
@@ -4384,7 +4278,7 @@
               <w:rPr>
                 <w:sz w:val="18"/>
               </w:rPr>
-              <w:t>0.56x</w:t>
+              <w:t>0.51x</w:t>
             </w:r>
           </w:p>
         </w:tc>
@@ -4412,7 +4306,7 @@
               <w:rPr>
                 <w:sz w:val="18"/>
               </w:rPr>
-              <w:t>253k</w:t>
+              <w:t>254k</w:t>
             </w:r>
           </w:p>
         </w:tc>
@@ -4425,7 +4319,7 @@
               <w:rPr>
                 <w:sz w:val="18"/>
               </w:rPr>
-              <w:t>5,201</w:t>
+              <w:t>5,312</w:t>
             </w:r>
           </w:p>
         </w:tc>
@@ -4477,7 +4371,7 @@
               <w:rPr>
                 <w:sz w:val="18"/>
               </w:rPr>
-              <w:t>17.4</w:t>
+              <w:t>17.3</w:t>
             </w:r>
           </w:p>
         </w:tc>
@@ -4531,7 +4425,7 @@
               <w:rPr>
                 <w:sz w:val="18"/>
               </w:rPr>
-              <w:t>4,029</w:t>
+              <w:t>4,843</w:t>
             </w:r>
           </w:p>
         </w:tc>
@@ -4624,7 +4518,7 @@
               <w:rPr>
                 <w:sz w:val="18"/>
               </w:rPr>
-              <w:t>102k</w:t>
+              <w:t>103k</w:t>
             </w:r>
           </w:p>
         </w:tc>
@@ -4637,7 +4531,7 @@
               <w:rPr>
                 <w:sz w:val="18"/>
               </w:rPr>
-              <w:t>4,115</w:t>
+              <w:t>4,611</w:t>
             </w:r>
           </w:p>
         </w:tc>
@@ -4689,7 +4583,7 @@
               <w:rPr>
                 <w:sz w:val="18"/>
               </w:rPr>
-              <w:t>11.7</w:t>
+              <w:t>11.6</w:t>
             </w:r>
           </w:p>
         </w:tc>
@@ -4717,7 +4611,7 @@
               <w:rPr>
                 <w:sz w:val="18"/>
               </w:rPr>
-              <w:t>Mersing, Johor</w:t>
+              <w:t>Langkawi, Kedah</w:t>
             </w:r>
           </w:p>
         </w:tc>
@@ -4730,7 +4624,7 @@
               <w:rPr>
                 <w:sz w:val="18"/>
               </w:rPr>
-              <w:t>81k</w:t>
+              <w:t>100k</w:t>
             </w:r>
           </w:p>
         </w:tc>
@@ -4743,7 +4637,7 @@
               <w:rPr>
                 <w:sz w:val="18"/>
               </w:rPr>
-              <w:t>4,445</w:t>
+              <w:t>5,083</w:t>
             </w:r>
           </w:p>
         </w:tc>
@@ -4756,7 +4650,7 @@
               <w:rPr>
                 <w:sz w:val="18"/>
               </w:rPr>
-              <w:t>7</w:t>
+              <w:t>12</w:t>
             </w:r>
           </w:p>
         </w:tc>
@@ -4769,7 +4663,7 @@
               <w:rPr>
                 <w:sz w:val="18"/>
               </w:rPr>
-              <w:t>9</w:t>
+              <w:t>0</w:t>
             </w:r>
           </w:p>
         </w:tc>
@@ -4782,7 +4676,7 @@
               <w:rPr>
                 <w:sz w:val="18"/>
               </w:rPr>
-              <w:t>3</w:t>
+              <w:t>0</w:t>
             </w:r>
           </w:p>
         </w:tc>
@@ -4795,7 +4689,7 @@
               <w:rPr>
                 <w:sz w:val="18"/>
               </w:rPr>
-              <w:t>23.4</w:t>
+              <w:t>11.9</w:t>
             </w:r>
           </w:p>
         </w:tc>
@@ -4808,7 +4702,7 @@
               <w:rPr>
                 <w:sz w:val="18"/>
               </w:rPr>
-              <w:t>1.04x</w:t>
+              <w:t>0.53x</w:t>
             </w:r>
           </w:p>
         </w:tc>
@@ -4823,7 +4717,7 @@
               <w:rPr>
                 <w:sz w:val="18"/>
               </w:rPr>
-              <w:t>Temerloh, Pahang</w:t>
+              <w:t>Mersing, Johor</w:t>
             </w:r>
           </w:p>
         </w:tc>
@@ -4836,7 +4730,7 @@
               <w:rPr>
                 <w:sz w:val="18"/>
               </w:rPr>
-              <w:t>178k</w:t>
+              <w:t>81k</w:t>
             </w:r>
           </w:p>
         </w:tc>
@@ -4849,7 +4743,7 @@
               <w:rPr>
                 <w:sz w:val="18"/>
               </w:rPr>
-              <w:t>4,283</w:t>
+              <w:t>5,335</w:t>
             </w:r>
           </w:p>
         </w:tc>
@@ -4862,7 +4756,7 @@
               <w:rPr>
                 <w:sz w:val="18"/>
               </w:rPr>
-              <w:t>17</w:t>
+              <w:t>7</w:t>
             </w:r>
           </w:p>
         </w:tc>
@@ -4875,7 +4769,7 @@
               <w:rPr>
                 <w:sz w:val="18"/>
               </w:rPr>
-              <w:t>16</w:t>
+              <w:t>9</w:t>
             </w:r>
           </w:p>
         </w:tc>
@@ -4888,7 +4782,7 @@
               <w:rPr>
                 <w:sz w:val="18"/>
               </w:rPr>
-              <w:t>2</w:t>
+              <w:t>3</w:t>
             </w:r>
           </w:p>
         </w:tc>
@@ -4901,7 +4795,7 @@
               <w:rPr>
                 <w:sz w:val="18"/>
               </w:rPr>
-              <w:t>19.7</w:t>
+              <w:t>23.3</w:t>
             </w:r>
           </w:p>
         </w:tc>
@@ -4914,7 +4808,7 @@
               <w:rPr>
                 <w:sz w:val="18"/>
               </w:rPr>
-              <w:t>0.87x</w:t>
+              <w:t>1.04x</w:t>
             </w:r>
           </w:p>
         </w:tc>
@@ -4934,7 +4828,7 @@
     </w:p>
     <w:p>
       <w:r>
-        <w:t>Management guidance points to expansion in Northern and Southern Peninsular Malaysia, with Pulau Pinang and Johor as the focus states. This section benchmarks both states against the Peninsular average of 25.9 stores per 100k population (the appropriate yardstick for Peninsular expansion; the national rate of 22.5 is diluted by East Malaysia). Two metrics are used: headroom to par — the number of stores a district can absorb before reaching average Peninsular density (negative = overshoot) — and the KKmart fair-share gap — stores KKmart would need to hold its 14.6% Peninsular network share of the district's current store base.</w:t>
+        <w:t>Management guidance points to expansion in Northern and Southern Peninsular Malaysia, with Pulau Pinang and Johor as the focus states. This section benchmarks both states against the Peninsular average of 25.8 stores per 100k population (the appropriate yardstick for Peninsular expansion; the national rate of 22.4 is diluted by East Malaysia). Two metrics are used: headroom to par — the number of stores a district can absorb before reaching average Peninsular density (negative = overshoot) — and the KKmart fair-share gap — stores KKmart would need to hold its 14.6% Peninsular network share of the district's current store base.</w:t>
       </w:r>
     </w:p>
     <w:p>
@@ -5086,7 +4980,7 @@
               <w:rPr>
                 <w:sz w:val="18"/>
               </w:rPr>
-              <w:t>570k</w:t>
+              <w:t>566k</w:t>
             </w:r>
           </w:p>
         </w:tc>
@@ -5138,7 +5032,7 @@
               <w:rPr>
                 <w:sz w:val="18"/>
               </w:rPr>
-              <w:t>57</w:t>
+              <w:t>55</w:t>
             </w:r>
           </w:p>
         </w:tc>
@@ -5179,7 +5073,7 @@
               <w:rPr>
                 <w:sz w:val="18"/>
               </w:rPr>
-              <w:t>443k</w:t>
+              <w:t>445k</w:t>
             </w:r>
           </w:p>
         </w:tc>
@@ -5272,7 +5166,7 @@
               <w:rPr>
                 <w:sz w:val="18"/>
               </w:rPr>
-              <w:t>248k</w:t>
+              <w:t>250k</w:t>
             </w:r>
           </w:p>
         </w:tc>
@@ -5365,7 +5259,7 @@
               <w:rPr>
                 <w:sz w:val="18"/>
               </w:rPr>
-              <w:t>351k</w:t>
+              <w:t>353k</w:t>
             </w:r>
           </w:p>
         </w:tc>
@@ -5458,7 +5352,7 @@
               <w:rPr>
                 <w:sz w:val="18"/>
               </w:rPr>
-              <w:t>188k</w:t>
+              <w:t>190k</w:t>
             </w:r>
           </w:p>
         </w:tc>
@@ -5532,7 +5426,7 @@
     <w:p/>
     <w:p>
       <w:r>
-        <w:t>Four of five districts sit below par with headroom to grow. Timur Laut (Georgetown) is the standout: the island's commercial core, median income of RM 6,714, and 57 stores of headroom — the single largest under-supplied urban market in the North. Mainland Seberang Perai is where KKmart is most under-indexed: 155 competitor outlets in SP Utara and SP Tengah against just 8 KKmart stores. The exception is Seberang Perai Selatan, already 1.23x par and 11 stores over; new openings there would be share-fighting.</w:t>
+        <w:t>Four of five districts sit below par with headroom to grow. Timur Laut (Georgetown) is the standout: the island's commercial core, median income of RM 7,745, and 55 stores of headroom — the single largest under-supplied urban market in the North. Mainland Seberang Perai is where KKmart is most under-indexed: 155 competitor outlets in SP Utara and SP Tengah against just 8 KKmart stores. The exception is Seberang Perai Selatan, already 1.23x par and 11 stores over; new openings there would be share-fighting.</w:t>
       </w:r>
     </w:p>
     <w:p>
@@ -5684,7 +5578,7 @@
               <w:rPr>
                 <w:sz w:val="18"/>
               </w:rPr>
-              <w:t>1,800k</w:t>
+              <w:t>1,814k</w:t>
             </w:r>
           </w:p>
         </w:tc>
@@ -5736,7 +5630,7 @@
               <w:rPr>
                 <w:sz w:val="18"/>
               </w:rPr>
-              <w:t>-90</w:t>
+              <w:t>-88</w:t>
             </w:r>
           </w:p>
         </w:tc>
@@ -5777,7 +5671,7 @@
               <w:rPr>
                 <w:sz w:val="18"/>
               </w:rPr>
-              <w:t>234k</w:t>
+              <w:t>235k</w:t>
             </w:r>
           </w:p>
         </w:tc>
@@ -5829,7 +5723,7 @@
               <w:rPr>
                 <w:sz w:val="18"/>
               </w:rPr>
-              <w:t>25</w:t>
+              <w:t>24</w:t>
             </w:r>
           </w:p>
         </w:tc>
@@ -5870,7 +5764,7 @@
               <w:rPr>
                 <w:sz w:val="18"/>
               </w:rPr>
-              <w:t>510k</w:t>
+              <w:t>512k</w:t>
             </w:r>
           </w:p>
         </w:tc>
@@ -5963,7 +5857,7 @@
               <w:rPr>
                 <w:sz w:val="18"/>
               </w:rPr>
-              <w:t>351k</w:t>
+              <w:t>353k</w:t>
             </w:r>
           </w:p>
         </w:tc>
@@ -6056,7 +5950,7 @@
               <w:rPr>
                 <w:sz w:val="18"/>
               </w:rPr>
-              <w:t>323k</w:t>
+              <w:t>324k</w:t>
             </w:r>
           </w:p>
         </w:tc>
@@ -6108,7 +6002,7 @@
               <w:rPr>
                 <w:sz w:val="18"/>
               </w:rPr>
-              <w:t>18</w:t>
+              <w:t>17</w:t>
             </w:r>
           </w:p>
         </w:tc>
@@ -6149,7 +6043,7 @@
               <w:rPr>
                 <w:sz w:val="18"/>
               </w:rPr>
-              <w:t>334k</w:t>
+              <w:t>335k</w:t>
             </w:r>
           </w:p>
         </w:tc>
@@ -6281,7 +6175,7 @@
               <w:rPr>
                 <w:sz w:val="18"/>
               </w:rPr>
-              <w:t>0.78x</w:t>
+              <w:t>0.79x</w:t>
             </w:r>
           </w:p>
         </w:tc>
@@ -6335,7 +6229,7 @@
               <w:rPr>
                 <w:sz w:val="18"/>
               </w:rPr>
-              <w:t>170k</w:t>
+              <w:t>169k</w:t>
             </w:r>
           </w:p>
         </w:tc>
@@ -6428,7 +6322,7 @@
               <w:rPr>
                 <w:sz w:val="18"/>
               </w:rPr>
-              <w:t>205k</w:t>
+              <w:t>204k</w:t>
             </w:r>
           </w:p>
         </w:tc>
@@ -6467,7 +6361,7 @@
               <w:rPr>
                 <w:sz w:val="18"/>
               </w:rPr>
-              <w:t>0.98x</w:t>
+              <w:t>0.99x</w:t>
             </w:r>
           </w:p>
         </w:tc>
@@ -6560,7 +6454,7 @@
               <w:rPr>
                 <w:sz w:val="18"/>
               </w:rPr>
-              <w:t>0.90x</w:t>
+              <w:t>0.91x</w:t>
             </w:r>
           </w:p>
         </w:tc>
@@ -6595,7 +6489,7 @@
     <w:p/>
     <w:p>
       <w:r>
-        <w:t>Johor Bahru, the state's headline market, is already saturated: 556 stores, 1.19x Peninsular par, 90 stores over. Incremental JB openings compete with 469 competitor outlets for existing traffic. The genuine Johor runway is in secondary districts — Batu Pahat (+29 headroom), Kota Tinggi (+25), Muar (+18), Kluang (+17), with Kulai, Pontian and Tangkak adding roughly 10 each. Johor excluding JB offers approximately 120 stores of at-par headroom, comparable to Penang's 113 excluding SP Selatan.</w:t>
+        <w:t>Johor Bahru, the state's headline market, is already saturated: 556 stores, 1.19x Peninsular par, 88 stores over. Incremental JB openings compete with 469 competitor outlets for existing traffic. The genuine Johor runway is in secondary districts — Batu Pahat (+29 headroom), Kota Tinggi (+24), Muar (+17), Kluang (+17), with Kulai, Pontian and Tangkak adding roughly 10 each. Johor excluding JB offers approximately 120 stores of at-par headroom, comparable to Penang's 111 excluding SP Selatan.</w:t>
       </w:r>
     </w:p>
     <w:p>
@@ -6611,7 +6505,7 @@
     </w:p>
     <w:p>
       <w:r>
-        <w:t>If the Northern corridor is read more broadly than Penang alone, the largest headroom in the region actually sits next door: Kulim (+38 stores, zero KKmart, 53 competitors), Kuala Muda / Sungai Petani (+36, two KKmart vs 110 competitors) and Perlis (+43, zero KKmart). These districts border Penang's mainland corridor and could share its distribution infrastructure, at the cost of lower median incomes (RM 4,200-4,700 versus Penang's RM 6,200-7,200).</w:t>
+        <w:t>If the Northern corridor is read more broadly than Penang alone, the largest headroom in the region actually sits next door: Kulim (+38 stores, zero KKmart, 53 competitors), Kuala Muda / Sungai Petani (+36, two KKmart vs 110 competitors) and Perlis (+43, zero KKmart). These districts border Penang's mainland corridor and could share its distribution infrastructure, at the cost of lower median incomes (RM 4,700-5,300 versus Penang's RM 6,900-8,900).</w:t>
       </w:r>
     </w:p>
     <w:p>
@@ -6701,7 +6595,7 @@
         <w:pStyle w:val="ListBullet"/>
       </w:pPr>
       <w:r>
-        <w:t>Data vintages differ: households are Census 2020, income/expenditure HIES 2022, population 2024. Rankings are robust to this, but absolute per-household figures mix reference years.</w:t>
+        <w:t>Data vintages differ: households are Census 2020 (downweighted in the demand index accordingly), income/expenditure HIES 2024 (2022 fallback for Perlis and the federal territories, flagged in the income_year column), population 2025. Rankings are robust to this, but absolute per-household figures mix reference years.</w:t>
       </w:r>
     </w:p>
     <w:p>

</xml_diff>